<commit_message>
docs: finalize release artifacts
</commit_message>
<xml_diff>
--- a/deliverables/祝宸旭-操作系统课程设计.docx
+++ b/deliverables/祝宸旭-操作系统课程设计.docx
@@ -207,6 +207,12 @@
     <w:p>
       <w:pPr>
         <w:sectPr>
+          <w:headerReference r:id="rId7" w:type="first"/>
+          <w:footerReference r:id="rId10" w:type="first"/>
+          <w:headerReference r:id="rId5" w:type="default"/>
+          <w:footerReference r:id="rId8" w:type="default"/>
+          <w:headerReference r:id="rId6" w:type="even"/>
+          <w:footerReference r:id="rId9" w:type="even"/>
           <w:pgSz w:w="11906" w:h="16838"/>
           <w:pgMar w:top="1304" w:right="1417" w:bottom="1247" w:left="1417" w:header="737" w:footer="737" w:gutter="0"/>
           <w:cols w:space="720" w:num="1"/>
@@ -271,7 +277,7 @@
         <w:rPr>
           <w:rFonts w:ascii="宋体" w:hAnsi="宋体" w:eastAsia="宋体" w:cs="宋体"/>
         </w:rPr>
-        <w:instrText xml:space="preserve"> HYPERLINK \l _Toc9171 </w:instrText>
+        <w:instrText xml:space="preserve"> HYPERLINK \l _Toc17983 </w:instrText>
       </w:r>
       <w:r>
         <w:rPr>
@@ -292,7 +298,7 @@
         <w:fldChar w:fldCharType="begin"/>
       </w:r>
       <w:r>
-        <w:instrText xml:space="preserve"> PAGEREF _Toc9171 \h </w:instrText>
+        <w:instrText xml:space="preserve"> PAGEREF _Toc17983 \h </w:instrText>
       </w:r>
       <w:r>
         <w:fldChar w:fldCharType="separate"/>
@@ -329,7 +335,7 @@
         <w:rPr>
           <w:rFonts w:ascii="宋体" w:hAnsi="宋体" w:eastAsia="宋体" w:cs="宋体"/>
         </w:rPr>
-        <w:instrText xml:space="preserve"> HYPERLINK \l _Toc31635 </w:instrText>
+        <w:instrText xml:space="preserve"> HYPERLINK \l _Toc20377 </w:instrText>
       </w:r>
       <w:r>
         <w:rPr>
@@ -350,7 +356,7 @@
         <w:fldChar w:fldCharType="begin"/>
       </w:r>
       <w:r>
-        <w:instrText xml:space="preserve"> PAGEREF _Toc31635 \h </w:instrText>
+        <w:instrText xml:space="preserve"> PAGEREF _Toc20377 \h </w:instrText>
       </w:r>
       <w:r>
         <w:fldChar w:fldCharType="separate"/>
@@ -387,7 +393,7 @@
         <w:rPr>
           <w:rFonts w:ascii="宋体" w:hAnsi="宋体" w:eastAsia="宋体" w:cs="宋体"/>
         </w:rPr>
-        <w:instrText xml:space="preserve"> HYPERLINK \l _Toc28663 </w:instrText>
+        <w:instrText xml:space="preserve"> HYPERLINK \l _Toc11095 </w:instrText>
       </w:r>
       <w:r>
         <w:rPr>
@@ -408,7 +414,7 @@
         <w:fldChar w:fldCharType="begin"/>
       </w:r>
       <w:r>
-        <w:instrText xml:space="preserve"> PAGEREF _Toc28663 \h </w:instrText>
+        <w:instrText xml:space="preserve"> PAGEREF _Toc11095 \h </w:instrText>
       </w:r>
       <w:r>
         <w:fldChar w:fldCharType="separate"/>
@@ -445,7 +451,7 @@
         <w:rPr>
           <w:rFonts w:ascii="宋体" w:hAnsi="宋体" w:eastAsia="宋体" w:cs="宋体"/>
         </w:rPr>
-        <w:instrText xml:space="preserve"> HYPERLINK \l _Toc26316 </w:instrText>
+        <w:instrText xml:space="preserve"> HYPERLINK \l _Toc4712 </w:instrText>
       </w:r>
       <w:r>
         <w:rPr>
@@ -466,7 +472,7 @@
         <w:fldChar w:fldCharType="begin"/>
       </w:r>
       <w:r>
-        <w:instrText xml:space="preserve"> PAGEREF _Toc26316 \h </w:instrText>
+        <w:instrText xml:space="preserve"> PAGEREF _Toc4712 \h </w:instrText>
       </w:r>
       <w:r>
         <w:fldChar w:fldCharType="separate"/>
@@ -503,7 +509,7 @@
         <w:rPr>
           <w:rFonts w:ascii="宋体" w:hAnsi="宋体" w:eastAsia="宋体" w:cs="宋体"/>
         </w:rPr>
-        <w:instrText xml:space="preserve"> HYPERLINK \l _Toc29051 </w:instrText>
+        <w:instrText xml:space="preserve"> HYPERLINK \l _Toc2375 </w:instrText>
       </w:r>
       <w:r>
         <w:rPr>
@@ -524,7 +530,7 @@
         <w:fldChar w:fldCharType="begin"/>
       </w:r>
       <w:r>
-        <w:instrText xml:space="preserve"> PAGEREF _Toc29051 \h </w:instrText>
+        <w:instrText xml:space="preserve"> PAGEREF _Toc2375 \h </w:instrText>
       </w:r>
       <w:r>
         <w:fldChar w:fldCharType="separate"/>
@@ -561,7 +567,7 @@
         <w:rPr>
           <w:rFonts w:ascii="宋体" w:hAnsi="宋体" w:eastAsia="宋体" w:cs="宋体"/>
         </w:rPr>
-        <w:instrText xml:space="preserve"> HYPERLINK \l _Toc601 </w:instrText>
+        <w:instrText xml:space="preserve"> HYPERLINK \l _Toc4003 </w:instrText>
       </w:r>
       <w:r>
         <w:rPr>
@@ -582,7 +588,7 @@
         <w:fldChar w:fldCharType="begin"/>
       </w:r>
       <w:r>
-        <w:instrText xml:space="preserve"> PAGEREF _Toc601 \h </w:instrText>
+        <w:instrText xml:space="preserve"> PAGEREF _Toc4003 \h </w:instrText>
       </w:r>
       <w:r>
         <w:fldChar w:fldCharType="separate"/>
@@ -619,7 +625,7 @@
         <w:rPr>
           <w:rFonts w:ascii="宋体" w:hAnsi="宋体" w:eastAsia="宋体" w:cs="宋体"/>
         </w:rPr>
-        <w:instrText xml:space="preserve"> HYPERLINK \l _Toc434 </w:instrText>
+        <w:instrText xml:space="preserve"> HYPERLINK \l _Toc11794 </w:instrText>
       </w:r>
       <w:r>
         <w:rPr>
@@ -640,7 +646,7 @@
         <w:fldChar w:fldCharType="begin"/>
       </w:r>
       <w:r>
-        <w:instrText xml:space="preserve"> PAGEREF _Toc434 \h </w:instrText>
+        <w:instrText xml:space="preserve"> PAGEREF _Toc11794 \h </w:instrText>
       </w:r>
       <w:r>
         <w:fldChar w:fldCharType="separate"/>
@@ -677,7 +683,7 @@
         <w:rPr>
           <w:rFonts w:ascii="宋体" w:hAnsi="宋体" w:eastAsia="宋体" w:cs="宋体"/>
         </w:rPr>
-        <w:instrText xml:space="preserve"> HYPERLINK \l _Toc24507 </w:instrText>
+        <w:instrText xml:space="preserve"> HYPERLINK \l _Toc9966 </w:instrText>
       </w:r>
       <w:r>
         <w:rPr>
@@ -698,7 +704,7 @@
         <w:fldChar w:fldCharType="begin"/>
       </w:r>
       <w:r>
-        <w:instrText xml:space="preserve"> PAGEREF _Toc24507 \h </w:instrText>
+        <w:instrText xml:space="preserve"> PAGEREF _Toc9966 \h </w:instrText>
       </w:r>
       <w:r>
         <w:fldChar w:fldCharType="separate"/>
@@ -735,7 +741,7 @@
         <w:rPr>
           <w:rFonts w:ascii="宋体" w:hAnsi="宋体" w:eastAsia="宋体" w:cs="宋体"/>
         </w:rPr>
-        <w:instrText xml:space="preserve"> HYPERLINK \l _Toc7059 </w:instrText>
+        <w:instrText xml:space="preserve"> HYPERLINK \l _Toc17873 </w:instrText>
       </w:r>
       <w:r>
         <w:rPr>
@@ -756,7 +762,7 @@
         <w:fldChar w:fldCharType="begin"/>
       </w:r>
       <w:r>
-        <w:instrText xml:space="preserve"> PAGEREF _Toc7059 \h </w:instrText>
+        <w:instrText xml:space="preserve"> PAGEREF _Toc17873 \h </w:instrText>
       </w:r>
       <w:r>
         <w:fldChar w:fldCharType="separate"/>
@@ -793,7 +799,7 @@
         <w:rPr>
           <w:rFonts w:ascii="宋体" w:hAnsi="宋体" w:eastAsia="宋体" w:cs="宋体"/>
         </w:rPr>
-        <w:instrText xml:space="preserve"> HYPERLINK \l _Toc26532 </w:instrText>
+        <w:instrText xml:space="preserve"> HYPERLINK \l _Toc31477 </w:instrText>
       </w:r>
       <w:r>
         <w:rPr>
@@ -814,7 +820,7 @@
         <w:fldChar w:fldCharType="begin"/>
       </w:r>
       <w:r>
-        <w:instrText xml:space="preserve"> PAGEREF _Toc26532 \h </w:instrText>
+        <w:instrText xml:space="preserve"> PAGEREF _Toc31477 \h </w:instrText>
       </w:r>
       <w:r>
         <w:fldChar w:fldCharType="separate"/>
@@ -851,7 +857,7 @@
         <w:rPr>
           <w:rFonts w:ascii="宋体" w:hAnsi="宋体" w:eastAsia="宋体" w:cs="宋体"/>
         </w:rPr>
-        <w:instrText xml:space="preserve"> HYPERLINK \l _Toc16465 </w:instrText>
+        <w:instrText xml:space="preserve"> HYPERLINK \l _Toc23437 </w:instrText>
       </w:r>
       <w:r>
         <w:rPr>
@@ -872,7 +878,7 @@
         <w:fldChar w:fldCharType="begin"/>
       </w:r>
       <w:r>
-        <w:instrText xml:space="preserve"> PAGEREF _Toc16465 \h </w:instrText>
+        <w:instrText xml:space="preserve"> PAGEREF _Toc23437 \h </w:instrText>
       </w:r>
       <w:r>
         <w:fldChar w:fldCharType="separate"/>
@@ -909,7 +915,7 @@
         <w:rPr>
           <w:rFonts w:ascii="宋体" w:hAnsi="宋体" w:eastAsia="宋体" w:cs="宋体"/>
         </w:rPr>
-        <w:instrText xml:space="preserve"> HYPERLINK \l _Toc3229 </w:instrText>
+        <w:instrText xml:space="preserve"> HYPERLINK \l _Toc22888 </w:instrText>
       </w:r>
       <w:r>
         <w:rPr>
@@ -930,7 +936,7 @@
         <w:fldChar w:fldCharType="begin"/>
       </w:r>
       <w:r>
-        <w:instrText xml:space="preserve"> PAGEREF _Toc3229 \h </w:instrText>
+        <w:instrText xml:space="preserve"> PAGEREF _Toc22888 \h </w:instrText>
       </w:r>
       <w:r>
         <w:fldChar w:fldCharType="separate"/>
@@ -967,7 +973,7 @@
         <w:rPr>
           <w:rFonts w:ascii="宋体" w:hAnsi="宋体" w:eastAsia="宋体" w:cs="宋体"/>
         </w:rPr>
-        <w:instrText xml:space="preserve"> HYPERLINK \l _Toc15852 </w:instrText>
+        <w:instrText xml:space="preserve"> HYPERLINK \l _Toc25053 </w:instrText>
       </w:r>
       <w:r>
         <w:rPr>
@@ -988,7 +994,7 @@
         <w:fldChar w:fldCharType="begin"/>
       </w:r>
       <w:r>
-        <w:instrText xml:space="preserve"> PAGEREF _Toc15852 \h </w:instrText>
+        <w:instrText xml:space="preserve"> PAGEREF _Toc25053 \h </w:instrText>
       </w:r>
       <w:r>
         <w:fldChar w:fldCharType="separate"/>
@@ -1025,7 +1031,7 @@
         <w:rPr>
           <w:rFonts w:ascii="宋体" w:hAnsi="宋体" w:eastAsia="宋体" w:cs="宋体"/>
         </w:rPr>
-        <w:instrText xml:space="preserve"> HYPERLINK \l _Toc23512 </w:instrText>
+        <w:instrText xml:space="preserve"> HYPERLINK \l _Toc24477 </w:instrText>
       </w:r>
       <w:r>
         <w:rPr>
@@ -1046,7 +1052,7 @@
         <w:fldChar w:fldCharType="begin"/>
       </w:r>
       <w:r>
-        <w:instrText xml:space="preserve"> PAGEREF _Toc23512 \h </w:instrText>
+        <w:instrText xml:space="preserve"> PAGEREF _Toc24477 \h </w:instrText>
       </w:r>
       <w:r>
         <w:fldChar w:fldCharType="separate"/>
@@ -1083,7 +1089,7 @@
         <w:rPr>
           <w:rFonts w:ascii="宋体" w:hAnsi="宋体" w:eastAsia="宋体" w:cs="宋体"/>
         </w:rPr>
-        <w:instrText xml:space="preserve"> HYPERLINK \l _Toc20281 </w:instrText>
+        <w:instrText xml:space="preserve"> HYPERLINK \l _Toc2416 </w:instrText>
       </w:r>
       <w:r>
         <w:rPr>
@@ -1104,7 +1110,7 @@
         <w:fldChar w:fldCharType="begin"/>
       </w:r>
       <w:r>
-        <w:instrText xml:space="preserve"> PAGEREF _Toc20281 \h </w:instrText>
+        <w:instrText xml:space="preserve"> PAGEREF _Toc2416 \h </w:instrText>
       </w:r>
       <w:r>
         <w:fldChar w:fldCharType="separate"/>
@@ -1141,7 +1147,7 @@
         <w:rPr>
           <w:rFonts w:ascii="宋体" w:hAnsi="宋体" w:eastAsia="宋体" w:cs="宋体"/>
         </w:rPr>
-        <w:instrText xml:space="preserve"> HYPERLINK \l _Toc9623 </w:instrText>
+        <w:instrText xml:space="preserve"> HYPERLINK \l _Toc10611 </w:instrText>
       </w:r>
       <w:r>
         <w:rPr>
@@ -1162,7 +1168,7 @@
         <w:fldChar w:fldCharType="begin"/>
       </w:r>
       <w:r>
-        <w:instrText xml:space="preserve"> PAGEREF _Toc9623 \h </w:instrText>
+        <w:instrText xml:space="preserve"> PAGEREF _Toc10611 \h </w:instrText>
       </w:r>
       <w:r>
         <w:fldChar w:fldCharType="separate"/>
@@ -1199,7 +1205,7 @@
         <w:rPr>
           <w:rFonts w:ascii="宋体" w:hAnsi="宋体" w:eastAsia="宋体" w:cs="宋体"/>
         </w:rPr>
-        <w:instrText xml:space="preserve"> HYPERLINK \l _Toc2347 </w:instrText>
+        <w:instrText xml:space="preserve"> HYPERLINK \l _Toc7402 </w:instrText>
       </w:r>
       <w:r>
         <w:rPr>
@@ -1220,7 +1226,7 @@
         <w:fldChar w:fldCharType="begin"/>
       </w:r>
       <w:r>
-        <w:instrText xml:space="preserve"> PAGEREF _Toc2347 \h </w:instrText>
+        <w:instrText xml:space="preserve"> PAGEREF _Toc7402 \h </w:instrText>
       </w:r>
       <w:r>
         <w:fldChar w:fldCharType="separate"/>
@@ -1257,7 +1263,7 @@
         <w:rPr>
           <w:rFonts w:ascii="宋体" w:hAnsi="宋体" w:eastAsia="宋体" w:cs="宋体"/>
         </w:rPr>
-        <w:instrText xml:space="preserve"> HYPERLINK \l _Toc465 </w:instrText>
+        <w:instrText xml:space="preserve"> HYPERLINK \l _Toc1073 </w:instrText>
       </w:r>
       <w:r>
         <w:rPr>
@@ -1278,7 +1284,7 @@
         <w:fldChar w:fldCharType="begin"/>
       </w:r>
       <w:r>
-        <w:instrText xml:space="preserve"> PAGEREF _Toc465 \h </w:instrText>
+        <w:instrText xml:space="preserve"> PAGEREF _Toc1073 \h </w:instrText>
       </w:r>
       <w:r>
         <w:fldChar w:fldCharType="separate"/>
@@ -1315,7 +1321,7 @@
         <w:rPr>
           <w:rFonts w:ascii="宋体" w:hAnsi="宋体" w:eastAsia="宋体" w:cs="宋体"/>
         </w:rPr>
-        <w:instrText xml:space="preserve"> HYPERLINK \l _Toc26472 </w:instrText>
+        <w:instrText xml:space="preserve"> HYPERLINK \l _Toc5319 </w:instrText>
       </w:r>
       <w:r>
         <w:rPr>
@@ -1336,7 +1342,7 @@
         <w:fldChar w:fldCharType="begin"/>
       </w:r>
       <w:r>
-        <w:instrText xml:space="preserve"> PAGEREF _Toc26472 \h </w:instrText>
+        <w:instrText xml:space="preserve"> PAGEREF _Toc5319 \h </w:instrText>
       </w:r>
       <w:r>
         <w:fldChar w:fldCharType="separate"/>
@@ -1373,7 +1379,7 @@
         <w:rPr>
           <w:rFonts w:ascii="宋体" w:hAnsi="宋体" w:eastAsia="宋体" w:cs="宋体"/>
         </w:rPr>
-        <w:instrText xml:space="preserve"> HYPERLINK \l _Toc23293 </w:instrText>
+        <w:instrText xml:space="preserve"> HYPERLINK \l _Toc11636 </w:instrText>
       </w:r>
       <w:r>
         <w:rPr>
@@ -1394,7 +1400,7 @@
         <w:fldChar w:fldCharType="begin"/>
       </w:r>
       <w:r>
-        <w:instrText xml:space="preserve"> PAGEREF _Toc23293 \h </w:instrText>
+        <w:instrText xml:space="preserve"> PAGEREF _Toc11636 \h </w:instrText>
       </w:r>
       <w:r>
         <w:fldChar w:fldCharType="separate"/>
@@ -1431,7 +1437,7 @@
         <w:rPr>
           <w:rFonts w:ascii="宋体" w:hAnsi="宋体" w:eastAsia="宋体" w:cs="宋体"/>
         </w:rPr>
-        <w:instrText xml:space="preserve"> HYPERLINK \l _Toc6757 </w:instrText>
+        <w:instrText xml:space="preserve"> HYPERLINK \l _Toc27414 </w:instrText>
       </w:r>
       <w:r>
         <w:rPr>
@@ -1452,7 +1458,7 @@
         <w:fldChar w:fldCharType="begin"/>
       </w:r>
       <w:r>
-        <w:instrText xml:space="preserve"> PAGEREF _Toc6757 \h </w:instrText>
+        <w:instrText xml:space="preserve"> PAGEREF _Toc27414 \h </w:instrText>
       </w:r>
       <w:r>
         <w:fldChar w:fldCharType="separate"/>
@@ -1489,7 +1495,7 @@
         <w:rPr>
           <w:rFonts w:ascii="宋体" w:hAnsi="宋体" w:eastAsia="宋体" w:cs="宋体"/>
         </w:rPr>
-        <w:instrText xml:space="preserve"> HYPERLINK \l _Toc14374 </w:instrText>
+        <w:instrText xml:space="preserve"> HYPERLINK \l _Toc9828 </w:instrText>
       </w:r>
       <w:r>
         <w:rPr>
@@ -1510,7 +1516,7 @@
         <w:fldChar w:fldCharType="begin"/>
       </w:r>
       <w:r>
-        <w:instrText xml:space="preserve"> PAGEREF _Toc14374 \h </w:instrText>
+        <w:instrText xml:space="preserve"> PAGEREF _Toc9828 \h </w:instrText>
       </w:r>
       <w:r>
         <w:fldChar w:fldCharType="separate"/>
@@ -1547,7 +1553,7 @@
         <w:rPr>
           <w:rFonts w:ascii="宋体" w:hAnsi="宋体" w:eastAsia="宋体" w:cs="宋体"/>
         </w:rPr>
-        <w:instrText xml:space="preserve"> HYPERLINK \l _Toc2986 </w:instrText>
+        <w:instrText xml:space="preserve"> HYPERLINK \l _Toc13900 </w:instrText>
       </w:r>
       <w:r>
         <w:rPr>
@@ -1568,7 +1574,7 @@
         <w:fldChar w:fldCharType="begin"/>
       </w:r>
       <w:r>
-        <w:instrText xml:space="preserve"> PAGEREF _Toc2986 \h </w:instrText>
+        <w:instrText xml:space="preserve"> PAGEREF _Toc13900 \h </w:instrText>
       </w:r>
       <w:r>
         <w:fldChar w:fldCharType="separate"/>
@@ -1605,7 +1611,7 @@
         <w:rPr>
           <w:rFonts w:ascii="宋体" w:hAnsi="宋体" w:eastAsia="宋体" w:cs="宋体"/>
         </w:rPr>
-        <w:instrText xml:space="preserve"> HYPERLINK \l _Toc2232 </w:instrText>
+        <w:instrText xml:space="preserve"> HYPERLINK \l _Toc9678 </w:instrText>
       </w:r>
       <w:r>
         <w:rPr>
@@ -1626,7 +1632,7 @@
         <w:fldChar w:fldCharType="begin"/>
       </w:r>
       <w:r>
-        <w:instrText xml:space="preserve"> PAGEREF _Toc2232 \h </w:instrText>
+        <w:instrText xml:space="preserve"> PAGEREF _Toc9678 \h </w:instrText>
       </w:r>
       <w:r>
         <w:fldChar w:fldCharType="separate"/>
@@ -1663,7 +1669,7 @@
         <w:rPr>
           <w:rFonts w:ascii="宋体" w:hAnsi="宋体" w:eastAsia="宋体" w:cs="宋体"/>
         </w:rPr>
-        <w:instrText xml:space="preserve"> HYPERLINK \l _Toc28908 </w:instrText>
+        <w:instrText xml:space="preserve"> HYPERLINK \l _Toc2950 </w:instrText>
       </w:r>
       <w:r>
         <w:rPr>
@@ -1684,7 +1690,7 @@
         <w:fldChar w:fldCharType="begin"/>
       </w:r>
       <w:r>
-        <w:instrText xml:space="preserve"> PAGEREF _Toc28908 \h </w:instrText>
+        <w:instrText xml:space="preserve"> PAGEREF _Toc2950 \h </w:instrText>
       </w:r>
       <w:r>
         <w:fldChar w:fldCharType="separate"/>
@@ -1721,7 +1727,7 @@
         <w:rPr>
           <w:rFonts w:ascii="宋体" w:hAnsi="宋体" w:eastAsia="宋体" w:cs="宋体"/>
         </w:rPr>
-        <w:instrText xml:space="preserve"> HYPERLINK \l _Toc1962 </w:instrText>
+        <w:instrText xml:space="preserve"> HYPERLINK \l _Toc18390 </w:instrText>
       </w:r>
       <w:r>
         <w:rPr>
@@ -1742,7 +1748,7 @@
         <w:fldChar w:fldCharType="begin"/>
       </w:r>
       <w:r>
-        <w:instrText xml:space="preserve"> PAGEREF _Toc1962 \h </w:instrText>
+        <w:instrText xml:space="preserve"> PAGEREF _Toc18390 \h </w:instrText>
       </w:r>
       <w:r>
         <w:fldChar w:fldCharType="separate"/>
@@ -1779,7 +1785,7 @@
         <w:rPr>
           <w:rFonts w:ascii="宋体" w:hAnsi="宋体" w:eastAsia="宋体" w:cs="宋体"/>
         </w:rPr>
-        <w:instrText xml:space="preserve"> HYPERLINK \l _Toc19728 </w:instrText>
+        <w:instrText xml:space="preserve"> HYPERLINK \l _Toc27625 </w:instrText>
       </w:r>
       <w:r>
         <w:rPr>
@@ -1800,7 +1806,7 @@
         <w:fldChar w:fldCharType="begin"/>
       </w:r>
       <w:r>
-        <w:instrText xml:space="preserve"> PAGEREF _Toc19728 \h </w:instrText>
+        <w:instrText xml:space="preserve"> PAGEREF _Toc27625 \h </w:instrText>
       </w:r>
       <w:r>
         <w:fldChar w:fldCharType="separate"/>
@@ -1837,7 +1843,7 @@
         <w:rPr>
           <w:rFonts w:ascii="宋体" w:hAnsi="宋体" w:eastAsia="宋体" w:cs="宋体"/>
         </w:rPr>
-        <w:instrText xml:space="preserve"> HYPERLINK \l _Toc14571 </w:instrText>
+        <w:instrText xml:space="preserve"> HYPERLINK \l _Toc20568 </w:instrText>
       </w:r>
       <w:r>
         <w:rPr>
@@ -1858,7 +1864,7 @@
         <w:fldChar w:fldCharType="begin"/>
       </w:r>
       <w:r>
-        <w:instrText xml:space="preserve"> PAGEREF _Toc14571 \h </w:instrText>
+        <w:instrText xml:space="preserve"> PAGEREF _Toc20568 \h </w:instrText>
       </w:r>
       <w:r>
         <w:fldChar w:fldCharType="separate"/>
@@ -1895,7 +1901,7 @@
         <w:rPr>
           <w:rFonts w:ascii="宋体" w:hAnsi="宋体" w:eastAsia="宋体" w:cs="宋体"/>
         </w:rPr>
-        <w:instrText xml:space="preserve"> HYPERLINK \l _Toc30312 </w:instrText>
+        <w:instrText xml:space="preserve"> HYPERLINK \l _Toc24072 </w:instrText>
       </w:r>
       <w:r>
         <w:rPr>
@@ -1916,7 +1922,7 @@
         <w:fldChar w:fldCharType="begin"/>
       </w:r>
       <w:r>
-        <w:instrText xml:space="preserve"> PAGEREF _Toc30312 \h </w:instrText>
+        <w:instrText xml:space="preserve"> PAGEREF _Toc24072 \h </w:instrText>
       </w:r>
       <w:r>
         <w:fldChar w:fldCharType="separate"/>
@@ -1953,7 +1959,7 @@
         <w:rPr>
           <w:rFonts w:ascii="宋体" w:hAnsi="宋体" w:eastAsia="宋体" w:cs="宋体"/>
         </w:rPr>
-        <w:instrText xml:space="preserve"> HYPERLINK \l _Toc23353 </w:instrText>
+        <w:instrText xml:space="preserve"> HYPERLINK \l _Toc15665 </w:instrText>
       </w:r>
       <w:r>
         <w:rPr>
@@ -1974,7 +1980,7 @@
         <w:fldChar w:fldCharType="begin"/>
       </w:r>
       <w:r>
-        <w:instrText xml:space="preserve"> PAGEREF _Toc23353 \h </w:instrText>
+        <w:instrText xml:space="preserve"> PAGEREF _Toc15665 \h </w:instrText>
       </w:r>
       <w:r>
         <w:fldChar w:fldCharType="separate"/>
@@ -2011,7 +2017,7 @@
         <w:rPr>
           <w:rFonts w:ascii="宋体" w:hAnsi="宋体" w:eastAsia="宋体" w:cs="宋体"/>
         </w:rPr>
-        <w:instrText xml:space="preserve"> HYPERLINK \l _Toc13214 </w:instrText>
+        <w:instrText xml:space="preserve"> HYPERLINK \l _Toc7033 </w:instrText>
       </w:r>
       <w:r>
         <w:rPr>
@@ -2032,7 +2038,7 @@
         <w:fldChar w:fldCharType="begin"/>
       </w:r>
       <w:r>
-        <w:instrText xml:space="preserve"> PAGEREF _Toc13214 \h </w:instrText>
+        <w:instrText xml:space="preserve"> PAGEREF _Toc7033 \h </w:instrText>
       </w:r>
       <w:r>
         <w:fldChar w:fldCharType="separate"/>
@@ -2069,7 +2075,7 @@
         <w:rPr>
           <w:rFonts w:ascii="宋体" w:hAnsi="宋体" w:eastAsia="宋体" w:cs="宋体"/>
         </w:rPr>
-        <w:instrText xml:space="preserve"> HYPERLINK \l _Toc14806 </w:instrText>
+        <w:instrText xml:space="preserve"> HYPERLINK \l _Toc4110 </w:instrText>
       </w:r>
       <w:r>
         <w:rPr>
@@ -2090,7 +2096,7 @@
         <w:fldChar w:fldCharType="begin"/>
       </w:r>
       <w:r>
-        <w:instrText xml:space="preserve"> PAGEREF _Toc14806 \h </w:instrText>
+        <w:instrText xml:space="preserve"> PAGEREF _Toc4110 \h </w:instrText>
       </w:r>
       <w:r>
         <w:fldChar w:fldCharType="separate"/>
@@ -2127,7 +2133,7 @@
         <w:rPr>
           <w:rFonts w:ascii="宋体" w:hAnsi="宋体" w:eastAsia="宋体" w:cs="宋体"/>
         </w:rPr>
-        <w:instrText xml:space="preserve"> HYPERLINK \l _Toc19753 </w:instrText>
+        <w:instrText xml:space="preserve"> HYPERLINK \l _Toc15351 </w:instrText>
       </w:r>
       <w:r>
         <w:rPr>
@@ -2148,7 +2154,7 @@
         <w:fldChar w:fldCharType="begin"/>
       </w:r>
       <w:r>
-        <w:instrText xml:space="preserve"> PAGEREF _Toc19753 \h </w:instrText>
+        <w:instrText xml:space="preserve"> PAGEREF _Toc15351 \h </w:instrText>
       </w:r>
       <w:r>
         <w:fldChar w:fldCharType="separate"/>
@@ -2185,7 +2191,7 @@
         <w:rPr>
           <w:rFonts w:ascii="宋体" w:hAnsi="宋体" w:eastAsia="宋体" w:cs="宋体"/>
         </w:rPr>
-        <w:instrText xml:space="preserve"> HYPERLINK \l _Toc25777 </w:instrText>
+        <w:instrText xml:space="preserve"> HYPERLINK \l _Toc13169 </w:instrText>
       </w:r>
       <w:r>
         <w:rPr>
@@ -2206,7 +2212,7 @@
         <w:fldChar w:fldCharType="begin"/>
       </w:r>
       <w:r>
-        <w:instrText xml:space="preserve"> PAGEREF _Toc25777 \h </w:instrText>
+        <w:instrText xml:space="preserve"> PAGEREF _Toc13169 \h </w:instrText>
       </w:r>
       <w:r>
         <w:fldChar w:fldCharType="separate"/>
@@ -2243,7 +2249,7 @@
         <w:rPr>
           <w:rFonts w:ascii="宋体" w:hAnsi="宋体" w:eastAsia="宋体" w:cs="宋体"/>
         </w:rPr>
-        <w:instrText xml:space="preserve"> HYPERLINK \l _Toc8004 </w:instrText>
+        <w:instrText xml:space="preserve"> HYPERLINK \l _Toc21199 </w:instrText>
       </w:r>
       <w:r>
         <w:rPr>
@@ -2264,7 +2270,7 @@
         <w:fldChar w:fldCharType="begin"/>
       </w:r>
       <w:r>
-        <w:instrText xml:space="preserve"> PAGEREF _Toc8004 \h </w:instrText>
+        <w:instrText xml:space="preserve"> PAGEREF _Toc21199 \h </w:instrText>
       </w:r>
       <w:r>
         <w:fldChar w:fldCharType="separate"/>
@@ -2301,7 +2307,7 @@
         <w:rPr>
           <w:rFonts w:ascii="宋体" w:hAnsi="宋体" w:eastAsia="宋体" w:cs="宋体"/>
         </w:rPr>
-        <w:instrText xml:space="preserve"> HYPERLINK \l _Toc19194 </w:instrText>
+        <w:instrText xml:space="preserve"> HYPERLINK \l _Toc15622 </w:instrText>
       </w:r>
       <w:r>
         <w:rPr>
@@ -2322,7 +2328,7 @@
         <w:fldChar w:fldCharType="begin"/>
       </w:r>
       <w:r>
-        <w:instrText xml:space="preserve"> PAGEREF _Toc19194 \h </w:instrText>
+        <w:instrText xml:space="preserve"> PAGEREF _Toc15622 \h </w:instrText>
       </w:r>
       <w:r>
         <w:fldChar w:fldCharType="separate"/>
@@ -2359,7 +2365,7 @@
         <w:rPr>
           <w:rFonts w:ascii="宋体" w:hAnsi="宋体" w:eastAsia="宋体" w:cs="宋体"/>
         </w:rPr>
-        <w:instrText xml:space="preserve"> HYPERLINK \l _Toc22715 </w:instrText>
+        <w:instrText xml:space="preserve"> HYPERLINK \l _Toc22624 </w:instrText>
       </w:r>
       <w:r>
         <w:rPr>
@@ -2380,7 +2386,7 @@
         <w:fldChar w:fldCharType="begin"/>
       </w:r>
       <w:r>
-        <w:instrText xml:space="preserve"> PAGEREF _Toc22715 \h </w:instrText>
+        <w:instrText xml:space="preserve"> PAGEREF _Toc22624 \h </w:instrText>
       </w:r>
       <w:r>
         <w:fldChar w:fldCharType="separate"/>
@@ -2417,7 +2423,7 @@
         <w:rPr>
           <w:rFonts w:ascii="宋体" w:hAnsi="宋体" w:eastAsia="宋体" w:cs="宋体"/>
         </w:rPr>
-        <w:instrText xml:space="preserve"> HYPERLINK \l _Toc21310 </w:instrText>
+        <w:instrText xml:space="preserve"> HYPERLINK \l _Toc8067 </w:instrText>
       </w:r>
       <w:r>
         <w:rPr>
@@ -2438,7 +2444,7 @@
         <w:fldChar w:fldCharType="begin"/>
       </w:r>
       <w:r>
-        <w:instrText xml:space="preserve"> PAGEREF _Toc21310 \h </w:instrText>
+        <w:instrText xml:space="preserve"> PAGEREF _Toc8067 \h </w:instrText>
       </w:r>
       <w:r>
         <w:fldChar w:fldCharType="separate"/>
@@ -2475,7 +2481,7 @@
         <w:rPr>
           <w:rFonts w:ascii="宋体" w:hAnsi="宋体" w:eastAsia="宋体" w:cs="宋体"/>
         </w:rPr>
-        <w:instrText xml:space="preserve"> HYPERLINK \l _Toc13584 </w:instrText>
+        <w:instrText xml:space="preserve"> HYPERLINK \l _Toc18681 </w:instrText>
       </w:r>
       <w:r>
         <w:rPr>
@@ -2496,7 +2502,7 @@
         <w:fldChar w:fldCharType="begin"/>
       </w:r>
       <w:r>
-        <w:instrText xml:space="preserve"> PAGEREF _Toc13584 \h </w:instrText>
+        <w:instrText xml:space="preserve"> PAGEREF _Toc18681 \h </w:instrText>
       </w:r>
       <w:r>
         <w:fldChar w:fldCharType="separate"/>
@@ -2533,7 +2539,7 @@
         <w:rPr>
           <w:rFonts w:ascii="宋体" w:hAnsi="宋体" w:eastAsia="宋体" w:cs="宋体"/>
         </w:rPr>
-        <w:instrText xml:space="preserve"> HYPERLINK \l _Toc9597 </w:instrText>
+        <w:instrText xml:space="preserve"> HYPERLINK \l _Toc12454 </w:instrText>
       </w:r>
       <w:r>
         <w:rPr>
@@ -2554,7 +2560,7 @@
         <w:fldChar w:fldCharType="begin"/>
       </w:r>
       <w:r>
-        <w:instrText xml:space="preserve"> PAGEREF _Toc9597 \h </w:instrText>
+        <w:instrText xml:space="preserve"> PAGEREF _Toc12454 \h </w:instrText>
       </w:r>
       <w:r>
         <w:fldChar w:fldCharType="separate"/>
@@ -2591,7 +2597,7 @@
         <w:rPr>
           <w:rFonts w:ascii="宋体" w:hAnsi="宋体" w:eastAsia="宋体" w:cs="宋体"/>
         </w:rPr>
-        <w:instrText xml:space="preserve"> HYPERLINK \l _Toc13499 </w:instrText>
+        <w:instrText xml:space="preserve"> HYPERLINK \l _Toc27490 </w:instrText>
       </w:r>
       <w:r>
         <w:rPr>
@@ -2612,7 +2618,7 @@
         <w:fldChar w:fldCharType="begin"/>
       </w:r>
       <w:r>
-        <w:instrText xml:space="preserve"> PAGEREF _Toc13499 \h </w:instrText>
+        <w:instrText xml:space="preserve"> PAGEREF _Toc27490 \h </w:instrText>
       </w:r>
       <w:r>
         <w:fldChar w:fldCharType="separate"/>
@@ -2649,7 +2655,7 @@
         <w:rPr>
           <w:rFonts w:ascii="宋体" w:hAnsi="宋体" w:eastAsia="宋体" w:cs="宋体"/>
         </w:rPr>
-        <w:instrText xml:space="preserve"> HYPERLINK \l _Toc16091 </w:instrText>
+        <w:instrText xml:space="preserve"> HYPERLINK \l _Toc19474 </w:instrText>
       </w:r>
       <w:r>
         <w:rPr>
@@ -2670,7 +2676,7 @@
         <w:fldChar w:fldCharType="begin"/>
       </w:r>
       <w:r>
-        <w:instrText xml:space="preserve"> PAGEREF _Toc16091 \h </w:instrText>
+        <w:instrText xml:space="preserve"> PAGEREF _Toc19474 \h </w:instrText>
       </w:r>
       <w:r>
         <w:fldChar w:fldCharType="separate"/>
@@ -2707,7 +2713,7 @@
         <w:rPr>
           <w:rFonts w:ascii="宋体" w:hAnsi="宋体" w:eastAsia="宋体" w:cs="宋体"/>
         </w:rPr>
-        <w:instrText xml:space="preserve"> HYPERLINK \l _Toc11425 </w:instrText>
+        <w:instrText xml:space="preserve"> HYPERLINK \l _Toc1221 </w:instrText>
       </w:r>
       <w:r>
         <w:rPr>
@@ -2728,7 +2734,7 @@
         <w:fldChar w:fldCharType="begin"/>
       </w:r>
       <w:r>
-        <w:instrText xml:space="preserve"> PAGEREF _Toc11425 \h </w:instrText>
+        <w:instrText xml:space="preserve"> PAGEREF _Toc1221 \h </w:instrText>
       </w:r>
       <w:r>
         <w:fldChar w:fldCharType="separate"/>
@@ -2765,7 +2771,7 @@
         <w:rPr>
           <w:rFonts w:ascii="宋体" w:hAnsi="宋体" w:eastAsia="宋体" w:cs="宋体"/>
         </w:rPr>
-        <w:instrText xml:space="preserve"> HYPERLINK \l _Toc25553 </w:instrText>
+        <w:instrText xml:space="preserve"> HYPERLINK \l _Toc25109 </w:instrText>
       </w:r>
       <w:r>
         <w:rPr>
@@ -2786,7 +2792,7 @@
         <w:fldChar w:fldCharType="begin"/>
       </w:r>
       <w:r>
-        <w:instrText xml:space="preserve"> PAGEREF _Toc25553 \h </w:instrText>
+        <w:instrText xml:space="preserve"> PAGEREF _Toc25109 \h </w:instrText>
       </w:r>
       <w:r>
         <w:fldChar w:fldCharType="separate"/>
@@ -2823,7 +2829,7 @@
         <w:rPr>
           <w:rFonts w:ascii="宋体" w:hAnsi="宋体" w:eastAsia="宋体" w:cs="宋体"/>
         </w:rPr>
-        <w:instrText xml:space="preserve"> HYPERLINK \l _Toc3562 </w:instrText>
+        <w:instrText xml:space="preserve"> HYPERLINK \l _Toc11483 </w:instrText>
       </w:r>
       <w:r>
         <w:rPr>
@@ -2844,7 +2850,7 @@
         <w:fldChar w:fldCharType="begin"/>
       </w:r>
       <w:r>
-        <w:instrText xml:space="preserve"> PAGEREF _Toc3562 \h </w:instrText>
+        <w:instrText xml:space="preserve"> PAGEREF _Toc11483 \h </w:instrText>
       </w:r>
       <w:r>
         <w:fldChar w:fldCharType="separate"/>
@@ -2881,7 +2887,7 @@
         <w:rPr>
           <w:rFonts w:ascii="宋体" w:hAnsi="宋体" w:eastAsia="宋体" w:cs="宋体"/>
         </w:rPr>
-        <w:instrText xml:space="preserve"> HYPERLINK \l _Toc27925 </w:instrText>
+        <w:instrText xml:space="preserve"> HYPERLINK \l _Toc31134 </w:instrText>
       </w:r>
       <w:r>
         <w:rPr>
@@ -2902,7 +2908,7 @@
         <w:fldChar w:fldCharType="begin"/>
       </w:r>
       <w:r>
-        <w:instrText xml:space="preserve"> PAGEREF _Toc27925 \h </w:instrText>
+        <w:instrText xml:space="preserve"> PAGEREF _Toc31134 \h </w:instrText>
       </w:r>
       <w:r>
         <w:fldChar w:fldCharType="separate"/>
@@ -2939,7 +2945,7 @@
         <w:rPr>
           <w:rFonts w:ascii="宋体" w:hAnsi="宋体" w:eastAsia="宋体" w:cs="宋体"/>
         </w:rPr>
-        <w:instrText xml:space="preserve"> HYPERLINK \l _Toc4575 </w:instrText>
+        <w:instrText xml:space="preserve"> HYPERLINK \l _Toc19589 </w:instrText>
       </w:r>
       <w:r>
         <w:rPr>
@@ -2960,7 +2966,7 @@
         <w:fldChar w:fldCharType="begin"/>
       </w:r>
       <w:r>
-        <w:instrText xml:space="preserve"> PAGEREF _Toc4575 \h </w:instrText>
+        <w:instrText xml:space="preserve"> PAGEREF _Toc19589 \h </w:instrText>
       </w:r>
       <w:r>
         <w:fldChar w:fldCharType="separate"/>
@@ -2997,7 +3003,7 @@
         <w:rPr>
           <w:rFonts w:ascii="宋体" w:hAnsi="宋体" w:eastAsia="宋体" w:cs="宋体"/>
         </w:rPr>
-        <w:instrText xml:space="preserve"> HYPERLINK \l _Toc3217 </w:instrText>
+        <w:instrText xml:space="preserve"> HYPERLINK \l _Toc9967 </w:instrText>
       </w:r>
       <w:r>
         <w:rPr>
@@ -3018,7 +3024,7 @@
         <w:fldChar w:fldCharType="begin"/>
       </w:r>
       <w:r>
-        <w:instrText xml:space="preserve"> PAGEREF _Toc3217 \h </w:instrText>
+        <w:instrText xml:space="preserve"> PAGEREF _Toc9967 \h </w:instrText>
       </w:r>
       <w:r>
         <w:fldChar w:fldCharType="separate"/>
@@ -3055,7 +3061,7 @@
         <w:rPr>
           <w:rFonts w:ascii="宋体" w:hAnsi="宋体" w:eastAsia="宋体" w:cs="宋体"/>
         </w:rPr>
-        <w:instrText xml:space="preserve"> HYPERLINK \l _Toc4480 </w:instrText>
+        <w:instrText xml:space="preserve"> HYPERLINK \l _Toc25153 </w:instrText>
       </w:r>
       <w:r>
         <w:rPr>
@@ -3076,7 +3082,7 @@
         <w:fldChar w:fldCharType="begin"/>
       </w:r>
       <w:r>
-        <w:instrText xml:space="preserve"> PAGEREF _Toc4480 \h </w:instrText>
+        <w:instrText xml:space="preserve"> PAGEREF _Toc25153 \h </w:instrText>
       </w:r>
       <w:r>
         <w:fldChar w:fldCharType="separate"/>
@@ -3113,7 +3119,7 @@
         <w:rPr>
           <w:rFonts w:ascii="宋体" w:hAnsi="宋体" w:eastAsia="宋体" w:cs="宋体"/>
         </w:rPr>
-        <w:instrText xml:space="preserve"> HYPERLINK \l _Toc21266 </w:instrText>
+        <w:instrText xml:space="preserve"> HYPERLINK \l _Toc17614 </w:instrText>
       </w:r>
       <w:r>
         <w:rPr>
@@ -3134,7 +3140,7 @@
         <w:fldChar w:fldCharType="begin"/>
       </w:r>
       <w:r>
-        <w:instrText xml:space="preserve"> PAGEREF _Toc21266 \h </w:instrText>
+        <w:instrText xml:space="preserve"> PAGEREF _Toc17614 \h </w:instrText>
       </w:r>
       <w:r>
         <w:fldChar w:fldCharType="separate"/>
@@ -3171,7 +3177,7 @@
         <w:rPr>
           <w:rFonts w:ascii="宋体" w:hAnsi="宋体" w:eastAsia="宋体" w:cs="宋体"/>
         </w:rPr>
-        <w:instrText xml:space="preserve"> HYPERLINK \l _Toc20201 </w:instrText>
+        <w:instrText xml:space="preserve"> HYPERLINK \l _Toc17168 </w:instrText>
       </w:r>
       <w:r>
         <w:rPr>
@@ -3192,7 +3198,7 @@
         <w:fldChar w:fldCharType="begin"/>
       </w:r>
       <w:r>
-        <w:instrText xml:space="preserve"> PAGEREF _Toc20201 \h </w:instrText>
+        <w:instrText xml:space="preserve"> PAGEREF _Toc17168 \h </w:instrText>
       </w:r>
       <w:r>
         <w:fldChar w:fldCharType="separate"/>
@@ -3229,7 +3235,7 @@
         <w:rPr>
           <w:rFonts w:ascii="宋体" w:hAnsi="宋体" w:eastAsia="宋体" w:cs="宋体"/>
         </w:rPr>
-        <w:instrText xml:space="preserve"> HYPERLINK \l _Toc17579 </w:instrText>
+        <w:instrText xml:space="preserve"> HYPERLINK \l _Toc27709 </w:instrText>
       </w:r>
       <w:r>
         <w:rPr>
@@ -3250,7 +3256,7 @@
         <w:fldChar w:fldCharType="begin"/>
       </w:r>
       <w:r>
-        <w:instrText xml:space="preserve"> PAGEREF _Toc17579 \h </w:instrText>
+        <w:instrText xml:space="preserve"> PAGEREF _Toc27709 \h </w:instrText>
       </w:r>
       <w:r>
         <w:fldChar w:fldCharType="separate"/>
@@ -3287,7 +3293,7 @@
         <w:rPr>
           <w:rFonts w:ascii="宋体" w:hAnsi="宋体" w:eastAsia="宋体" w:cs="宋体"/>
         </w:rPr>
-        <w:instrText xml:space="preserve"> HYPERLINK \l _Toc26307 </w:instrText>
+        <w:instrText xml:space="preserve"> HYPERLINK \l _Toc973 </w:instrText>
       </w:r>
       <w:r>
         <w:rPr>
@@ -3308,7 +3314,7 @@
         <w:fldChar w:fldCharType="begin"/>
       </w:r>
       <w:r>
-        <w:instrText xml:space="preserve"> PAGEREF _Toc26307 \h </w:instrText>
+        <w:instrText xml:space="preserve"> PAGEREF _Toc973 \h </w:instrText>
       </w:r>
       <w:r>
         <w:fldChar w:fldCharType="separate"/>
@@ -3345,7 +3351,7 @@
         <w:rPr>
           <w:rFonts w:ascii="宋体" w:hAnsi="宋体" w:eastAsia="宋体" w:cs="宋体"/>
         </w:rPr>
-        <w:instrText xml:space="preserve"> HYPERLINK \l _Toc30931 </w:instrText>
+        <w:instrText xml:space="preserve"> HYPERLINK \l _Toc18183 </w:instrText>
       </w:r>
       <w:r>
         <w:rPr>
@@ -3366,7 +3372,7 @@
         <w:fldChar w:fldCharType="begin"/>
       </w:r>
       <w:r>
-        <w:instrText xml:space="preserve"> PAGEREF _Toc30931 \h </w:instrText>
+        <w:instrText xml:space="preserve"> PAGEREF _Toc18183 \h </w:instrText>
       </w:r>
       <w:r>
         <w:fldChar w:fldCharType="separate"/>
@@ -3403,7 +3409,7 @@
         <w:rPr>
           <w:rFonts w:ascii="宋体" w:hAnsi="宋体" w:eastAsia="宋体" w:cs="宋体"/>
         </w:rPr>
-        <w:instrText xml:space="preserve"> HYPERLINK \l _Toc4687 </w:instrText>
+        <w:instrText xml:space="preserve"> HYPERLINK \l _Toc22025 </w:instrText>
       </w:r>
       <w:r>
         <w:rPr>
@@ -3424,7 +3430,7 @@
         <w:fldChar w:fldCharType="begin"/>
       </w:r>
       <w:r>
-        <w:instrText xml:space="preserve"> PAGEREF _Toc4687 \h </w:instrText>
+        <w:instrText xml:space="preserve"> PAGEREF _Toc22025 \h </w:instrText>
       </w:r>
       <w:r>
         <w:fldChar w:fldCharType="separate"/>
@@ -3461,7 +3467,7 @@
         <w:rPr>
           <w:rFonts w:ascii="宋体" w:hAnsi="宋体" w:eastAsia="宋体" w:cs="宋体"/>
         </w:rPr>
-        <w:instrText xml:space="preserve"> HYPERLINK \l _Toc27844 </w:instrText>
+        <w:instrText xml:space="preserve"> HYPERLINK \l _Toc31652 </w:instrText>
       </w:r>
       <w:r>
         <w:rPr>
@@ -3482,7 +3488,7 @@
         <w:fldChar w:fldCharType="begin"/>
       </w:r>
       <w:r>
-        <w:instrText xml:space="preserve"> PAGEREF _Toc27844 \h </w:instrText>
+        <w:instrText xml:space="preserve"> PAGEREF _Toc31652 \h </w:instrText>
       </w:r>
       <w:r>
         <w:fldChar w:fldCharType="separate"/>
@@ -3519,7 +3525,7 @@
         <w:rPr>
           <w:rFonts w:ascii="宋体" w:hAnsi="宋体" w:eastAsia="宋体" w:cs="宋体"/>
         </w:rPr>
-        <w:instrText xml:space="preserve"> HYPERLINK \l _Toc26327 </w:instrText>
+        <w:instrText xml:space="preserve"> HYPERLINK \l _Toc15583 </w:instrText>
       </w:r>
       <w:r>
         <w:rPr>
@@ -3540,7 +3546,7 @@
         <w:fldChar w:fldCharType="begin"/>
       </w:r>
       <w:r>
-        <w:instrText xml:space="preserve"> PAGEREF _Toc26327 \h </w:instrText>
+        <w:instrText xml:space="preserve"> PAGEREF _Toc15583 \h </w:instrText>
       </w:r>
       <w:r>
         <w:fldChar w:fldCharType="separate"/>
@@ -3577,7 +3583,7 @@
         <w:rPr>
           <w:rFonts w:ascii="宋体" w:hAnsi="宋体" w:eastAsia="宋体" w:cs="宋体"/>
         </w:rPr>
-        <w:instrText xml:space="preserve"> HYPERLINK \l _Toc8630 </w:instrText>
+        <w:instrText xml:space="preserve"> HYPERLINK \l _Toc9533 </w:instrText>
       </w:r>
       <w:r>
         <w:rPr>
@@ -3598,7 +3604,7 @@
         <w:fldChar w:fldCharType="begin"/>
       </w:r>
       <w:r>
-        <w:instrText xml:space="preserve"> PAGEREF _Toc8630 \h </w:instrText>
+        <w:instrText xml:space="preserve"> PAGEREF _Toc9533 \h </w:instrText>
       </w:r>
       <w:r>
         <w:fldChar w:fldCharType="separate"/>
@@ -3635,7 +3641,7 @@
         <w:rPr>
           <w:rFonts w:ascii="宋体" w:hAnsi="宋体" w:eastAsia="宋体" w:cs="宋体"/>
         </w:rPr>
-        <w:instrText xml:space="preserve"> HYPERLINK \l _Toc25986 </w:instrText>
+        <w:instrText xml:space="preserve"> HYPERLINK \l _Toc24932 </w:instrText>
       </w:r>
       <w:r>
         <w:rPr>
@@ -3656,7 +3662,7 @@
         <w:fldChar w:fldCharType="begin"/>
       </w:r>
       <w:r>
-        <w:instrText xml:space="preserve"> PAGEREF _Toc25986 \h </w:instrText>
+        <w:instrText xml:space="preserve"> PAGEREF _Toc24932 \h </w:instrText>
       </w:r>
       <w:r>
         <w:fldChar w:fldCharType="separate"/>
@@ -3693,7 +3699,7 @@
         <w:rPr>
           <w:rFonts w:ascii="宋体" w:hAnsi="宋体" w:eastAsia="宋体" w:cs="宋体"/>
         </w:rPr>
-        <w:instrText xml:space="preserve"> HYPERLINK \l _Toc11736 </w:instrText>
+        <w:instrText xml:space="preserve"> HYPERLINK \l _Toc8412 </w:instrText>
       </w:r>
       <w:r>
         <w:rPr>
@@ -3714,7 +3720,7 @@
         <w:fldChar w:fldCharType="begin"/>
       </w:r>
       <w:r>
-        <w:instrText xml:space="preserve"> PAGEREF _Toc11736 \h </w:instrText>
+        <w:instrText xml:space="preserve"> PAGEREF _Toc8412 \h </w:instrText>
       </w:r>
       <w:r>
         <w:fldChar w:fldCharType="separate"/>
@@ -3751,7 +3757,7 @@
         <w:rPr>
           <w:rFonts w:ascii="宋体" w:hAnsi="宋体" w:eastAsia="宋体" w:cs="宋体"/>
         </w:rPr>
-        <w:instrText xml:space="preserve"> HYPERLINK \l _Toc1752 </w:instrText>
+        <w:instrText xml:space="preserve"> HYPERLINK \l _Toc19358 </w:instrText>
       </w:r>
       <w:r>
         <w:rPr>
@@ -3772,7 +3778,7 @@
         <w:fldChar w:fldCharType="begin"/>
       </w:r>
       <w:r>
-        <w:instrText xml:space="preserve"> PAGEREF _Toc1752 \h </w:instrText>
+        <w:instrText xml:space="preserve"> PAGEREF _Toc19358 \h </w:instrText>
       </w:r>
       <w:r>
         <w:fldChar w:fldCharType="separate"/>
@@ -3809,7 +3815,7 @@
         <w:rPr>
           <w:rFonts w:ascii="宋体" w:hAnsi="宋体" w:eastAsia="宋体" w:cs="宋体"/>
         </w:rPr>
-        <w:instrText xml:space="preserve"> HYPERLINK \l _Toc24127 </w:instrText>
+        <w:instrText xml:space="preserve"> HYPERLINK \l _Toc265 </w:instrText>
       </w:r>
       <w:r>
         <w:rPr>
@@ -3830,7 +3836,7 @@
         <w:fldChar w:fldCharType="begin"/>
       </w:r>
       <w:r>
-        <w:instrText xml:space="preserve"> PAGEREF _Toc24127 \h </w:instrText>
+        <w:instrText xml:space="preserve"> PAGEREF _Toc265 \h </w:instrText>
       </w:r>
       <w:r>
         <w:fldChar w:fldCharType="separate"/>
@@ -3867,7 +3873,7 @@
         <w:rPr>
           <w:rFonts w:ascii="宋体" w:hAnsi="宋体" w:eastAsia="宋体" w:cs="宋体"/>
         </w:rPr>
-        <w:instrText xml:space="preserve"> HYPERLINK \l _Toc1928 </w:instrText>
+        <w:instrText xml:space="preserve"> HYPERLINK \l _Toc11301 </w:instrText>
       </w:r>
       <w:r>
         <w:rPr>
@@ -3888,7 +3894,7 @@
         <w:fldChar w:fldCharType="begin"/>
       </w:r>
       <w:r>
-        <w:instrText xml:space="preserve"> PAGEREF _Toc1928 \h </w:instrText>
+        <w:instrText xml:space="preserve"> PAGEREF _Toc11301 \h </w:instrText>
       </w:r>
       <w:r>
         <w:fldChar w:fldCharType="separate"/>
@@ -3925,7 +3931,7 @@
         <w:rPr>
           <w:rFonts w:ascii="宋体" w:hAnsi="宋体" w:eastAsia="宋体" w:cs="宋体"/>
         </w:rPr>
-        <w:instrText xml:space="preserve"> HYPERLINK \l _Toc14625 </w:instrText>
+        <w:instrText xml:space="preserve"> HYPERLINK \l _Toc17252 </w:instrText>
       </w:r>
       <w:r>
         <w:rPr>
@@ -3946,7 +3952,7 @@
         <w:fldChar w:fldCharType="begin"/>
       </w:r>
       <w:r>
-        <w:instrText xml:space="preserve"> PAGEREF _Toc14625 \h </w:instrText>
+        <w:instrText xml:space="preserve"> PAGEREF _Toc17252 \h </w:instrText>
       </w:r>
       <w:r>
         <w:fldChar w:fldCharType="separate"/>
@@ -3983,7 +3989,7 @@
         <w:rPr>
           <w:rFonts w:ascii="宋体" w:hAnsi="宋体" w:eastAsia="宋体" w:cs="宋体"/>
         </w:rPr>
-        <w:instrText xml:space="preserve"> HYPERLINK \l _Toc10278 </w:instrText>
+        <w:instrText xml:space="preserve"> HYPERLINK \l _Toc990 </w:instrText>
       </w:r>
       <w:r>
         <w:rPr>
@@ -4004,7 +4010,7 @@
         <w:fldChar w:fldCharType="begin"/>
       </w:r>
       <w:r>
-        <w:instrText xml:space="preserve"> PAGEREF _Toc10278 \h </w:instrText>
+        <w:instrText xml:space="preserve"> PAGEREF _Toc990 \h </w:instrText>
       </w:r>
       <w:r>
         <w:fldChar w:fldCharType="separate"/>
@@ -4041,7 +4047,7 @@
         <w:rPr>
           <w:rFonts w:ascii="宋体" w:hAnsi="宋体" w:eastAsia="宋体" w:cs="宋体"/>
         </w:rPr>
-        <w:instrText xml:space="preserve"> HYPERLINK \l _Toc27415 </w:instrText>
+        <w:instrText xml:space="preserve"> HYPERLINK \l _Toc32764 </w:instrText>
       </w:r>
       <w:r>
         <w:rPr>
@@ -4062,7 +4068,7 @@
         <w:fldChar w:fldCharType="begin"/>
       </w:r>
       <w:r>
-        <w:instrText xml:space="preserve"> PAGEREF _Toc27415 \h </w:instrText>
+        <w:instrText xml:space="preserve"> PAGEREF _Toc32764 \h </w:instrText>
       </w:r>
       <w:r>
         <w:fldChar w:fldCharType="separate"/>
@@ -4099,7 +4105,7 @@
         <w:rPr>
           <w:rFonts w:ascii="宋体" w:hAnsi="宋体" w:eastAsia="宋体" w:cs="宋体"/>
         </w:rPr>
-        <w:instrText xml:space="preserve"> HYPERLINK \l _Toc24564 </w:instrText>
+        <w:instrText xml:space="preserve"> HYPERLINK \l _Toc8811 </w:instrText>
       </w:r>
       <w:r>
         <w:rPr>
@@ -4120,7 +4126,7 @@
         <w:fldChar w:fldCharType="begin"/>
       </w:r>
       <w:r>
-        <w:instrText xml:space="preserve"> PAGEREF _Toc24564 \h </w:instrText>
+        <w:instrText xml:space="preserve"> PAGEREF _Toc8811 \h </w:instrText>
       </w:r>
       <w:r>
         <w:fldChar w:fldCharType="separate"/>
@@ -4157,7 +4163,7 @@
         <w:rPr>
           <w:rFonts w:ascii="宋体" w:hAnsi="宋体" w:eastAsia="宋体" w:cs="宋体"/>
         </w:rPr>
-        <w:instrText xml:space="preserve"> HYPERLINK \l _Toc16187 </w:instrText>
+        <w:instrText xml:space="preserve"> HYPERLINK \l _Toc18548 </w:instrText>
       </w:r>
       <w:r>
         <w:rPr>
@@ -4178,7 +4184,7 @@
         <w:fldChar w:fldCharType="begin"/>
       </w:r>
       <w:r>
-        <w:instrText xml:space="preserve"> PAGEREF _Toc16187 \h </w:instrText>
+        <w:instrText xml:space="preserve"> PAGEREF _Toc18548 \h </w:instrText>
       </w:r>
       <w:r>
         <w:fldChar w:fldCharType="separate"/>
@@ -4215,7 +4221,7 @@
         <w:rPr>
           <w:rFonts w:ascii="宋体" w:hAnsi="宋体" w:eastAsia="宋体" w:cs="宋体"/>
         </w:rPr>
-        <w:instrText xml:space="preserve"> HYPERLINK \l _Toc17152 </w:instrText>
+        <w:instrText xml:space="preserve"> HYPERLINK \l _Toc31048 </w:instrText>
       </w:r>
       <w:r>
         <w:rPr>
@@ -4236,7 +4242,7 @@
         <w:fldChar w:fldCharType="begin"/>
       </w:r>
       <w:r>
-        <w:instrText xml:space="preserve"> PAGEREF _Toc17152 \h </w:instrText>
+        <w:instrText xml:space="preserve"> PAGEREF _Toc31048 \h </w:instrText>
       </w:r>
       <w:r>
         <w:fldChar w:fldCharType="separate"/>
@@ -4273,7 +4279,7 @@
         <w:rPr>
           <w:rFonts w:ascii="宋体" w:hAnsi="宋体" w:eastAsia="宋体" w:cs="宋体"/>
         </w:rPr>
-        <w:instrText xml:space="preserve"> HYPERLINK \l _Toc341 </w:instrText>
+        <w:instrText xml:space="preserve"> HYPERLINK \l _Toc23860 </w:instrText>
       </w:r>
       <w:r>
         <w:rPr>
@@ -4294,7 +4300,7 @@
         <w:fldChar w:fldCharType="begin"/>
       </w:r>
       <w:r>
-        <w:instrText xml:space="preserve"> PAGEREF _Toc341 \h </w:instrText>
+        <w:instrText xml:space="preserve"> PAGEREF _Toc23860 \h </w:instrText>
       </w:r>
       <w:r>
         <w:fldChar w:fldCharType="separate"/>
@@ -4331,7 +4337,7 @@
         <w:rPr>
           <w:rFonts w:ascii="宋体" w:hAnsi="宋体" w:eastAsia="宋体" w:cs="宋体"/>
         </w:rPr>
-        <w:instrText xml:space="preserve"> HYPERLINK \l _Toc7702 </w:instrText>
+        <w:instrText xml:space="preserve"> HYPERLINK \l _Toc28846 </w:instrText>
       </w:r>
       <w:r>
         <w:rPr>
@@ -4352,7 +4358,7 @@
         <w:fldChar w:fldCharType="begin"/>
       </w:r>
       <w:r>
-        <w:instrText xml:space="preserve"> PAGEREF _Toc7702 \h </w:instrText>
+        <w:instrText xml:space="preserve"> PAGEREF _Toc28846 \h </w:instrText>
       </w:r>
       <w:r>
         <w:fldChar w:fldCharType="separate"/>
@@ -4389,7 +4395,7 @@
         <w:rPr>
           <w:rFonts w:ascii="宋体" w:hAnsi="宋体" w:eastAsia="宋体" w:cs="宋体"/>
         </w:rPr>
-        <w:instrText xml:space="preserve"> HYPERLINK \l _Toc25221 </w:instrText>
+        <w:instrText xml:space="preserve"> HYPERLINK \l _Toc20788 </w:instrText>
       </w:r>
       <w:r>
         <w:rPr>
@@ -4410,7 +4416,7 @@
         <w:fldChar w:fldCharType="begin"/>
       </w:r>
       <w:r>
-        <w:instrText xml:space="preserve"> PAGEREF _Toc25221 \h </w:instrText>
+        <w:instrText xml:space="preserve"> PAGEREF _Toc20788 \h </w:instrText>
       </w:r>
       <w:r>
         <w:fldChar w:fldCharType="separate"/>
@@ -4447,7 +4453,7 @@
         <w:rPr>
           <w:rFonts w:ascii="宋体" w:hAnsi="宋体" w:eastAsia="宋体" w:cs="宋体"/>
         </w:rPr>
-        <w:instrText xml:space="preserve"> HYPERLINK \l _Toc8021 </w:instrText>
+        <w:instrText xml:space="preserve"> HYPERLINK \l _Toc5300 </w:instrText>
       </w:r>
       <w:r>
         <w:rPr>
@@ -4468,7 +4474,7 @@
         <w:fldChar w:fldCharType="begin"/>
       </w:r>
       <w:r>
-        <w:instrText xml:space="preserve"> PAGEREF _Toc8021 \h </w:instrText>
+        <w:instrText xml:space="preserve"> PAGEREF _Toc5300 \h </w:instrText>
       </w:r>
       <w:r>
         <w:fldChar w:fldCharType="separate"/>
@@ -4505,7 +4511,7 @@
         <w:rPr>
           <w:rFonts w:ascii="宋体" w:hAnsi="宋体" w:eastAsia="宋体" w:cs="宋体"/>
         </w:rPr>
-        <w:instrText xml:space="preserve"> HYPERLINK \l _Toc31741 </w:instrText>
+        <w:instrText xml:space="preserve"> HYPERLINK \l _Toc14636 </w:instrText>
       </w:r>
       <w:r>
         <w:rPr>
@@ -4526,7 +4532,7 @@
         <w:fldChar w:fldCharType="begin"/>
       </w:r>
       <w:r>
-        <w:instrText xml:space="preserve"> PAGEREF _Toc31741 \h </w:instrText>
+        <w:instrText xml:space="preserve"> PAGEREF _Toc14636 \h </w:instrText>
       </w:r>
       <w:r>
         <w:fldChar w:fldCharType="separate"/>
@@ -4563,7 +4569,7 @@
         <w:rPr>
           <w:rFonts w:ascii="宋体" w:hAnsi="宋体" w:eastAsia="宋体" w:cs="宋体"/>
         </w:rPr>
-        <w:instrText xml:space="preserve"> HYPERLINK \l _Toc22639 </w:instrText>
+        <w:instrText xml:space="preserve"> HYPERLINK \l _Toc25669 </w:instrText>
       </w:r>
       <w:r>
         <w:rPr>
@@ -4584,7 +4590,7 @@
         <w:fldChar w:fldCharType="begin"/>
       </w:r>
       <w:r>
-        <w:instrText xml:space="preserve"> PAGEREF _Toc22639 \h </w:instrText>
+        <w:instrText xml:space="preserve"> PAGEREF _Toc25669 \h </w:instrText>
       </w:r>
       <w:r>
         <w:fldChar w:fldCharType="separate"/>
@@ -4621,7 +4627,7 @@
         <w:rPr>
           <w:rFonts w:ascii="宋体" w:hAnsi="宋体" w:eastAsia="宋体" w:cs="宋体"/>
         </w:rPr>
-        <w:instrText xml:space="preserve"> HYPERLINK \l _Toc10442 </w:instrText>
+        <w:instrText xml:space="preserve"> HYPERLINK \l _Toc10539 </w:instrText>
       </w:r>
       <w:r>
         <w:rPr>
@@ -4642,7 +4648,7 @@
         <w:fldChar w:fldCharType="begin"/>
       </w:r>
       <w:r>
-        <w:instrText xml:space="preserve"> PAGEREF _Toc10442 \h </w:instrText>
+        <w:instrText xml:space="preserve"> PAGEREF _Toc10539 \h </w:instrText>
       </w:r>
       <w:r>
         <w:fldChar w:fldCharType="separate"/>
@@ -4679,7 +4685,7 @@
         <w:rPr>
           <w:rFonts w:ascii="宋体" w:hAnsi="宋体" w:eastAsia="宋体" w:cs="宋体"/>
         </w:rPr>
-        <w:instrText xml:space="preserve"> HYPERLINK \l _Toc4054 </w:instrText>
+        <w:instrText xml:space="preserve"> HYPERLINK \l _Toc6362 </w:instrText>
       </w:r>
       <w:r>
         <w:rPr>
@@ -4700,7 +4706,7 @@
         <w:fldChar w:fldCharType="begin"/>
       </w:r>
       <w:r>
-        <w:instrText xml:space="preserve"> PAGEREF _Toc4054 \h </w:instrText>
+        <w:instrText xml:space="preserve"> PAGEREF _Toc6362 \h </w:instrText>
       </w:r>
       <w:r>
         <w:fldChar w:fldCharType="separate"/>
@@ -4737,7 +4743,7 @@
         <w:rPr>
           <w:rFonts w:ascii="宋体" w:hAnsi="宋体" w:eastAsia="宋体" w:cs="宋体"/>
         </w:rPr>
-        <w:instrText xml:space="preserve"> HYPERLINK \l _Toc30406 </w:instrText>
+        <w:instrText xml:space="preserve"> HYPERLINK \l _Toc7128 </w:instrText>
       </w:r>
       <w:r>
         <w:rPr>
@@ -4758,7 +4764,7 @@
         <w:fldChar w:fldCharType="begin"/>
       </w:r>
       <w:r>
-        <w:instrText xml:space="preserve"> PAGEREF _Toc30406 \h </w:instrText>
+        <w:instrText xml:space="preserve"> PAGEREF _Toc7128 \h </w:instrText>
       </w:r>
       <w:r>
         <w:fldChar w:fldCharType="separate"/>
@@ -4795,7 +4801,7 @@
         <w:rPr>
           <w:rFonts w:ascii="宋体" w:hAnsi="宋体" w:eastAsia="宋体" w:cs="宋体"/>
         </w:rPr>
-        <w:instrText xml:space="preserve"> HYPERLINK \l _Toc16487 </w:instrText>
+        <w:instrText xml:space="preserve"> HYPERLINK \l _Toc13611 </w:instrText>
       </w:r>
       <w:r>
         <w:rPr>
@@ -4816,7 +4822,7 @@
         <w:fldChar w:fldCharType="begin"/>
       </w:r>
       <w:r>
-        <w:instrText xml:space="preserve"> PAGEREF _Toc16487 \h </w:instrText>
+        <w:instrText xml:space="preserve"> PAGEREF _Toc13611 \h </w:instrText>
       </w:r>
       <w:r>
         <w:fldChar w:fldCharType="separate"/>
@@ -4857,7 +4863,7 @@
         <w:pStyle w:val="3"/>
         <w:ind w:firstLine="0"/>
       </w:pPr>
-      <w:bookmarkStart w:id="0" w:name="_Toc9171"/>
+      <w:bookmarkStart w:id="0" w:name="_Toc17983"/>
       <w:r>
         <w:rPr>
           <w:rFonts w:ascii="微软雅黑" w:hAnsi="微软雅黑" w:eastAsia="微软雅黑" w:cs="微软雅黑"/>
@@ -4930,7 +4936,7 @@
         <w:pStyle w:val="3"/>
         <w:ind w:firstLine="0"/>
       </w:pPr>
-      <w:bookmarkStart w:id="1" w:name="_Toc31635"/>
+      <w:bookmarkStart w:id="1" w:name="_Toc20377"/>
       <w:r>
         <w:rPr>
           <w:rFonts w:ascii="微软雅黑" w:hAnsi="微软雅黑" w:eastAsia="微软雅黑" w:cs="微软雅黑"/>
@@ -4965,7 +4971,7 @@
         <w:pStyle w:val="3"/>
         <w:ind w:firstLine="0"/>
       </w:pPr>
-      <w:bookmarkStart w:id="2" w:name="_Toc28663"/>
+      <w:bookmarkStart w:id="2" w:name="_Toc11095"/>
       <w:r>
         <w:rPr>
           <w:rFonts w:ascii="微软雅黑" w:hAnsi="微软雅黑" w:eastAsia="微软雅黑" w:cs="微软雅黑"/>
@@ -4982,7 +4988,7 @@
         <w:pStyle w:val="4"/>
         <w:ind w:firstLine="0"/>
       </w:pPr>
-      <w:bookmarkStart w:id="3" w:name="_Toc26316"/>
+      <w:bookmarkStart w:id="3" w:name="_Toc4712"/>
       <w:r>
         <w:rPr>
           <w:rFonts w:ascii="微软雅黑" w:hAnsi="微软雅黑" w:eastAsia="微软雅黑" w:cs="微软雅黑"/>
@@ -5168,7 +5174,7 @@
         <w:pStyle w:val="4"/>
         <w:ind w:firstLine="0"/>
       </w:pPr>
-      <w:bookmarkStart w:id="4" w:name="_Toc29051"/>
+      <w:bookmarkStart w:id="4" w:name="_Toc2375"/>
       <w:r>
         <w:rPr>
           <w:rFonts w:ascii="微软雅黑" w:hAnsi="微软雅黑" w:eastAsia="微软雅黑" w:cs="微软雅黑"/>
@@ -6768,11 +6774,7 @@
     </w:p>
     <w:p>
       <w:r>
-        <w:rPr>
-          <w:rFonts w:ascii="宋体" w:hAnsi="宋体" w:eastAsia="宋体" w:cs="宋体"/>
-          <w:sz w:val="22"/>
-        </w:rPr>
-        <w:t>十个实验分支覆盖课程规定的全部实验内容，按课程说明中的工作量分级属于 A 级工作量范围。各分支均有对应实现和官方 grader 结果，形成从用户程序到内核核心机制的完整实验序列。</w:t>
+        <w:t>十个实验分支覆盖课程规定的全部实验内容，对应课程说明中‘完成全部实验内容’的 A 级工作量描述。各分支均有对应实现和官方 grader 结果，形成从用户程序到内核核心机制的完整实验序列。</w:t>
       </w:r>
     </w:p>
     <w:p>
@@ -6780,7 +6782,7 @@
         <w:pStyle w:val="3"/>
         <w:ind w:firstLine="0"/>
       </w:pPr>
-      <w:bookmarkStart w:id="5" w:name="_Toc601"/>
+      <w:bookmarkStart w:id="5" w:name="_Toc4003"/>
       <w:r>
         <w:rPr>
           <w:rFonts w:ascii="微软雅黑" w:hAnsi="微软雅黑" w:eastAsia="微软雅黑" w:cs="微软雅黑"/>
@@ -7602,7 +7604,7 @@
         <w:pStyle w:val="3"/>
         <w:ind w:firstLine="0"/>
       </w:pPr>
-      <w:bookmarkStart w:id="6" w:name="_Toc434"/>
+      <w:bookmarkStart w:id="6" w:name="_Toc11794"/>
       <w:r>
         <w:rPr>
           <w:rFonts w:ascii="微软雅黑" w:hAnsi="微软雅黑" w:eastAsia="微软雅黑" w:cs="微软雅黑"/>
@@ -7639,7 +7641,7 @@
                     </pic:cNvPicPr>
                   </pic:nvPicPr>
                   <pic:blipFill>
-                    <a:blip r:embed="rId8"/>
+                    <a:blip r:embed="rId14"/>
                     <a:stretch>
                       <a:fillRect/>
                     </a:stretch>
@@ -7672,7 +7674,7 @@
           <w:color w:val="595959"/>
           <w:sz w:val="19"/>
         </w:rPr>
-        <w:t>图 4-1  xv6 Trap 入口与内核分流</w:t>
+        <w:t>图 4-1 xv6 用户态、Trap 与内核子系统调用关系</w:t>
       </w:r>
     </w:p>
     <w:p>
@@ -7680,7 +7682,7 @@
         <w:pStyle w:val="4"/>
         <w:ind w:firstLine="0"/>
       </w:pPr>
-      <w:bookmarkStart w:id="7" w:name="_Toc24507"/>
+      <w:bookmarkStart w:id="7" w:name="_Toc9966"/>
       <w:r>
         <w:rPr>
           <w:rFonts w:ascii="微软雅黑" w:hAnsi="微软雅黑" w:eastAsia="微软雅黑" w:cs="微软雅黑"/>
@@ -7811,7 +7813,7 @@
         <w:pStyle w:val="4"/>
         <w:ind w:firstLine="0"/>
       </w:pPr>
-      <w:bookmarkStart w:id="8" w:name="_Toc7059"/>
+      <w:bookmarkStart w:id="8" w:name="_Toc17873"/>
       <w:r>
         <w:rPr>
           <w:rFonts w:ascii="微软雅黑" w:hAnsi="微软雅黑" w:eastAsia="微软雅黑" w:cs="微软雅黑"/>
@@ -7935,7 +7937,7 @@
         <w:pStyle w:val="4"/>
         <w:ind w:firstLine="0"/>
       </w:pPr>
-      <w:bookmarkStart w:id="9" w:name="_Toc26532"/>
+      <w:bookmarkStart w:id="9" w:name="_Toc31477"/>
       <w:r>
         <w:rPr>
           <w:rFonts w:ascii="微软雅黑" w:hAnsi="微软雅黑" w:eastAsia="微软雅黑" w:cs="微软雅黑"/>
@@ -8006,7 +8008,7 @@
         <w:pStyle w:val="4"/>
         <w:ind w:firstLine="0"/>
       </w:pPr>
-      <w:bookmarkStart w:id="10" w:name="_Toc16465"/>
+      <w:bookmarkStart w:id="10" w:name="_Toc23437"/>
       <w:r>
         <w:rPr>
           <w:rFonts w:ascii="微软雅黑" w:hAnsi="微软雅黑" w:eastAsia="微软雅黑" w:cs="微软雅黑"/>
@@ -8024,7 +8026,7 @@
           <w:rFonts w:ascii="宋体" w:hAnsi="宋体" w:eastAsia="宋体" w:cs="宋体"/>
           <w:sz w:val="22"/>
         </w:rPr>
-        <w:t xml:space="preserve">spinlock 保护短临界区，sleeplock 保护可能睡眠的长期操作。文件名经目录项解析为 inode，buffer cache 缓存磁盘块，日志保证多块更新的崩溃一致性。VirtIO 提供磁盘，E1000 通过 DMA descriptor ring 收发网络包。架构图及组件关系见 </w:t>
+        <w:t xml:space="preserve">spinlock 保护短临界区，sleeplock 保护可能睡眠的长期操作。文件名经目录项解析为 inode，buffer cache 缓存磁盘块，日志保证多块更新的崩溃一致性。VirtIO 提供磁盘，E1000 通过 DMA descriptor ring 收发网络包。总体调用与 Trap 分流关系如图 4-1 所示，项目仓库中的 </w:t>
       </w:r>
       <w:r>
         <w:rPr>
@@ -8040,7 +8042,7 @@
           <w:rFonts w:ascii="宋体" w:hAnsi="宋体" w:eastAsia="宋体" w:cs="宋体"/>
           <w:sz w:val="22"/>
         </w:rPr>
-        <w:t>。</w:t>
+        <w:t xml:space="preserve"> 提供进一步的组件说明。</w:t>
       </w:r>
     </w:p>
     <w:p>
@@ -8048,7 +8050,7 @@
         <w:pStyle w:val="3"/>
         <w:ind w:firstLine="0"/>
       </w:pPr>
-      <w:bookmarkStart w:id="11" w:name="_Toc3229"/>
+      <w:bookmarkStart w:id="11" w:name="_Toc22888"/>
       <w:r>
         <w:rPr>
           <w:rFonts w:ascii="微软雅黑" w:hAnsi="微软雅黑" w:eastAsia="微软雅黑" w:cs="微软雅黑"/>
@@ -8065,7 +8067,7 @@
         <w:pStyle w:val="4"/>
         <w:ind w:firstLine="0"/>
       </w:pPr>
-      <w:bookmarkStart w:id="12" w:name="_Toc15852"/>
+      <w:bookmarkStart w:id="12" w:name="_Toc25053"/>
       <w:r>
         <w:rPr>
           <w:rFonts w:ascii="微软雅黑" w:hAnsi="微软雅黑" w:eastAsia="微软雅黑" w:cs="微软雅黑"/>
@@ -8181,7 +8183,7 @@
         <w:pStyle w:val="4"/>
         <w:ind w:firstLine="0"/>
       </w:pPr>
-      <w:bookmarkStart w:id="13" w:name="_Toc23512"/>
+      <w:bookmarkStart w:id="13" w:name="_Toc24477"/>
       <w:r>
         <w:rPr>
           <w:rFonts w:ascii="微软雅黑" w:hAnsi="微软雅黑" w:eastAsia="微软雅黑" w:cs="微软雅黑"/>
@@ -8372,7 +8374,7 @@
         <w:pStyle w:val="4"/>
         <w:ind w:firstLine="0"/>
       </w:pPr>
-      <w:bookmarkStart w:id="14" w:name="_Toc20281"/>
+      <w:bookmarkStart w:id="14" w:name="_Toc2416"/>
       <w:r>
         <w:rPr>
           <w:rFonts w:ascii="微软雅黑" w:hAnsi="微软雅黑" w:eastAsia="微软雅黑" w:cs="微软雅黑"/>
@@ -8488,7 +8490,7 @@
         <w:pStyle w:val="4"/>
         <w:ind w:firstLine="0"/>
       </w:pPr>
-      <w:bookmarkStart w:id="15" w:name="_Toc9623"/>
+      <w:bookmarkStart w:id="15" w:name="_Toc10611"/>
       <w:r>
         <w:rPr>
           <w:rFonts w:ascii="微软雅黑" w:hAnsi="微软雅黑" w:eastAsia="微软雅黑" w:cs="微软雅黑"/>
@@ -8544,7 +8546,7 @@
         <w:pStyle w:val="4"/>
         <w:ind w:firstLine="0"/>
       </w:pPr>
-      <w:bookmarkStart w:id="16" w:name="_Toc2347"/>
+      <w:bookmarkStart w:id="16" w:name="_Toc7402"/>
       <w:r>
         <w:rPr>
           <w:rFonts w:ascii="微软雅黑" w:hAnsi="微软雅黑" w:eastAsia="微软雅黑" w:cs="微软雅黑"/>
@@ -8585,7 +8587,7 @@
         <w:pStyle w:val="3"/>
         <w:ind w:firstLine="0"/>
       </w:pPr>
-      <w:bookmarkStart w:id="17" w:name="_Toc465"/>
+      <w:bookmarkStart w:id="17" w:name="_Toc1073"/>
       <w:r>
         <w:rPr>
           <w:rFonts w:ascii="微软雅黑" w:hAnsi="微软雅黑" w:eastAsia="微软雅黑" w:cs="微软雅黑"/>
@@ -8602,7 +8604,7 @@
         <w:pStyle w:val="4"/>
         <w:ind w:firstLine="0"/>
       </w:pPr>
-      <w:bookmarkStart w:id="18" w:name="_Toc26472"/>
+      <w:bookmarkStart w:id="18" w:name="_Toc5319"/>
       <w:r>
         <w:rPr>
           <w:rFonts w:ascii="微软雅黑" w:hAnsi="微软雅黑" w:eastAsia="微软雅黑" w:cs="微软雅黑"/>
@@ -8703,7 +8705,7 @@
         <w:pStyle w:val="4"/>
         <w:ind w:firstLine="0"/>
       </w:pPr>
-      <w:bookmarkStart w:id="19" w:name="_Toc23293"/>
+      <w:bookmarkStart w:id="19" w:name="_Toc11636"/>
       <w:r>
         <w:rPr>
           <w:rFonts w:ascii="微软雅黑" w:hAnsi="微软雅黑" w:eastAsia="微软雅黑" w:cs="微软雅黑"/>
@@ -8879,7 +8881,7 @@
         <w:pStyle w:val="4"/>
         <w:ind w:firstLine="0"/>
       </w:pPr>
-      <w:bookmarkStart w:id="20" w:name="_Toc6757"/>
+      <w:bookmarkStart w:id="20" w:name="_Toc27414"/>
       <w:r>
         <w:rPr>
           <w:rFonts w:ascii="微软雅黑" w:hAnsi="微软雅黑" w:eastAsia="微软雅黑" w:cs="微软雅黑"/>
@@ -8958,7 +8960,7 @@
         <w:pStyle w:val="4"/>
         <w:ind w:firstLine="0"/>
       </w:pPr>
-      <w:bookmarkStart w:id="21" w:name="_Toc14374"/>
+      <w:bookmarkStart w:id="21" w:name="_Toc9828"/>
       <w:r>
         <w:rPr>
           <w:rFonts w:ascii="微软雅黑" w:hAnsi="微软雅黑" w:eastAsia="微软雅黑" w:cs="微软雅黑"/>
@@ -8992,7 +8994,7 @@
         <w:pStyle w:val="4"/>
         <w:ind w:firstLine="0"/>
       </w:pPr>
-      <w:bookmarkStart w:id="22" w:name="_Toc2986"/>
+      <w:bookmarkStart w:id="22" w:name="_Toc13900"/>
       <w:r>
         <w:rPr>
           <w:rFonts w:ascii="微软雅黑" w:hAnsi="微软雅黑" w:eastAsia="微软雅黑" w:cs="微软雅黑"/>
@@ -9033,7 +9035,7 @@
         <w:pStyle w:val="3"/>
         <w:ind w:firstLine="0"/>
       </w:pPr>
-      <w:bookmarkStart w:id="23" w:name="_Toc2232"/>
+      <w:bookmarkStart w:id="23" w:name="_Toc9678"/>
       <w:r>
         <w:rPr>
           <w:rFonts w:ascii="微软雅黑" w:hAnsi="微软雅黑" w:eastAsia="微软雅黑" w:cs="微软雅黑"/>
@@ -9050,7 +9052,7 @@
         <w:pStyle w:val="4"/>
         <w:ind w:firstLine="0"/>
       </w:pPr>
-      <w:bookmarkStart w:id="24" w:name="_Toc28908"/>
+      <w:bookmarkStart w:id="24" w:name="_Toc2950"/>
       <w:r>
         <w:rPr>
           <w:rFonts w:ascii="微软雅黑" w:hAnsi="微软雅黑" w:eastAsia="微软雅黑" w:cs="微软雅黑"/>
@@ -9106,7 +9108,7 @@
         <w:pStyle w:val="4"/>
         <w:ind w:firstLine="0"/>
       </w:pPr>
-      <w:bookmarkStart w:id="25" w:name="_Toc1962"/>
+      <w:bookmarkStart w:id="25" w:name="_Toc18390"/>
       <w:r>
         <w:rPr>
           <w:rFonts w:ascii="微软雅黑" w:hAnsi="微软雅黑" w:eastAsia="微软雅黑" w:cs="微软雅黑"/>
@@ -9260,7 +9262,7 @@
         <w:pStyle w:val="4"/>
         <w:ind w:firstLine="0"/>
       </w:pPr>
-      <w:bookmarkStart w:id="26" w:name="_Toc19728"/>
+      <w:bookmarkStart w:id="26" w:name="_Toc27625"/>
       <w:r>
         <w:rPr>
           <w:rFonts w:ascii="微软雅黑" w:hAnsi="微软雅黑" w:eastAsia="微软雅黑" w:cs="微软雅黑"/>
@@ -9346,7 +9348,7 @@
         <w:pStyle w:val="4"/>
         <w:ind w:firstLine="0"/>
       </w:pPr>
-      <w:bookmarkStart w:id="27" w:name="_Toc14571"/>
+      <w:bookmarkStart w:id="27" w:name="_Toc20568"/>
       <w:r>
         <w:rPr>
           <w:rFonts w:ascii="微软雅黑" w:hAnsi="微软雅黑" w:eastAsia="微软雅黑" w:cs="微软雅黑"/>
@@ -9380,7 +9382,7 @@
         <w:pStyle w:val="4"/>
         <w:ind w:firstLine="0"/>
       </w:pPr>
-      <w:bookmarkStart w:id="28" w:name="_Toc30312"/>
+      <w:bookmarkStart w:id="28" w:name="_Toc24072"/>
       <w:r>
         <w:rPr>
           <w:rFonts w:ascii="微软雅黑" w:hAnsi="微软雅黑" w:eastAsia="微软雅黑" w:cs="微软雅黑"/>
@@ -9421,7 +9423,7 @@
         <w:pStyle w:val="3"/>
         <w:ind w:firstLine="0"/>
       </w:pPr>
-      <w:bookmarkStart w:id="29" w:name="_Toc23353"/>
+      <w:bookmarkStart w:id="29" w:name="_Toc15665"/>
       <w:r>
         <w:rPr>
           <w:rFonts w:ascii="微软雅黑" w:hAnsi="微软雅黑" w:eastAsia="微软雅黑" w:cs="微软雅黑"/>
@@ -9438,7 +9440,7 @@
         <w:pStyle w:val="4"/>
         <w:ind w:firstLine="0"/>
       </w:pPr>
-      <w:bookmarkStart w:id="30" w:name="_Toc13214"/>
+      <w:bookmarkStart w:id="30" w:name="_Toc7033"/>
       <w:r>
         <w:rPr>
           <w:rFonts w:ascii="微软雅黑" w:hAnsi="微软雅黑" w:eastAsia="微软雅黑" w:cs="微软雅黑"/>
@@ -9509,7 +9511,7 @@
         <w:pStyle w:val="4"/>
         <w:ind w:firstLine="0"/>
       </w:pPr>
-      <w:bookmarkStart w:id="31" w:name="_Toc14806"/>
+      <w:bookmarkStart w:id="31" w:name="_Toc4110"/>
       <w:r>
         <w:rPr>
           <w:rFonts w:ascii="微软雅黑" w:hAnsi="微软雅黑" w:eastAsia="微软雅黑" w:cs="微软雅黑"/>
@@ -9633,7 +9635,7 @@
         <w:pStyle w:val="4"/>
         <w:ind w:firstLine="0"/>
       </w:pPr>
-      <w:bookmarkStart w:id="32" w:name="_Toc19753"/>
+      <w:bookmarkStart w:id="32" w:name="_Toc15351"/>
       <w:r>
         <w:rPr>
           <w:rFonts w:ascii="微软雅黑" w:hAnsi="微软雅黑" w:eastAsia="微软雅黑" w:cs="微软雅黑"/>
@@ -9704,7 +9706,7 @@
         <w:pStyle w:val="4"/>
         <w:ind w:firstLine="0"/>
       </w:pPr>
-      <w:bookmarkStart w:id="33" w:name="_Toc25777"/>
+      <w:bookmarkStart w:id="33" w:name="_Toc13169"/>
       <w:r>
         <w:rPr>
           <w:rFonts w:ascii="微软雅黑" w:hAnsi="微软雅黑" w:eastAsia="微软雅黑" w:cs="微软雅黑"/>
@@ -9738,7 +9740,7 @@
         <w:pStyle w:val="4"/>
         <w:ind w:firstLine="0"/>
       </w:pPr>
-      <w:bookmarkStart w:id="34" w:name="_Toc8004"/>
+      <w:bookmarkStart w:id="34" w:name="_Toc21199"/>
       <w:r>
         <w:rPr>
           <w:rFonts w:ascii="微软雅黑" w:hAnsi="微软雅黑" w:eastAsia="微软雅黑" w:cs="微软雅黑"/>
@@ -9779,7 +9781,7 @@
         <w:pStyle w:val="3"/>
         <w:ind w:firstLine="0"/>
       </w:pPr>
-      <w:bookmarkStart w:id="35" w:name="_Toc19194"/>
+      <w:bookmarkStart w:id="35" w:name="_Toc15622"/>
       <w:r>
         <w:rPr>
           <w:rFonts w:ascii="微软雅黑" w:hAnsi="微软雅黑" w:eastAsia="微软雅黑" w:cs="微软雅黑"/>
@@ -9796,7 +9798,7 @@
         <w:pStyle w:val="4"/>
         <w:ind w:firstLine="0"/>
       </w:pPr>
-      <w:bookmarkStart w:id="36" w:name="_Toc22715"/>
+      <w:bookmarkStart w:id="36" w:name="_Toc22624"/>
       <w:r>
         <w:rPr>
           <w:rFonts w:ascii="微软雅黑" w:hAnsi="微软雅黑" w:eastAsia="微软雅黑" w:cs="微软雅黑"/>
@@ -9852,7 +9854,7 @@
         <w:pStyle w:val="4"/>
         <w:ind w:firstLine="0"/>
       </w:pPr>
-      <w:bookmarkStart w:id="37" w:name="_Toc21310"/>
+      <w:bookmarkStart w:id="37" w:name="_Toc8067"/>
       <w:r>
         <w:rPr>
           <w:rFonts w:ascii="微软雅黑" w:hAnsi="微软雅黑" w:eastAsia="微软雅黑" w:cs="微软雅黑"/>
@@ -10006,7 +10008,7 @@
         <w:pStyle w:val="4"/>
         <w:ind w:firstLine="0"/>
       </w:pPr>
-      <w:bookmarkStart w:id="38" w:name="_Toc13584"/>
+      <w:bookmarkStart w:id="38" w:name="_Toc18681"/>
       <w:r>
         <w:rPr>
           <w:rFonts w:ascii="微软雅黑" w:hAnsi="微软雅黑" w:eastAsia="微软雅黑" w:cs="微软雅黑"/>
@@ -10077,7 +10079,7 @@
         <w:pStyle w:val="4"/>
         <w:ind w:firstLine="0"/>
       </w:pPr>
-      <w:bookmarkStart w:id="39" w:name="_Toc9597"/>
+      <w:bookmarkStart w:id="39" w:name="_Toc12454"/>
       <w:r>
         <w:rPr>
           <w:rFonts w:ascii="微软雅黑" w:hAnsi="微软雅黑" w:eastAsia="微软雅黑" w:cs="微软雅黑"/>
@@ -10111,7 +10113,7 @@
         <w:pStyle w:val="4"/>
         <w:ind w:firstLine="0"/>
       </w:pPr>
-      <w:bookmarkStart w:id="40" w:name="_Toc13499"/>
+      <w:bookmarkStart w:id="40" w:name="_Toc27490"/>
       <w:r>
         <w:rPr>
           <w:rFonts w:ascii="微软雅黑" w:hAnsi="微软雅黑" w:eastAsia="微软雅黑" w:cs="微软雅黑"/>
@@ -10152,7 +10154,7 @@
         <w:pStyle w:val="3"/>
         <w:ind w:firstLine="0"/>
       </w:pPr>
-      <w:bookmarkStart w:id="41" w:name="_Toc16091"/>
+      <w:bookmarkStart w:id="41" w:name="_Toc19474"/>
       <w:r>
         <w:rPr>
           <w:rFonts w:ascii="微软雅黑" w:hAnsi="微软雅黑" w:eastAsia="微软雅黑" w:cs="微软雅黑"/>
@@ -10169,7 +10171,7 @@
         <w:pStyle w:val="4"/>
         <w:ind w:firstLine="0"/>
       </w:pPr>
-      <w:bookmarkStart w:id="42" w:name="_Toc11425"/>
+      <w:bookmarkStart w:id="42" w:name="_Toc1221"/>
       <w:r>
         <w:rPr>
           <w:rFonts w:ascii="微软雅黑" w:hAnsi="微软雅黑" w:eastAsia="微软雅黑" w:cs="微软雅黑"/>
@@ -10195,7 +10197,7 @@
         <w:pStyle w:val="4"/>
         <w:ind w:firstLine="0"/>
       </w:pPr>
-      <w:bookmarkStart w:id="43" w:name="_Toc25553"/>
+      <w:bookmarkStart w:id="43" w:name="_Toc25109"/>
       <w:r>
         <w:rPr>
           <w:rFonts w:ascii="微软雅黑" w:hAnsi="微软雅黑" w:eastAsia="微软雅黑" w:cs="微软雅黑"/>
@@ -10304,7 +10306,7 @@
         <w:pStyle w:val="4"/>
         <w:ind w:firstLine="0"/>
       </w:pPr>
-      <w:bookmarkStart w:id="44" w:name="_Toc3562"/>
+      <w:bookmarkStart w:id="44" w:name="_Toc11483"/>
       <w:r>
         <w:rPr>
           <w:rFonts w:ascii="微软雅黑" w:hAnsi="微软雅黑" w:eastAsia="微软雅黑" w:cs="微软雅黑"/>
@@ -10345,7 +10347,7 @@
         <w:pStyle w:val="4"/>
         <w:ind w:firstLine="0"/>
       </w:pPr>
-      <w:bookmarkStart w:id="45" w:name="_Toc27925"/>
+      <w:bookmarkStart w:id="45" w:name="_Toc31134"/>
       <w:r>
         <w:rPr>
           <w:rFonts w:ascii="微软雅黑" w:hAnsi="微软雅黑" w:eastAsia="微软雅黑" w:cs="微软雅黑"/>
@@ -10379,7 +10381,7 @@
         <w:pStyle w:val="4"/>
         <w:ind w:firstLine="0"/>
       </w:pPr>
-      <w:bookmarkStart w:id="46" w:name="_Toc4575"/>
+      <w:bookmarkStart w:id="46" w:name="_Toc19589"/>
       <w:r>
         <w:rPr>
           <w:rFonts w:ascii="微软雅黑" w:hAnsi="微软雅黑" w:eastAsia="微软雅黑" w:cs="微软雅黑"/>
@@ -10420,7 +10422,7 @@
         <w:pStyle w:val="3"/>
         <w:ind w:firstLine="0"/>
       </w:pPr>
-      <w:bookmarkStart w:id="47" w:name="_Toc3217"/>
+      <w:bookmarkStart w:id="47" w:name="_Toc9967"/>
       <w:r>
         <w:rPr>
           <w:rFonts w:ascii="微软雅黑" w:hAnsi="微软雅黑" w:eastAsia="微软雅黑" w:cs="微软雅黑"/>
@@ -10437,7 +10439,7 @@
         <w:pStyle w:val="4"/>
         <w:ind w:firstLine="0"/>
       </w:pPr>
-      <w:bookmarkStart w:id="48" w:name="_Toc4480"/>
+      <w:bookmarkStart w:id="48" w:name="_Toc25153"/>
       <w:r>
         <w:rPr>
           <w:rFonts w:ascii="微软雅黑" w:hAnsi="微软雅黑" w:eastAsia="微软雅黑" w:cs="微软雅黑"/>
@@ -10463,7 +10465,7 @@
         <w:pStyle w:val="4"/>
         <w:ind w:firstLine="0"/>
       </w:pPr>
-      <w:bookmarkStart w:id="49" w:name="_Toc21266"/>
+      <w:bookmarkStart w:id="49" w:name="_Toc17614"/>
       <w:r>
         <w:rPr>
           <w:rFonts w:ascii="微软雅黑" w:hAnsi="微软雅黑" w:eastAsia="微软雅黑" w:cs="微软雅黑"/>
@@ -10557,7 +10559,7 @@
         <w:pStyle w:val="4"/>
         <w:ind w:firstLine="0"/>
       </w:pPr>
-      <w:bookmarkStart w:id="50" w:name="_Toc20201"/>
+      <w:bookmarkStart w:id="50" w:name="_Toc17168"/>
       <w:r>
         <w:rPr>
           <w:rFonts w:ascii="微软雅黑" w:hAnsi="微软雅黑" w:eastAsia="微软雅黑" w:cs="微软雅黑"/>
@@ -10598,7 +10600,7 @@
         <w:pStyle w:val="4"/>
         <w:ind w:firstLine="0"/>
       </w:pPr>
-      <w:bookmarkStart w:id="51" w:name="_Toc17579"/>
+      <w:bookmarkStart w:id="51" w:name="_Toc27709"/>
       <w:r>
         <w:rPr>
           <w:rFonts w:ascii="微软雅黑" w:hAnsi="微软雅黑" w:eastAsia="微软雅黑" w:cs="微软雅黑"/>
@@ -10632,7 +10634,7 @@
         <w:pStyle w:val="4"/>
         <w:ind w:firstLine="0"/>
       </w:pPr>
-      <w:bookmarkStart w:id="52" w:name="_Toc26307"/>
+      <w:bookmarkStart w:id="52" w:name="_Toc973"/>
       <w:r>
         <w:rPr>
           <w:rFonts w:ascii="微软雅黑" w:hAnsi="微软雅黑" w:eastAsia="微软雅黑" w:cs="微软雅黑"/>
@@ -10673,7 +10675,7 @@
         <w:pStyle w:val="3"/>
         <w:ind w:firstLine="0"/>
       </w:pPr>
-      <w:bookmarkStart w:id="53" w:name="_Toc30931"/>
+      <w:bookmarkStart w:id="53" w:name="_Toc18183"/>
       <w:r>
         <w:rPr>
           <w:rFonts w:ascii="微软雅黑" w:hAnsi="微软雅黑" w:eastAsia="微软雅黑" w:cs="微软雅黑"/>
@@ -10690,7 +10692,7 @@
         <w:pStyle w:val="4"/>
         <w:ind w:firstLine="0"/>
       </w:pPr>
-      <w:bookmarkStart w:id="54" w:name="_Toc4687"/>
+      <w:bookmarkStart w:id="54" w:name="_Toc22025"/>
       <w:r>
         <w:rPr>
           <w:rFonts w:ascii="微软雅黑" w:hAnsi="微软雅黑" w:eastAsia="微软雅黑" w:cs="微软雅黑"/>
@@ -10716,7 +10718,7 @@
         <w:pStyle w:val="4"/>
         <w:ind w:firstLine="0"/>
       </w:pPr>
-      <w:bookmarkStart w:id="55" w:name="_Toc27844"/>
+      <w:bookmarkStart w:id="55" w:name="_Toc31652"/>
       <w:r>
         <w:rPr>
           <w:rFonts w:ascii="微软雅黑" w:hAnsi="微软雅黑" w:eastAsia="微软雅黑" w:cs="微软雅黑"/>
@@ -10780,7 +10782,7 @@
         <w:pStyle w:val="4"/>
         <w:ind w:firstLine="0"/>
       </w:pPr>
-      <w:bookmarkStart w:id="56" w:name="_Toc26327"/>
+      <w:bookmarkStart w:id="56" w:name="_Toc15583"/>
       <w:r>
         <w:rPr>
           <w:rFonts w:ascii="微软雅黑" w:hAnsi="微软雅黑" w:eastAsia="微软雅黑" w:cs="微软雅黑"/>
@@ -10836,7 +10838,7 @@
         <w:pStyle w:val="4"/>
         <w:ind w:firstLine="0"/>
       </w:pPr>
-      <w:bookmarkStart w:id="57" w:name="_Toc8630"/>
+      <w:bookmarkStart w:id="57" w:name="_Toc9533"/>
       <w:r>
         <w:rPr>
           <w:rFonts w:ascii="微软雅黑" w:hAnsi="微软雅黑" w:eastAsia="微软雅黑" w:cs="微软雅黑"/>
@@ -10870,7 +10872,7 @@
         <w:pStyle w:val="4"/>
         <w:ind w:firstLine="0"/>
       </w:pPr>
-      <w:bookmarkStart w:id="58" w:name="_Toc25986"/>
+      <w:bookmarkStart w:id="58" w:name="_Toc24932"/>
       <w:r>
         <w:rPr>
           <w:rFonts w:ascii="微软雅黑" w:hAnsi="微软雅黑" w:eastAsia="微软雅黑" w:cs="微软雅黑"/>
@@ -10911,7 +10913,7 @@
         <w:pStyle w:val="3"/>
         <w:ind w:firstLine="0"/>
       </w:pPr>
-      <w:bookmarkStart w:id="59" w:name="_Toc11736"/>
+      <w:bookmarkStart w:id="59" w:name="_Toc8412"/>
       <w:r>
         <w:rPr>
           <w:rFonts w:ascii="微软雅黑" w:hAnsi="微软雅黑" w:eastAsia="微软雅黑" w:cs="微软雅黑"/>
@@ -10928,7 +10930,7 @@
         <w:pStyle w:val="4"/>
         <w:ind w:firstLine="0"/>
       </w:pPr>
-      <w:bookmarkStart w:id="60" w:name="_Toc1752"/>
+      <w:bookmarkStart w:id="60" w:name="_Toc19358"/>
       <w:r>
         <w:rPr>
           <w:rFonts w:ascii="微软雅黑" w:hAnsi="微软雅黑" w:eastAsia="微软雅黑" w:cs="微软雅黑"/>
@@ -10969,7 +10971,7 @@
         <w:pStyle w:val="4"/>
         <w:ind w:firstLine="0"/>
       </w:pPr>
-      <w:bookmarkStart w:id="61" w:name="_Toc24127"/>
+      <w:bookmarkStart w:id="61" w:name="_Toc265"/>
       <w:r>
         <w:rPr>
           <w:rFonts w:ascii="微软雅黑" w:hAnsi="微软雅黑" w:eastAsia="微软雅黑" w:cs="微软雅黑"/>
@@ -11093,7 +11095,7 @@
         <w:pStyle w:val="4"/>
         <w:ind w:firstLine="0"/>
       </w:pPr>
-      <w:bookmarkStart w:id="62" w:name="_Toc1928"/>
+      <w:bookmarkStart w:id="62" w:name="_Toc11301"/>
       <w:r>
         <w:rPr>
           <w:rFonts w:ascii="微软雅黑" w:hAnsi="微软雅黑" w:eastAsia="微软雅黑" w:cs="微软雅黑"/>
@@ -11119,7 +11121,7 @@
         <w:pStyle w:val="4"/>
         <w:ind w:firstLine="0"/>
       </w:pPr>
-      <w:bookmarkStart w:id="63" w:name="_Toc14625"/>
+      <w:bookmarkStart w:id="63" w:name="_Toc17252"/>
       <w:r>
         <w:rPr>
           <w:rFonts w:ascii="微软雅黑" w:hAnsi="微软雅黑" w:eastAsia="微软雅黑" w:cs="微软雅黑"/>
@@ -11153,7 +11155,7 @@
         <w:pStyle w:val="4"/>
         <w:ind w:firstLine="0"/>
       </w:pPr>
-      <w:bookmarkStart w:id="64" w:name="_Toc10278"/>
+      <w:bookmarkStart w:id="64" w:name="_Toc990"/>
       <w:r>
         <w:rPr>
           <w:rFonts w:ascii="微软雅黑" w:hAnsi="微软雅黑" w:eastAsia="微软雅黑" w:cs="微软雅黑"/>
@@ -11209,7 +11211,7 @@
         <w:pStyle w:val="3"/>
         <w:ind w:firstLine="0"/>
       </w:pPr>
-      <w:bookmarkStart w:id="65" w:name="_Toc27415"/>
+      <w:bookmarkStart w:id="65" w:name="_Toc32764"/>
       <w:r>
         <w:rPr>
           <w:rFonts w:ascii="微软雅黑" w:hAnsi="微软雅黑" w:eastAsia="微软雅黑" w:cs="微软雅黑"/>
@@ -11226,7 +11228,7 @@
         <w:pStyle w:val="4"/>
         <w:ind w:firstLine="0"/>
       </w:pPr>
-      <w:bookmarkStart w:id="66" w:name="_Toc24564"/>
+      <w:bookmarkStart w:id="66" w:name="_Toc8811"/>
       <w:r>
         <w:rPr>
           <w:rFonts w:ascii="微软雅黑" w:hAnsi="微软雅黑" w:eastAsia="微软雅黑" w:cs="微软雅黑"/>
@@ -11282,7 +11284,7 @@
         <w:pStyle w:val="4"/>
         <w:ind w:firstLine="0"/>
       </w:pPr>
-      <w:bookmarkStart w:id="67" w:name="_Toc16187"/>
+      <w:bookmarkStart w:id="67" w:name="_Toc18548"/>
       <w:r>
         <w:rPr>
           <w:rFonts w:ascii="微软雅黑" w:hAnsi="微软雅黑" w:eastAsia="微软雅黑" w:cs="微软雅黑"/>
@@ -11421,7 +11423,7 @@
         <w:pStyle w:val="4"/>
         <w:ind w:firstLine="0"/>
       </w:pPr>
-      <w:bookmarkStart w:id="68" w:name="_Toc17152"/>
+      <w:bookmarkStart w:id="68" w:name="_Toc31048"/>
       <w:r>
         <w:rPr>
           <w:rFonts w:ascii="微软雅黑" w:hAnsi="微软雅黑" w:eastAsia="微软雅黑" w:cs="微软雅黑"/>
@@ -11507,7 +11509,7 @@
         <w:pStyle w:val="4"/>
         <w:ind w:firstLine="0"/>
       </w:pPr>
-      <w:bookmarkStart w:id="69" w:name="_Toc341"/>
+      <w:bookmarkStart w:id="69" w:name="_Toc23860"/>
       <w:r>
         <w:rPr>
           <w:rFonts w:ascii="微软雅黑" w:hAnsi="微软雅黑" w:eastAsia="微软雅黑" w:cs="微软雅黑"/>
@@ -11541,7 +11543,7 @@
         <w:pStyle w:val="4"/>
         <w:ind w:firstLine="0"/>
       </w:pPr>
-      <w:bookmarkStart w:id="70" w:name="_Toc7702"/>
+      <w:bookmarkStart w:id="70" w:name="_Toc28846"/>
       <w:r>
         <w:rPr>
           <w:rFonts w:ascii="微软雅黑" w:hAnsi="微软雅黑" w:eastAsia="微软雅黑" w:cs="微软雅黑"/>
@@ -11582,7 +11584,7 @@
         <w:pStyle w:val="3"/>
         <w:ind w:firstLine="0"/>
       </w:pPr>
-      <w:bookmarkStart w:id="71" w:name="_Toc25221"/>
+      <w:bookmarkStart w:id="71" w:name="_Toc20788"/>
       <w:r>
         <w:rPr>
           <w:rFonts w:ascii="微软雅黑" w:hAnsi="微软雅黑" w:eastAsia="微软雅黑" w:cs="微软雅黑"/>
@@ -11599,7 +11601,7 @@
         <w:pStyle w:val="4"/>
         <w:ind w:firstLine="0"/>
       </w:pPr>
-      <w:bookmarkStart w:id="72" w:name="_Toc8021"/>
+      <w:bookmarkStart w:id="72" w:name="_Toc5300"/>
       <w:r>
         <w:rPr>
           <w:rFonts w:ascii="微软雅黑" w:hAnsi="微软雅黑" w:eastAsia="微软雅黑" w:cs="微软雅黑"/>
@@ -14273,7 +14275,7 @@
         <w:pStyle w:val="4"/>
         <w:ind w:firstLine="0"/>
       </w:pPr>
-      <w:bookmarkStart w:id="73" w:name="_Toc31741"/>
+      <w:bookmarkStart w:id="73" w:name="_Toc14636"/>
       <w:r>
         <w:rPr>
           <w:rFonts w:ascii="微软雅黑" w:hAnsi="微软雅黑" w:eastAsia="微软雅黑" w:cs="微软雅黑"/>
@@ -14376,7 +14378,7 @@
         <w:pStyle w:val="3"/>
         <w:ind w:firstLine="0"/>
       </w:pPr>
-      <w:bookmarkStart w:id="74" w:name="_Toc22639"/>
+      <w:bookmarkStart w:id="74" w:name="_Toc25669"/>
       <w:r>
         <w:rPr>
           <w:rFonts w:ascii="微软雅黑" w:hAnsi="微软雅黑" w:eastAsia="微软雅黑" w:cs="微软雅黑"/>
@@ -14600,7 +14602,7 @@
         <w:pStyle w:val="3"/>
         <w:ind w:firstLine="0"/>
       </w:pPr>
-      <w:bookmarkStart w:id="75" w:name="_Toc10442"/>
+      <w:bookmarkStart w:id="75" w:name="_Toc10539"/>
       <w:r>
         <w:rPr>
           <w:rFonts w:ascii="微软雅黑" w:hAnsi="微软雅黑" w:eastAsia="微软雅黑" w:cs="微软雅黑"/>
@@ -14635,7 +14637,7 @@
         <w:pStyle w:val="3"/>
         <w:ind w:firstLine="0"/>
       </w:pPr>
-      <w:bookmarkStart w:id="76" w:name="_Toc4054"/>
+      <w:bookmarkStart w:id="76" w:name="_Toc6362"/>
       <w:r>
         <w:rPr>
           <w:rFonts w:ascii="微软雅黑" w:hAnsi="微软雅黑" w:eastAsia="微软雅黑" w:cs="微软雅黑"/>
@@ -14653,19 +14655,7 @@
         <w:ind w:hanging="210"/>
       </w:pPr>
       <w:r>
-        <w:rPr>
-          <w:rFonts w:ascii="宋体" w:hAnsi="宋体" w:eastAsia="宋体" w:cs="宋体"/>
-          <w:sz w:val="22"/>
-        </w:rPr>
-        <w:t>MIT 官方上游：</w:t>
-      </w:r>
-      <w:r>
-        <w:rPr>
-          <w:rFonts w:ascii="Consolas" w:hAnsi="Consolas" w:eastAsia="Consolas" w:cs="Consolas"/>
-          <w:color w:val="9C0006"/>
-          <w:sz w:val="19"/>
-        </w:rPr>
-        <w:t>git://g.csail.mit.edu/xv6-labs-2021</w:t>
+        <w:t>项目源码托管地址：https://github.com/xuxiake0/xv6-os-course-project</w:t>
       </w:r>
     </w:p>
     <w:p>
@@ -14678,20 +14668,15 @@
           <w:rFonts w:ascii="宋体" w:hAnsi="宋体" w:eastAsia="宋体" w:cs="宋体"/>
           <w:sz w:val="22"/>
         </w:rPr>
-        <w:t>本地项目：当前 Git 仓库，十个实验分支及实现提交均存在</w:t>
-      </w:r>
-    </w:p>
-    <w:p>
-      <w:pPr>
-        <w:pStyle w:val="16"/>
-        <w:ind w:hanging="210"/>
-      </w:pPr>
-      <w:r>
-        <w:rPr>
-          <w:rFonts w:ascii="宋体" w:hAnsi="宋体" w:eastAsia="宋体" w:cs="宋体"/>
-          <w:sz w:val="22"/>
-        </w:rPr>
-        <w:t>个人项目仓库：尚未配置；创建并推送后写入真实 URL</w:t>
+        <w:t>MIT 官方上游：</w:t>
+      </w:r>
+      <w:r>
+        <w:rPr>
+          <w:rFonts w:ascii="Consolas" w:hAnsi="Consolas" w:eastAsia="Consolas" w:cs="Consolas"/>
+          <w:color w:val="9C0006"/>
+          <w:sz w:val="19"/>
+        </w:rPr>
+        <w:t>git://g.csail.mit.edu/xv6-labs-2021</w:t>
       </w:r>
     </w:p>
     <w:p>
@@ -14699,7 +14684,7 @@
         <w:pStyle w:val="3"/>
         <w:ind w:firstLine="0"/>
       </w:pPr>
-      <w:bookmarkStart w:id="77" w:name="_Toc30406"/>
+      <w:bookmarkStart w:id="77" w:name="_Toc7128"/>
       <w:r>
         <w:rPr>
           <w:rFonts w:ascii="微软雅黑" w:hAnsi="微软雅黑" w:eastAsia="微软雅黑" w:cs="微软雅黑"/>
@@ -15604,7 +15589,7 @@
         <w:pStyle w:val="3"/>
         <w:ind w:firstLine="0"/>
       </w:pPr>
-      <w:bookmarkStart w:id="78" w:name="_Toc16487"/>
+      <w:bookmarkStart w:id="78" w:name="_Toc13611"/>
       <w:r>
         <w:rPr>
           <w:rFonts w:ascii="微软雅黑" w:hAnsi="微软雅黑" w:eastAsia="微软雅黑" w:cs="微软雅黑"/>
@@ -15791,8 +15776,8 @@
       </w:r>
     </w:p>
     <w:sectPr>
-      <w:headerReference r:id="rId5" w:type="default"/>
-      <w:footerReference r:id="rId6" w:type="default"/>
+      <w:headerReference r:id="rId11" w:type="default"/>
+      <w:footerReference r:id="rId12" w:type="default"/>
       <w:pgSz w:w="11906" w:h="16838"/>
       <w:pgMar w:top="1304" w:right="1417" w:bottom="1247" w:left="1417" w:header="737" w:footer="737" w:gutter="0"/>
       <w:pgNumType w:start="1"/>
@@ -15833,6 +15818,36 @@
   <w:p>
     <w:pPr>
       <w:pStyle w:val="24"/>
+    </w:pPr>
+  </w:p>
+</w:ftr>
+</file>
+
+<file path=word/footer2.xml><?xml version="1.0" encoding="utf-8"?>
+<w:ftr xmlns:wpc="http://schemas.microsoft.com/office/word/2010/wordprocessingCanvas" xmlns:mc="http://schemas.openxmlformats.org/markup-compatibility/2006" xmlns:o="urn:schemas-microsoft-com:office:office" xmlns:r="http://schemas.openxmlformats.org/officeDocument/2006/relationships" xmlns:m="http://schemas.openxmlformats.org/officeDocument/2006/math" xmlns:v="urn:schemas-microsoft-com:vml" xmlns:wp14="http://schemas.microsoft.com/office/word/2010/wordprocessingDrawing" xmlns:wp="http://schemas.openxmlformats.org/drawingml/2006/wordprocessingDrawing" xmlns:w10="urn:schemas-microsoft-com:office:word" xmlns:w="http://schemas.openxmlformats.org/wordprocessingml/2006/main" xmlns:w14="http://schemas.microsoft.com/office/word/2010/wordml" xmlns:w15="http://schemas.microsoft.com/office/word/2012/wordml" xmlns:wpg="http://schemas.microsoft.com/office/word/2010/wordprocessingGroup" xmlns:wpi="http://schemas.microsoft.com/office/word/2010/wordprocessingInk" xmlns:wne="http://schemas.microsoft.com/office/word/2006/wordml" xmlns:wps="http://schemas.microsoft.com/office/word/2010/wordprocessingShape" xmlns:wpsCustomData="http://www.wps.cn/officeDocument/2013/wpsCustomData" mc:Ignorable="w14 w15 wp14">
+  <w:p>
+    <w:pPr>
+      <w:pStyle w:val="24"/>
+    </w:pPr>
+  </w:p>
+</w:ftr>
+</file>
+
+<file path=word/footer3.xml><?xml version="1.0" encoding="utf-8"?>
+<w:ftr xmlns:wpc="http://schemas.microsoft.com/office/word/2010/wordprocessingCanvas" xmlns:mc="http://schemas.openxmlformats.org/markup-compatibility/2006" xmlns:o="urn:schemas-microsoft-com:office:office" xmlns:r="http://schemas.openxmlformats.org/officeDocument/2006/relationships" xmlns:m="http://schemas.openxmlformats.org/officeDocument/2006/math" xmlns:v="urn:schemas-microsoft-com:vml" xmlns:wp14="http://schemas.microsoft.com/office/word/2010/wordprocessingDrawing" xmlns:wp="http://schemas.openxmlformats.org/drawingml/2006/wordprocessingDrawing" xmlns:w10="urn:schemas-microsoft-com:office:word" xmlns:w="http://schemas.openxmlformats.org/wordprocessingml/2006/main" xmlns:w14="http://schemas.microsoft.com/office/word/2010/wordml" xmlns:w15="http://schemas.microsoft.com/office/word/2012/wordml" xmlns:wpg="http://schemas.microsoft.com/office/word/2010/wordprocessingGroup" xmlns:wpi="http://schemas.microsoft.com/office/word/2010/wordprocessingInk" xmlns:wne="http://schemas.microsoft.com/office/word/2006/wordml" xmlns:wps="http://schemas.microsoft.com/office/word/2010/wordprocessingShape" xmlns:wpsCustomData="http://www.wps.cn/officeDocument/2013/wpsCustomData" mc:Ignorable="w14 w15 wp14">
+  <w:p>
+    <w:pPr>
+      <w:pStyle w:val="24"/>
+    </w:pPr>
+  </w:p>
+</w:ftr>
+</file>
+
+<file path=word/footer4.xml><?xml version="1.0" encoding="utf-8"?>
+<w:ftr xmlns:wpc="http://schemas.microsoft.com/office/word/2010/wordprocessingCanvas" xmlns:mc="http://schemas.openxmlformats.org/markup-compatibility/2006" xmlns:o="urn:schemas-microsoft-com:office:office" xmlns:r="http://schemas.openxmlformats.org/officeDocument/2006/relationships" xmlns:m="http://schemas.openxmlformats.org/officeDocument/2006/math" xmlns:v="urn:schemas-microsoft-com:vml" xmlns:wp14="http://schemas.microsoft.com/office/word/2010/wordprocessingDrawing" xmlns:wp="http://schemas.openxmlformats.org/drawingml/2006/wordprocessingDrawing" xmlns:w10="urn:schemas-microsoft-com:office:word" xmlns:w="http://schemas.openxmlformats.org/wordprocessingml/2006/main" xmlns:w14="http://schemas.microsoft.com/office/word/2010/wordml" xmlns:w15="http://schemas.microsoft.com/office/word/2012/wordml" xmlns:wpg="http://schemas.microsoft.com/office/word/2010/wordprocessingGroup" xmlns:wpi="http://schemas.microsoft.com/office/word/2010/wordprocessingInk" xmlns:wne="http://schemas.microsoft.com/office/word/2006/wordml" xmlns:wps="http://schemas.microsoft.com/office/word/2010/wordprocessingShape" xmlns:wpsCustomData="http://www.wps.cn/officeDocument/2013/wpsCustomData" mc:Ignorable="w14 w15 wp14">
+  <w:p>
+    <w:pPr>
+      <w:pStyle w:val="24"/>
       <w:jc w:val="right"/>
     </w:pPr>
     <w:r>
@@ -15905,6 +15920,36 @@
 </file>
 
 <file path=word/header1.xml><?xml version="1.0" encoding="utf-8"?>
+<w:hdr xmlns:wpc="http://schemas.microsoft.com/office/word/2010/wordprocessingCanvas" xmlns:mc="http://schemas.openxmlformats.org/markup-compatibility/2006" xmlns:o="urn:schemas-microsoft-com:office:office" xmlns:r="http://schemas.openxmlformats.org/officeDocument/2006/relationships" xmlns:m="http://schemas.openxmlformats.org/officeDocument/2006/math" xmlns:v="urn:schemas-microsoft-com:vml" xmlns:wp14="http://schemas.microsoft.com/office/word/2010/wordprocessingDrawing" xmlns:wp="http://schemas.openxmlformats.org/drawingml/2006/wordprocessingDrawing" xmlns:w10="urn:schemas-microsoft-com:office:word" xmlns:w="http://schemas.openxmlformats.org/wordprocessingml/2006/main" xmlns:w14="http://schemas.microsoft.com/office/word/2010/wordml" xmlns:w15="http://schemas.microsoft.com/office/word/2012/wordml" xmlns:wpg="http://schemas.microsoft.com/office/word/2010/wordprocessingGroup" xmlns:wpi="http://schemas.microsoft.com/office/word/2010/wordprocessingInk" xmlns:wne="http://schemas.microsoft.com/office/word/2006/wordml" xmlns:wps="http://schemas.microsoft.com/office/word/2010/wordprocessingShape" xmlns:wpsCustomData="http://www.wps.cn/officeDocument/2013/wpsCustomData" mc:Ignorable="w14 w15 wp14">
+  <w:p>
+    <w:pPr>
+      <w:pStyle w:val="25"/>
+    </w:pPr>
+  </w:p>
+</w:hdr>
+</file>
+
+<file path=word/header2.xml><?xml version="1.0" encoding="utf-8"?>
+<w:hdr xmlns:wpc="http://schemas.microsoft.com/office/word/2010/wordprocessingCanvas" xmlns:mc="http://schemas.openxmlformats.org/markup-compatibility/2006" xmlns:o="urn:schemas-microsoft-com:office:office" xmlns:r="http://schemas.openxmlformats.org/officeDocument/2006/relationships" xmlns:m="http://schemas.openxmlformats.org/officeDocument/2006/math" xmlns:v="urn:schemas-microsoft-com:vml" xmlns:wp14="http://schemas.microsoft.com/office/word/2010/wordprocessingDrawing" xmlns:wp="http://schemas.openxmlformats.org/drawingml/2006/wordprocessingDrawing" xmlns:w10="urn:schemas-microsoft-com:office:word" xmlns:w="http://schemas.openxmlformats.org/wordprocessingml/2006/main" xmlns:w14="http://schemas.microsoft.com/office/word/2010/wordml" xmlns:w15="http://schemas.microsoft.com/office/word/2012/wordml" xmlns:wpg="http://schemas.microsoft.com/office/word/2010/wordprocessingGroup" xmlns:wpi="http://schemas.microsoft.com/office/word/2010/wordprocessingInk" xmlns:wne="http://schemas.microsoft.com/office/word/2006/wordml" xmlns:wps="http://schemas.microsoft.com/office/word/2010/wordprocessingShape" xmlns:wpsCustomData="http://www.wps.cn/officeDocument/2013/wpsCustomData" mc:Ignorable="w14 w15 wp14">
+  <w:p>
+    <w:pPr>
+      <w:pStyle w:val="25"/>
+    </w:pPr>
+  </w:p>
+</w:hdr>
+</file>
+
+<file path=word/header3.xml><?xml version="1.0" encoding="utf-8"?>
+<w:hdr xmlns:wpc="http://schemas.microsoft.com/office/word/2010/wordprocessingCanvas" xmlns:mc="http://schemas.openxmlformats.org/markup-compatibility/2006" xmlns:o="urn:schemas-microsoft-com:office:office" xmlns:r="http://schemas.openxmlformats.org/officeDocument/2006/relationships" xmlns:m="http://schemas.openxmlformats.org/officeDocument/2006/math" xmlns:v="urn:schemas-microsoft-com:vml" xmlns:wp14="http://schemas.microsoft.com/office/word/2010/wordprocessingDrawing" xmlns:wp="http://schemas.openxmlformats.org/drawingml/2006/wordprocessingDrawing" xmlns:w10="urn:schemas-microsoft-com:office:word" xmlns:w="http://schemas.openxmlformats.org/wordprocessingml/2006/main" xmlns:w14="http://schemas.microsoft.com/office/word/2010/wordml" xmlns:w15="http://schemas.microsoft.com/office/word/2012/wordml" xmlns:wpg="http://schemas.microsoft.com/office/word/2010/wordprocessingGroup" xmlns:wpi="http://schemas.microsoft.com/office/word/2010/wordprocessingInk" xmlns:wne="http://schemas.microsoft.com/office/word/2006/wordml" xmlns:wps="http://schemas.microsoft.com/office/word/2010/wordprocessingShape" xmlns:wpsCustomData="http://www.wps.cn/officeDocument/2013/wpsCustomData" mc:Ignorable="w14 w15 wp14">
+  <w:p>
+    <w:pPr>
+      <w:pStyle w:val="25"/>
+    </w:pPr>
+  </w:p>
+</w:hdr>
+</file>
+
+<file path=word/header4.xml><?xml version="1.0" encoding="utf-8"?>
 <w:hdr xmlns:wpc="http://schemas.microsoft.com/office/word/2010/wordprocessingCanvas" xmlns:mc="http://schemas.openxmlformats.org/markup-compatibility/2006" xmlns:o="urn:schemas-microsoft-com:office:office" xmlns:r="http://schemas.openxmlformats.org/officeDocument/2006/relationships" xmlns:m="http://schemas.openxmlformats.org/officeDocument/2006/math" xmlns:v="urn:schemas-microsoft-com:vml" xmlns:wp14="http://schemas.microsoft.com/office/word/2010/wordprocessingDrawing" xmlns:wp="http://schemas.openxmlformats.org/drawingml/2006/wordprocessingDrawing" xmlns:w10="urn:schemas-microsoft-com:office:word" xmlns:w="http://schemas.openxmlformats.org/wordprocessingml/2006/main" xmlns:w14="http://schemas.microsoft.com/office/word/2010/wordml" xmlns:w15="http://schemas.microsoft.com/office/word/2012/wordml" xmlns:wpg="http://schemas.microsoft.com/office/word/2010/wordprocessingGroup" xmlns:wpi="http://schemas.microsoft.com/office/word/2010/wordprocessingInk" xmlns:wne="http://schemas.microsoft.com/office/word/2006/wordml" xmlns:wps="http://schemas.microsoft.com/office/word/2010/wordprocessingShape" xmlns:wpsCustomData="http://www.wps.cn/officeDocument/2013/wpsCustomData" mc:Ignorable="w14 w15 wp14">
   <w:p>
     <w:pPr>
@@ -16106,8 +16151,8 @@
     <w:lsdException w:uiPriority="99" w:name="Normal Indent"/>
     <w:lsdException w:uiPriority="99" w:name="footnote text"/>
     <w:lsdException w:uiPriority="99" w:name="annotation text"/>
-    <w:lsdException w:qFormat="1" w:uiPriority="99" w:semiHidden="0" w:name="header"/>
-    <w:lsdException w:qFormat="1" w:uiPriority="99" w:semiHidden="0" w:name="footer"/>
+    <w:lsdException w:uiPriority="99" w:semiHidden="0" w:name="header"/>
+    <w:lsdException w:uiPriority="99" w:semiHidden="0" w:name="footer"/>
     <w:lsdException w:uiPriority="99" w:name="index heading"/>
     <w:lsdException w:qFormat="1" w:uiPriority="35" w:name="caption"/>
     <w:lsdException w:uiPriority="99" w:name="table of figures"/>
@@ -16123,14 +16168,14 @@
     <w:lsdException w:uiPriority="99" w:semiHidden="0" w:name="macro"/>
     <w:lsdException w:uiPriority="99" w:name="toa heading"/>
     <w:lsdException w:uiPriority="99" w:semiHidden="0" w:name="List"/>
-    <w:lsdException w:uiPriority="99" w:semiHidden="0" w:name="List Bullet"/>
+    <w:lsdException w:qFormat="1" w:uiPriority="99" w:semiHidden="0" w:name="List Bullet"/>
     <w:lsdException w:uiPriority="99" w:semiHidden="0" w:name="List Number"/>
     <w:lsdException w:uiPriority="99" w:semiHidden="0" w:name="List 2"/>
     <w:lsdException w:uiPriority="99" w:semiHidden="0" w:name="List 3"/>
     <w:lsdException w:uiPriority="99" w:name="List 4"/>
     <w:lsdException w:uiPriority="99" w:name="List 5"/>
     <w:lsdException w:uiPriority="99" w:semiHidden="0" w:name="List Bullet 2"/>
-    <w:lsdException w:uiPriority="99" w:semiHidden="0" w:name="List Bullet 3"/>
+    <w:lsdException w:qFormat="1" w:uiPriority="99" w:semiHidden="0" w:name="List Bullet 3"/>
     <w:lsdException w:uiPriority="99" w:name="List Bullet 4"/>
     <w:lsdException w:uiPriority="99" w:name="List Bullet 5"/>
     <w:lsdException w:uiPriority="99" w:semiHidden="0" w:name="List Number 2"/>
@@ -16144,7 +16189,7 @@
     <w:lsdException w:uiPriority="99" w:semiHidden="0" w:name="Body Text"/>
     <w:lsdException w:uiPriority="99" w:name="Body Text Indent"/>
     <w:lsdException w:uiPriority="99" w:semiHidden="0" w:name="List Continue"/>
-    <w:lsdException w:uiPriority="99" w:semiHidden="0" w:name="List Continue 2"/>
+    <w:lsdException w:qFormat="1" w:uiPriority="99" w:semiHidden="0" w:name="List Continue 2"/>
     <w:lsdException w:uiPriority="99" w:semiHidden="0" w:name="List Continue 3"/>
     <w:lsdException w:uiPriority="99" w:name="List Continue 4"/>
     <w:lsdException w:uiPriority="99" w:name="List Continue 5"/>
@@ -16229,7 +16274,7 @@
     <w:lsdException w:unhideWhenUsed="0" w:uiPriority="60" w:semiHidden="0" w:name="Light Shading"/>
     <w:lsdException w:unhideWhenUsed="0" w:uiPriority="61" w:semiHidden="0" w:name="Light List"/>
     <w:lsdException w:unhideWhenUsed="0" w:uiPriority="62" w:semiHidden="0" w:name="Light Grid"/>
-    <w:lsdException w:unhideWhenUsed="0" w:uiPriority="63" w:semiHidden="0" w:name="Medium Shading 1"/>
+    <w:lsdException w:qFormat="1" w:unhideWhenUsed="0" w:uiPriority="63" w:semiHidden="0" w:name="Medium Shading 1"/>
     <w:lsdException w:unhideWhenUsed="0" w:uiPriority="64" w:semiHidden="0" w:name="Medium Shading 2"/>
     <w:lsdException w:unhideWhenUsed="0" w:uiPriority="65" w:semiHidden="0" w:name="Medium List 1"/>
     <w:lsdException w:unhideWhenUsed="0" w:uiPriority="66" w:semiHidden="0" w:name="Medium List 2"/>
@@ -16242,31 +16287,31 @@
     <w:lsdException w:qFormat="1" w:unhideWhenUsed="0" w:uiPriority="73" w:semiHidden="0" w:name="Colorful Grid"/>
     <w:lsdException w:unhideWhenUsed="0" w:uiPriority="60" w:semiHidden="0" w:name="Light Shading Accent 1"/>
     <w:lsdException w:unhideWhenUsed="0" w:uiPriority="61" w:semiHidden="0" w:name="Light List Accent 1"/>
-    <w:lsdException w:unhideWhenUsed="0" w:uiPriority="62" w:semiHidden="0" w:name="Light Grid Accent 1"/>
+    <w:lsdException w:qFormat="1" w:unhideWhenUsed="0" w:uiPriority="62" w:semiHidden="0" w:name="Light Grid Accent 1"/>
     <w:lsdException w:unhideWhenUsed="0" w:uiPriority="63" w:semiHidden="0" w:name="Medium Shading 1 Accent 1"/>
-    <w:lsdException w:qFormat="1" w:unhideWhenUsed="0" w:uiPriority="64" w:semiHidden="0" w:name="Medium Shading 2 Accent 1"/>
+    <w:lsdException w:unhideWhenUsed="0" w:uiPriority="64" w:semiHidden="0" w:name="Medium Shading 2 Accent 1"/>
     <w:lsdException w:unhideWhenUsed="0" w:uiPriority="65" w:semiHidden="0" w:name="Medium List 1 Accent 1"/>
     <w:lsdException w:qFormat="1" w:unhideWhenUsed="0" w:uiPriority="34" w:semiHidden="0" w:name="List Paragraph"/>
     <w:lsdException w:qFormat="1" w:unhideWhenUsed="0" w:uiPriority="29" w:semiHidden="0" w:name="Quote"/>
     <w:lsdException w:qFormat="1" w:unhideWhenUsed="0" w:uiPriority="30" w:semiHidden="0" w:name="Intense Quote"/>
-    <w:lsdException w:unhideWhenUsed="0" w:uiPriority="66" w:semiHidden="0" w:name="Medium List 2 Accent 1"/>
+    <w:lsdException w:qFormat="1" w:unhideWhenUsed="0" w:uiPriority="66" w:semiHidden="0" w:name="Medium List 2 Accent 1"/>
     <w:lsdException w:unhideWhenUsed="0" w:uiPriority="67" w:semiHidden="0" w:name="Medium Grid 1 Accent 1"/>
     <w:lsdException w:unhideWhenUsed="0" w:uiPriority="68" w:semiHidden="0" w:name="Medium Grid 2 Accent 1"/>
-    <w:lsdException w:unhideWhenUsed="0" w:uiPriority="69" w:semiHidden="0" w:name="Medium Grid 3 Accent 1"/>
+    <w:lsdException w:qFormat="1" w:unhideWhenUsed="0" w:uiPriority="69" w:semiHidden="0" w:name="Medium Grid 3 Accent 1"/>
     <w:lsdException w:unhideWhenUsed="0" w:uiPriority="70" w:semiHidden="0" w:name="Dark List Accent 1"/>
     <w:lsdException w:unhideWhenUsed="0" w:uiPriority="71" w:semiHidden="0" w:name="Colorful Shading Accent 1"/>
-    <w:lsdException w:qFormat="1" w:unhideWhenUsed="0" w:uiPriority="72" w:semiHidden="0" w:name="Colorful List Accent 1"/>
+    <w:lsdException w:unhideWhenUsed="0" w:uiPriority="72" w:semiHidden="0" w:name="Colorful List Accent 1"/>
     <w:lsdException w:unhideWhenUsed="0" w:uiPriority="73" w:semiHidden="0" w:name="Colorful Grid Accent 1"/>
     <w:lsdException w:unhideWhenUsed="0" w:uiPriority="60" w:semiHidden="0" w:name="Light Shading Accent 2"/>
     <w:lsdException w:unhideWhenUsed="0" w:uiPriority="61" w:semiHidden="0" w:name="Light List Accent 2"/>
     <w:lsdException w:unhideWhenUsed="0" w:uiPriority="62" w:semiHidden="0" w:name="Light Grid Accent 2"/>
-    <w:lsdException w:unhideWhenUsed="0" w:uiPriority="63" w:semiHidden="0" w:name="Medium Shading 1 Accent 2"/>
+    <w:lsdException w:qFormat="1" w:unhideWhenUsed="0" w:uiPriority="63" w:semiHidden="0" w:name="Medium Shading 1 Accent 2"/>
     <w:lsdException w:unhideWhenUsed="0" w:uiPriority="64" w:semiHidden="0" w:name="Medium Shading 2 Accent 2"/>
     <w:lsdException w:unhideWhenUsed="0" w:uiPriority="65" w:semiHidden="0" w:name="Medium List 1 Accent 2"/>
     <w:lsdException w:unhideWhenUsed="0" w:uiPriority="66" w:semiHidden="0" w:name="Medium List 2 Accent 2"/>
     <w:lsdException w:unhideWhenUsed="0" w:uiPriority="67" w:semiHidden="0" w:name="Medium Grid 1 Accent 2"/>
     <w:lsdException w:unhideWhenUsed="0" w:uiPriority="68" w:semiHidden="0" w:name="Medium Grid 2 Accent 2"/>
-    <w:lsdException w:unhideWhenUsed="0" w:uiPriority="69" w:semiHidden="0" w:name="Medium Grid 3 Accent 2"/>
+    <w:lsdException w:qFormat="1" w:unhideWhenUsed="0" w:uiPriority="69" w:semiHidden="0" w:name="Medium Grid 3 Accent 2"/>
     <w:lsdException w:unhideWhenUsed="0" w:uiPriority="70" w:semiHidden="0" w:name="Dark List Accent 2"/>
     <w:lsdException w:unhideWhenUsed="0" w:uiPriority="71" w:semiHidden="0" w:name="Colorful Shading Accent 2"/>
     <w:lsdException w:unhideWhenUsed="0" w:uiPriority="72" w:semiHidden="0" w:name="Colorful List Accent 2"/>
@@ -16274,58 +16319,58 @@
     <w:lsdException w:unhideWhenUsed="0" w:uiPriority="60" w:semiHidden="0" w:name="Light Shading Accent 3"/>
     <w:lsdException w:unhideWhenUsed="0" w:uiPriority="61" w:semiHidden="0" w:name="Light List Accent 3"/>
     <w:lsdException w:unhideWhenUsed="0" w:uiPriority="62" w:semiHidden="0" w:name="Light Grid Accent 3"/>
-    <w:lsdException w:unhideWhenUsed="0" w:uiPriority="63" w:semiHidden="0" w:name="Medium Shading 1 Accent 3"/>
+    <w:lsdException w:qFormat="1" w:unhideWhenUsed="0" w:uiPriority="63" w:semiHidden="0" w:name="Medium Shading 1 Accent 3"/>
     <w:lsdException w:unhideWhenUsed="0" w:uiPriority="64" w:semiHidden="0" w:name="Medium Shading 2 Accent 3"/>
     <w:lsdException w:unhideWhenUsed="0" w:uiPriority="65" w:semiHidden="0" w:name="Medium List 1 Accent 3"/>
     <w:lsdException w:unhideWhenUsed="0" w:uiPriority="66" w:semiHidden="0" w:name="Medium List 2 Accent 3"/>
     <w:lsdException w:unhideWhenUsed="0" w:uiPriority="67" w:semiHidden="0" w:name="Medium Grid 1 Accent 3"/>
     <w:lsdException w:unhideWhenUsed="0" w:uiPriority="68" w:semiHidden="0" w:name="Medium Grid 2 Accent 3"/>
-    <w:lsdException w:qFormat="1" w:unhideWhenUsed="0" w:uiPriority="69" w:semiHidden="0" w:name="Medium Grid 3 Accent 3"/>
+    <w:lsdException w:unhideWhenUsed="0" w:uiPriority="69" w:semiHidden="0" w:name="Medium Grid 3 Accent 3"/>
     <w:lsdException w:unhideWhenUsed="0" w:uiPriority="70" w:semiHidden="0" w:name="Dark List Accent 3"/>
     <w:lsdException w:qFormat="1" w:unhideWhenUsed="0" w:uiPriority="71" w:semiHidden="0" w:name="Colorful Shading Accent 3"/>
-    <w:lsdException w:qFormat="1" w:unhideWhenUsed="0" w:uiPriority="72" w:semiHidden="0" w:name="Colorful List Accent 3"/>
-    <w:lsdException w:qFormat="1" w:unhideWhenUsed="0" w:uiPriority="73" w:semiHidden="0" w:name="Colorful Grid Accent 3"/>
+    <w:lsdException w:unhideWhenUsed="0" w:uiPriority="72" w:semiHidden="0" w:name="Colorful List Accent 3"/>
+    <w:lsdException w:unhideWhenUsed="0" w:uiPriority="73" w:semiHidden="0" w:name="Colorful Grid Accent 3"/>
     <w:lsdException w:unhideWhenUsed="0" w:uiPriority="60" w:semiHidden="0" w:name="Light Shading Accent 4"/>
-    <w:lsdException w:unhideWhenUsed="0" w:uiPriority="61" w:semiHidden="0" w:name="Light List Accent 4"/>
+    <w:lsdException w:qFormat="1" w:unhideWhenUsed="0" w:uiPriority="61" w:semiHidden="0" w:name="Light List Accent 4"/>
     <w:lsdException w:unhideWhenUsed="0" w:uiPriority="62" w:semiHidden="0" w:name="Light Grid Accent 4"/>
     <w:lsdException w:unhideWhenUsed="0" w:uiPriority="63" w:semiHidden="0" w:name="Medium Shading 1 Accent 4"/>
-    <w:lsdException w:unhideWhenUsed="0" w:uiPriority="64" w:semiHidden="0" w:name="Medium Shading 2 Accent 4"/>
+    <w:lsdException w:qFormat="1" w:unhideWhenUsed="0" w:uiPriority="64" w:semiHidden="0" w:name="Medium Shading 2 Accent 4"/>
     <w:lsdException w:unhideWhenUsed="0" w:uiPriority="65" w:semiHidden="0" w:name="Medium List 1 Accent 4"/>
     <w:lsdException w:unhideWhenUsed="0" w:uiPriority="66" w:semiHidden="0" w:name="Medium List 2 Accent 4"/>
     <w:lsdException w:unhideWhenUsed="0" w:uiPriority="67" w:semiHidden="0" w:name="Medium Grid 1 Accent 4"/>
-    <w:lsdException w:unhideWhenUsed="0" w:uiPriority="68" w:semiHidden="0" w:name="Medium Grid 2 Accent 4"/>
-    <w:lsdException w:qFormat="1" w:unhideWhenUsed="0" w:uiPriority="69" w:semiHidden="0" w:name="Medium Grid 3 Accent 4"/>
+    <w:lsdException w:qFormat="1" w:unhideWhenUsed="0" w:uiPriority="68" w:semiHidden="0" w:name="Medium Grid 2 Accent 4"/>
+    <w:lsdException w:unhideWhenUsed="0" w:uiPriority="69" w:semiHidden="0" w:name="Medium Grid 3 Accent 4"/>
     <w:lsdException w:unhideWhenUsed="0" w:uiPriority="70" w:semiHidden="0" w:name="Dark List Accent 4"/>
     <w:lsdException w:unhideWhenUsed="0" w:uiPriority="71" w:semiHidden="0" w:name="Colorful Shading Accent 4"/>
-    <w:lsdException w:qFormat="1" w:unhideWhenUsed="0" w:uiPriority="72" w:semiHidden="0" w:name="Colorful List Accent 4"/>
+    <w:lsdException w:unhideWhenUsed="0" w:uiPriority="72" w:semiHidden="0" w:name="Colorful List Accent 4"/>
     <w:lsdException w:unhideWhenUsed="0" w:uiPriority="73" w:semiHidden="0" w:name="Colorful Grid Accent 4"/>
     <w:lsdException w:unhideWhenUsed="0" w:uiPriority="60" w:semiHidden="0" w:name="Light Shading Accent 5"/>
     <w:lsdException w:unhideWhenUsed="0" w:uiPriority="61" w:semiHidden="0" w:name="Light List Accent 5"/>
     <w:lsdException w:unhideWhenUsed="0" w:uiPriority="62" w:semiHidden="0" w:name="Light Grid Accent 5"/>
-    <w:lsdException w:qFormat="1" w:unhideWhenUsed="0" w:uiPriority="63" w:semiHidden="0" w:name="Medium Shading 1 Accent 5"/>
+    <w:lsdException w:unhideWhenUsed="0" w:uiPriority="63" w:semiHidden="0" w:name="Medium Shading 1 Accent 5"/>
     <w:lsdException w:unhideWhenUsed="0" w:uiPriority="64" w:semiHidden="0" w:name="Medium Shading 2 Accent 5"/>
-    <w:lsdException w:unhideWhenUsed="0" w:uiPriority="65" w:semiHidden="0" w:name="Medium List 1 Accent 5"/>
+    <w:lsdException w:qFormat="1" w:unhideWhenUsed="0" w:uiPriority="65" w:semiHidden="0" w:name="Medium List 1 Accent 5"/>
     <w:lsdException w:unhideWhenUsed="0" w:uiPriority="66" w:semiHidden="0" w:name="Medium List 2 Accent 5"/>
     <w:lsdException w:unhideWhenUsed="0" w:uiPriority="67" w:semiHidden="0" w:name="Medium Grid 1 Accent 5"/>
     <w:lsdException w:unhideWhenUsed="0" w:uiPriority="68" w:semiHidden="0" w:name="Medium Grid 2 Accent 5"/>
     <w:lsdException w:unhideWhenUsed="0" w:uiPriority="69" w:semiHidden="0" w:name="Medium Grid 3 Accent 5"/>
     <w:lsdException w:unhideWhenUsed="0" w:uiPriority="70" w:semiHidden="0" w:name="Dark List Accent 5"/>
     <w:lsdException w:unhideWhenUsed="0" w:uiPriority="71" w:semiHidden="0" w:name="Colorful Shading Accent 5"/>
-    <w:lsdException w:unhideWhenUsed="0" w:uiPriority="72" w:semiHidden="0" w:name="Colorful List Accent 5"/>
+    <w:lsdException w:qFormat="1" w:unhideWhenUsed="0" w:uiPriority="72" w:semiHidden="0" w:name="Colorful List Accent 5"/>
     <w:lsdException w:unhideWhenUsed="0" w:uiPriority="73" w:semiHidden="0" w:name="Colorful Grid Accent 5"/>
     <w:lsdException w:unhideWhenUsed="0" w:uiPriority="60" w:semiHidden="0" w:name="Light Shading Accent 6"/>
     <w:lsdException w:unhideWhenUsed="0" w:uiPriority="61" w:semiHidden="0" w:name="Light List Accent 6"/>
-    <w:lsdException w:unhideWhenUsed="0" w:uiPriority="62" w:semiHidden="0" w:name="Light Grid Accent 6"/>
+    <w:lsdException w:qFormat="1" w:unhideWhenUsed="0" w:uiPriority="62" w:semiHidden="0" w:name="Light Grid Accent 6"/>
     <w:lsdException w:unhideWhenUsed="0" w:uiPriority="63" w:semiHidden="0" w:name="Medium Shading 1 Accent 6"/>
     <w:lsdException w:unhideWhenUsed="0" w:uiPriority="64" w:semiHidden="0" w:name="Medium Shading 2 Accent 6"/>
     <w:lsdException w:unhideWhenUsed="0" w:uiPriority="65" w:semiHidden="0" w:name="Medium List 1 Accent 6"/>
     <w:lsdException w:unhideWhenUsed="0" w:uiPriority="66" w:semiHidden="0" w:name="Medium List 2 Accent 6"/>
     <w:lsdException w:unhideWhenUsed="0" w:uiPriority="67" w:semiHidden="0" w:name="Medium Grid 1 Accent 6"/>
     <w:lsdException w:unhideWhenUsed="0" w:uiPriority="68" w:semiHidden="0" w:name="Medium Grid 2 Accent 6"/>
-    <w:lsdException w:unhideWhenUsed="0" w:uiPriority="69" w:semiHidden="0" w:name="Medium Grid 3 Accent 6"/>
+    <w:lsdException w:qFormat="1" w:unhideWhenUsed="0" w:uiPriority="69" w:semiHidden="0" w:name="Medium Grid 3 Accent 6"/>
     <w:lsdException w:unhideWhenUsed="0" w:uiPriority="70" w:semiHidden="0" w:name="Dark List Accent 6"/>
     <w:lsdException w:unhideWhenUsed="0" w:uiPriority="71" w:semiHidden="0" w:name="Colorful Shading Accent 6"/>
-    <w:lsdException w:qFormat="1" w:unhideWhenUsed="0" w:uiPriority="72" w:semiHidden="0" w:name="Colorful List Accent 6"/>
+    <w:lsdException w:unhideWhenUsed="0" w:uiPriority="72" w:semiHidden="0" w:name="Colorful List Accent 6"/>
     <w:lsdException w:unhideWhenUsed="0" w:uiPriority="73" w:semiHidden="0" w:name="Colorful Grid Accent 6"/>
   </w:latentStyles>
   <w:style w:type="paragraph" w:default="1" w:styleId="1">
@@ -16688,6 +16733,7 @@
     <w:name w:val="List Bullet"/>
     <w:basedOn w:val="1"/>
     <w:unhideWhenUsed/>
+    <w:qFormat/>
     <w:uiPriority w:val="99"/>
     <w:pPr>
       <w:numPr>
@@ -16721,6 +16767,7 @@
     <w:name w:val="List Bullet 3"/>
     <w:basedOn w:val="1"/>
     <w:unhideWhenUsed/>
+    <w:qFormat/>
     <w:uiPriority w:val="99"/>
     <w:pPr>
       <w:numPr>
@@ -16792,7 +16839,6 @@
     <w:basedOn w:val="1"/>
     <w:link w:val="138"/>
     <w:unhideWhenUsed/>
-    <w:qFormat/>
     <w:uiPriority w:val="99"/>
     <w:pPr>
       <w:tabs>
@@ -16807,7 +16853,6 @@
     <w:basedOn w:val="1"/>
     <w:link w:val="137"/>
     <w:unhideWhenUsed/>
-    <w:qFormat/>
     <w:uiPriority w:val="99"/>
     <w:pPr>
       <w:tabs>
@@ -16882,6 +16927,7 @@
     <w:name w:val="List Continue 2"/>
     <w:basedOn w:val="1"/>
     <w:unhideWhenUsed/>
+    <w:qFormat/>
     <w:uiPriority w:val="99"/>
     <w:pPr>
       <w:spacing w:after="120"/>
@@ -18015,6 +18061,7 @@
   <w:style w:type="table" w:styleId="47">
     <w:name w:val="Light List Accent 4"/>
     <w:basedOn w:val="34"/>
+    <w:qFormat/>
     <w:uiPriority w:val="61"/>
     <w:pPr>
       <w:spacing w:after="0" w:line="240" w:lineRule="auto"/>
@@ -18420,6 +18467,7 @@
   <w:style w:type="table" w:styleId="51">
     <w:name w:val="Light Grid Accent 1"/>
     <w:basedOn w:val="34"/>
+    <w:qFormat/>
     <w:uiPriority w:val="62"/>
     <w:pPr>
       <w:spacing w:after="0" w:line="240" w:lineRule="auto"/>
@@ -19050,6 +19098,7 @@
   <w:style w:type="table" w:styleId="56">
     <w:name w:val="Light Grid Accent 6"/>
     <w:basedOn w:val="34"/>
+    <w:qFormat/>
     <w:uiPriority w:val="62"/>
     <w:pPr>
       <w:spacing w:after="0" w:line="240" w:lineRule="auto"/>
@@ -19176,6 +19225,7 @@
   <w:style w:type="table" w:styleId="57">
     <w:name w:val="Medium Shading 1"/>
     <w:basedOn w:val="34"/>
+    <w:qFormat/>
     <w:uiPriority w:val="63"/>
     <w:pPr>
       <w:spacing w:after="0" w:line="240" w:lineRule="auto"/>
@@ -19390,6 +19440,7 @@
   <w:style w:type="table" w:styleId="59">
     <w:name w:val="Medium Shading 1 Accent 2"/>
     <w:basedOn w:val="34"/>
+    <w:qFormat/>
     <w:uiPriority w:val="63"/>
     <w:pPr>
       <w:spacing w:after="0" w:line="240" w:lineRule="auto"/>
@@ -19497,6 +19548,7 @@
   <w:style w:type="table" w:styleId="60">
     <w:name w:val="Medium Shading 1 Accent 3"/>
     <w:basedOn w:val="34"/>
+    <w:qFormat/>
     <w:uiPriority w:val="63"/>
     <w:pPr>
       <w:spacing w:after="0" w:line="240" w:lineRule="auto"/>
@@ -19711,7 +19763,6 @@
   <w:style w:type="table" w:styleId="62">
     <w:name w:val="Medium Shading 1 Accent 5"/>
     <w:basedOn w:val="34"/>
-    <w:qFormat/>
     <w:uiPriority w:val="63"/>
     <w:pPr>
       <w:spacing w:after="0" w:line="240" w:lineRule="auto"/>
@@ -20091,7 +20142,6 @@
   <w:style w:type="table" w:styleId="65">
     <w:name w:val="Medium Shading 2 Accent 1"/>
     <w:basedOn w:val="34"/>
-    <w:qFormat/>
     <w:uiPriority w:val="64"/>
     <w:pPr>
       <w:spacing w:after="0" w:line="240" w:lineRule="auto"/>
@@ -20587,6 +20637,7 @@
   <w:style w:type="table" w:styleId="68">
     <w:name w:val="Medium Shading 2 Accent 4"/>
     <w:basedOn w:val="34"/>
+    <w:qFormat/>
     <w:uiPriority w:val="64"/>
     <w:pPr>
       <w:spacing w:after="0" w:line="240" w:lineRule="auto"/>
@@ -21532,6 +21583,7 @@
   <w:style w:type="table" w:styleId="76">
     <w:name w:val="Medium List 1 Accent 5"/>
     <w:basedOn w:val="34"/>
+    <w:qFormat/>
     <w:uiPriority w:val="65"/>
     <w:pPr>
       <w:spacing w:after="0" w:line="240" w:lineRule="auto"/>
@@ -21841,6 +21893,7 @@
   <w:style w:type="table" w:styleId="79">
     <w:name w:val="Medium List 2 Accent 1"/>
     <w:basedOn w:val="34"/>
+    <w:qFormat/>
     <w:uiPriority w:val="66"/>
     <w:pPr>
       <w:spacing w:after="0" w:line="240" w:lineRule="auto"/>
@@ -23682,6 +23735,7 @@
   <w:style w:type="table" w:styleId="96">
     <w:name w:val="Medium Grid 2 Accent 4"/>
     <w:basedOn w:val="34"/>
+    <w:qFormat/>
     <w:uiPriority w:val="68"/>
     <w:pPr>
       <w:spacing w:after="0" w:line="240" w:lineRule="auto"/>
@@ -24277,6 +24331,7 @@
   <w:style w:type="table" w:styleId="100">
     <w:name w:val="Medium Grid 3 Accent 1"/>
     <w:basedOn w:val="34"/>
+    <w:qFormat/>
     <w:uiPriority w:val="69"/>
     <w:pPr>
       <w:spacing w:after="0" w:line="240" w:lineRule="auto"/>
@@ -24434,6 +24489,7 @@
   <w:style w:type="table" w:styleId="101">
     <w:name w:val="Medium Grid 3 Accent 2"/>
     <w:basedOn w:val="34"/>
+    <w:qFormat/>
     <w:uiPriority w:val="69"/>
     <w:pPr>
       <w:spacing w:after="0" w:line="240" w:lineRule="auto"/>
@@ -24591,7 +24647,6 @@
   <w:style w:type="table" w:styleId="102">
     <w:name w:val="Medium Grid 3 Accent 3"/>
     <w:basedOn w:val="34"/>
-    <w:qFormat/>
     <w:uiPriority w:val="69"/>
     <w:pPr>
       <w:spacing w:after="0" w:line="240" w:lineRule="auto"/>
@@ -24749,7 +24804,6 @@
   <w:style w:type="table" w:styleId="103">
     <w:name w:val="Medium Grid 3 Accent 4"/>
     <w:basedOn w:val="34"/>
-    <w:qFormat/>
     <w:uiPriority w:val="69"/>
     <w:pPr>
       <w:spacing w:after="0" w:line="240" w:lineRule="auto"/>
@@ -25064,6 +25118,7 @@
   <w:style w:type="table" w:styleId="105">
     <w:name w:val="Medium Grid 3 Accent 6"/>
     <w:basedOn w:val="34"/>
+    <w:qFormat/>
     <w:uiPriority w:val="69"/>
     <w:pPr>
       <w:spacing w:after="0" w:line="240" w:lineRule="auto"/>
@@ -27135,7 +27190,6 @@
   <w:style w:type="table" w:styleId="121">
     <w:name w:val="Colorful List Accent 1"/>
     <w:basedOn w:val="34"/>
-    <w:qFormat/>
     <w:uiPriority w:val="72"/>
     <w:pPr>
       <w:spacing w:after="0" w:line="240" w:lineRule="auto"/>
@@ -27320,7 +27374,6 @@
   <w:style w:type="table" w:styleId="123">
     <w:name w:val="Colorful List Accent 3"/>
     <w:basedOn w:val="34"/>
-    <w:qFormat/>
     <w:uiPriority w:val="72"/>
     <w:pPr>
       <w:spacing w:after="0" w:line="240" w:lineRule="auto"/>
@@ -27413,7 +27466,6 @@
   <w:style w:type="table" w:styleId="124">
     <w:name w:val="Colorful List Accent 4"/>
     <w:basedOn w:val="34"/>
-    <w:qFormat/>
     <w:uiPriority w:val="72"/>
     <w:pPr>
       <w:spacing w:after="0" w:line="240" w:lineRule="auto"/>
@@ -27506,6 +27558,7 @@
   <w:style w:type="table" w:styleId="125">
     <w:name w:val="Colorful List Accent 5"/>
     <w:basedOn w:val="34"/>
+    <w:qFormat/>
     <w:uiPriority w:val="72"/>
     <w:pPr>
       <w:spacing w:after="0" w:line="240" w:lineRule="auto"/>
@@ -27598,7 +27651,6 @@
   <w:style w:type="table" w:styleId="126">
     <w:name w:val="Colorful List Accent 6"/>
     <w:basedOn w:val="34"/>
-    <w:qFormat/>
     <w:uiPriority w:val="72"/>
     <w:pPr>
       <w:spacing w:after="0" w:line="240" w:lineRule="auto"/>
@@ -27980,7 +28032,6 @@
   <w:style w:type="table" w:styleId="130">
     <w:name w:val="Colorful Grid Accent 3"/>
     <w:basedOn w:val="34"/>
-    <w:qFormat/>
     <w:uiPriority w:val="73"/>
     <w:pPr>
       <w:spacing w:after="0" w:line="240" w:lineRule="auto"/>
@@ -28392,7 +28443,6 @@
     <w:name w:val="Footer Char"/>
     <w:basedOn w:val="134"/>
     <w:link w:val="24"/>
-    <w:qFormat/>
     <w:uiPriority w:val="99"/>
   </w:style>
   <w:style w:type="paragraph" w:styleId="139">
@@ -28413,7 +28463,6 @@
     <w:name w:val="Heading 1 Char"/>
     <w:basedOn w:val="134"/>
     <w:link w:val="3"/>
-    <w:qFormat/>
     <w:uiPriority w:val="9"/>
     <w:rPr>
       <w:rFonts w:asciiTheme="majorHAnsi" w:hAnsiTheme="majorHAnsi" w:eastAsiaTheme="majorEastAsia" w:cstheme="majorBidi"/>
@@ -28596,6 +28645,7 @@
     <w:basedOn w:val="134"/>
     <w:link w:val="7"/>
     <w:semiHidden/>
+    <w:qFormat/>
     <w:uiPriority w:val="9"/>
     <w:rPr>
       <w:rFonts w:asciiTheme="majorHAnsi" w:hAnsiTheme="majorHAnsi" w:eastAsiaTheme="majorEastAsia" w:cstheme="majorBidi"/>

</xml_diff>

<commit_message>
docs: correct final release artifacts
</commit_message>
<xml_diff>
--- a/deliverables/祝宸旭-操作系统课程设计.docx
+++ b/deliverables/祝宸旭-操作系统课程设计.docx
@@ -277,7 +277,7 @@
         <w:rPr>
           <w:rFonts w:ascii="宋体" w:hAnsi="宋体" w:eastAsia="宋体" w:cs="宋体"/>
         </w:rPr>
-        <w:instrText xml:space="preserve"> HYPERLINK \l _Toc4031 </w:instrText>
+        <w:instrText xml:space="preserve"> HYPERLINK \l _Toc29146 </w:instrText>
       </w:r>
       <w:r>
         <w:rPr>
@@ -298,13 +298,13 @@
         <w:fldChar w:fldCharType="begin"/>
       </w:r>
       <w:r>
-        <w:instrText xml:space="preserve"> PAGEREF _Toc4031 \h </w:instrText>
+        <w:instrText xml:space="preserve"> PAGEREF _Toc29146 \h </w:instrText>
       </w:r>
       <w:r>
         <w:fldChar w:fldCharType="separate"/>
       </w:r>
       <w:r>
-        <w:t>3</w:t>
+        <w:t>2</w:t>
       </w:r>
       <w:r>
         <w:fldChar w:fldCharType="end"/>
@@ -335,7 +335,7 @@
         <w:rPr>
           <w:rFonts w:ascii="宋体" w:hAnsi="宋体" w:eastAsia="宋体" w:cs="宋体"/>
         </w:rPr>
-        <w:instrText xml:space="preserve"> HYPERLINK \l _Toc16481 </w:instrText>
+        <w:instrText xml:space="preserve"> HYPERLINK \l _Toc26727 </w:instrText>
       </w:r>
       <w:r>
         <w:rPr>
@@ -356,13 +356,13 @@
         <w:fldChar w:fldCharType="begin"/>
       </w:r>
       <w:r>
-        <w:instrText xml:space="preserve"> PAGEREF _Toc16481 \h </w:instrText>
+        <w:instrText xml:space="preserve"> PAGEREF _Toc26727 \h </w:instrText>
       </w:r>
       <w:r>
         <w:fldChar w:fldCharType="separate"/>
       </w:r>
       <w:r>
-        <w:t>3</w:t>
+        <w:t>2</w:t>
       </w:r>
       <w:r>
         <w:fldChar w:fldCharType="end"/>
@@ -393,7 +393,7 @@
         <w:rPr>
           <w:rFonts w:ascii="宋体" w:hAnsi="宋体" w:eastAsia="宋体" w:cs="宋体"/>
         </w:rPr>
-        <w:instrText xml:space="preserve"> HYPERLINK \l _Toc10407 </w:instrText>
+        <w:instrText xml:space="preserve"> HYPERLINK \l _Toc5584 </w:instrText>
       </w:r>
       <w:r>
         <w:rPr>
@@ -414,13 +414,13 @@
         <w:fldChar w:fldCharType="begin"/>
       </w:r>
       <w:r>
-        <w:instrText xml:space="preserve"> PAGEREF _Toc10407 \h </w:instrText>
+        <w:instrText xml:space="preserve"> PAGEREF _Toc5584 \h </w:instrText>
       </w:r>
       <w:r>
         <w:fldChar w:fldCharType="separate"/>
       </w:r>
       <w:r>
-        <w:t>3</w:t>
+        <w:t>2</w:t>
       </w:r>
       <w:r>
         <w:fldChar w:fldCharType="end"/>
@@ -451,7 +451,7 @@
         <w:rPr>
           <w:rFonts w:ascii="宋体" w:hAnsi="宋体" w:eastAsia="宋体" w:cs="宋体"/>
         </w:rPr>
-        <w:instrText xml:space="preserve"> HYPERLINK \l _Toc1278 </w:instrText>
+        <w:instrText xml:space="preserve"> HYPERLINK \l _Toc7443 </w:instrText>
       </w:r>
       <w:r>
         <w:rPr>
@@ -472,13 +472,13 @@
         <w:fldChar w:fldCharType="begin"/>
       </w:r>
       <w:r>
-        <w:instrText xml:space="preserve"> PAGEREF _Toc1278 \h </w:instrText>
+        <w:instrText xml:space="preserve"> PAGEREF _Toc7443 \h </w:instrText>
       </w:r>
       <w:r>
         <w:fldChar w:fldCharType="separate"/>
       </w:r>
       <w:r>
-        <w:t>4</w:t>
+        <w:t>3</w:t>
       </w:r>
       <w:r>
         <w:fldChar w:fldCharType="end"/>
@@ -509,7 +509,7 @@
         <w:rPr>
           <w:rFonts w:ascii="宋体" w:hAnsi="宋体" w:eastAsia="宋体" w:cs="宋体"/>
         </w:rPr>
-        <w:instrText xml:space="preserve"> HYPERLINK \l _Toc25968 </w:instrText>
+        <w:instrText xml:space="preserve"> HYPERLINK \l _Toc20676 </w:instrText>
       </w:r>
       <w:r>
         <w:rPr>
@@ -530,13 +530,13 @@
         <w:fldChar w:fldCharType="begin"/>
       </w:r>
       <w:r>
-        <w:instrText xml:space="preserve"> PAGEREF _Toc25968 \h </w:instrText>
+        <w:instrText xml:space="preserve"> PAGEREF _Toc20676 \h </w:instrText>
       </w:r>
       <w:r>
         <w:fldChar w:fldCharType="separate"/>
       </w:r>
       <w:r>
-        <w:t>5</w:t>
+        <w:t>4</w:t>
       </w:r>
       <w:r>
         <w:fldChar w:fldCharType="end"/>
@@ -567,7 +567,7 @@
         <w:rPr>
           <w:rFonts w:ascii="宋体" w:hAnsi="宋体" w:eastAsia="宋体" w:cs="宋体"/>
         </w:rPr>
-        <w:instrText xml:space="preserve"> HYPERLINK \l _Toc1255 </w:instrText>
+        <w:instrText xml:space="preserve"> HYPERLINK \l _Toc12665 </w:instrText>
       </w:r>
       <w:r>
         <w:rPr>
@@ -588,13 +588,13 @@
         <w:fldChar w:fldCharType="begin"/>
       </w:r>
       <w:r>
-        <w:instrText xml:space="preserve"> PAGEREF _Toc1255 \h </w:instrText>
+        <w:instrText xml:space="preserve"> PAGEREF _Toc12665 \h </w:instrText>
       </w:r>
       <w:r>
         <w:fldChar w:fldCharType="separate"/>
       </w:r>
       <w:r>
-        <w:t>6</w:t>
+        <w:t>5</w:t>
       </w:r>
       <w:r>
         <w:fldChar w:fldCharType="end"/>
@@ -625,7 +625,7 @@
         <w:rPr>
           <w:rFonts w:ascii="宋体" w:hAnsi="宋体" w:eastAsia="宋体" w:cs="宋体"/>
         </w:rPr>
-        <w:instrText xml:space="preserve"> HYPERLINK \l _Toc16524 </w:instrText>
+        <w:instrText xml:space="preserve"> HYPERLINK \l _Toc21364 </w:instrText>
       </w:r>
       <w:r>
         <w:rPr>
@@ -646,13 +646,13 @@
         <w:fldChar w:fldCharType="begin"/>
       </w:r>
       <w:r>
-        <w:instrText xml:space="preserve"> PAGEREF _Toc16524 \h </w:instrText>
+        <w:instrText xml:space="preserve"> PAGEREF _Toc21364 \h </w:instrText>
       </w:r>
       <w:r>
         <w:fldChar w:fldCharType="separate"/>
       </w:r>
       <w:r>
-        <w:t>6</w:t>
+        <w:t>5</w:t>
       </w:r>
       <w:r>
         <w:fldChar w:fldCharType="end"/>
@@ -683,7 +683,7 @@
         <w:rPr>
           <w:rFonts w:ascii="宋体" w:hAnsi="宋体" w:eastAsia="宋体" w:cs="宋体"/>
         </w:rPr>
-        <w:instrText xml:space="preserve"> HYPERLINK \l _Toc27180 </w:instrText>
+        <w:instrText xml:space="preserve"> HYPERLINK \l _Toc15074 </w:instrText>
       </w:r>
       <w:r>
         <w:rPr>
@@ -704,13 +704,13 @@
         <w:fldChar w:fldCharType="begin"/>
       </w:r>
       <w:r>
-        <w:instrText xml:space="preserve"> PAGEREF _Toc27180 \h </w:instrText>
+        <w:instrText xml:space="preserve"> PAGEREF _Toc15074 \h </w:instrText>
       </w:r>
       <w:r>
         <w:fldChar w:fldCharType="separate"/>
       </w:r>
       <w:r>
-        <w:t>7</w:t>
+        <w:t>6</w:t>
       </w:r>
       <w:r>
         <w:fldChar w:fldCharType="end"/>
@@ -741,7 +741,7 @@
         <w:rPr>
           <w:rFonts w:ascii="宋体" w:hAnsi="宋体" w:eastAsia="宋体" w:cs="宋体"/>
         </w:rPr>
-        <w:instrText xml:space="preserve"> HYPERLINK \l _Toc6030 </w:instrText>
+        <w:instrText xml:space="preserve"> HYPERLINK \l _Toc3945 </w:instrText>
       </w:r>
       <w:r>
         <w:rPr>
@@ -762,13 +762,13 @@
         <w:fldChar w:fldCharType="begin"/>
       </w:r>
       <w:r>
-        <w:instrText xml:space="preserve"> PAGEREF _Toc6030 \h </w:instrText>
+        <w:instrText xml:space="preserve"> PAGEREF _Toc3945 \h </w:instrText>
       </w:r>
       <w:r>
         <w:fldChar w:fldCharType="separate"/>
       </w:r>
       <w:r>
-        <w:t>8</w:t>
+        <w:t>7</w:t>
       </w:r>
       <w:r>
         <w:fldChar w:fldCharType="end"/>
@@ -799,7 +799,7 @@
         <w:rPr>
           <w:rFonts w:ascii="宋体" w:hAnsi="宋体" w:eastAsia="宋体" w:cs="宋体"/>
         </w:rPr>
-        <w:instrText xml:space="preserve"> HYPERLINK \l _Toc4306 </w:instrText>
+        <w:instrText xml:space="preserve"> HYPERLINK \l _Toc22674 </w:instrText>
       </w:r>
       <w:r>
         <w:rPr>
@@ -820,13 +820,13 @@
         <w:fldChar w:fldCharType="begin"/>
       </w:r>
       <w:r>
-        <w:instrText xml:space="preserve"> PAGEREF _Toc4306 \h </w:instrText>
+        <w:instrText xml:space="preserve"> PAGEREF _Toc22674 \h </w:instrText>
       </w:r>
       <w:r>
         <w:fldChar w:fldCharType="separate"/>
       </w:r>
       <w:r>
-        <w:t>9</w:t>
+        <w:t>8</w:t>
       </w:r>
       <w:r>
         <w:fldChar w:fldCharType="end"/>
@@ -857,7 +857,7 @@
         <w:rPr>
           <w:rFonts w:ascii="宋体" w:hAnsi="宋体" w:eastAsia="宋体" w:cs="宋体"/>
         </w:rPr>
-        <w:instrText xml:space="preserve"> HYPERLINK \l _Toc24635 </w:instrText>
+        <w:instrText xml:space="preserve"> HYPERLINK \l _Toc13127 </w:instrText>
       </w:r>
       <w:r>
         <w:rPr>
@@ -878,13 +878,13 @@
         <w:fldChar w:fldCharType="begin"/>
       </w:r>
       <w:r>
-        <w:instrText xml:space="preserve"> PAGEREF _Toc24635 \h </w:instrText>
+        <w:instrText xml:space="preserve"> PAGEREF _Toc13127 \h </w:instrText>
       </w:r>
       <w:r>
         <w:fldChar w:fldCharType="separate"/>
       </w:r>
       <w:r>
-        <w:t>10</w:t>
+        <w:t>9</w:t>
       </w:r>
       <w:r>
         <w:fldChar w:fldCharType="end"/>
@@ -915,7 +915,7 @@
         <w:rPr>
           <w:rFonts w:ascii="宋体" w:hAnsi="宋体" w:eastAsia="宋体" w:cs="宋体"/>
         </w:rPr>
-        <w:instrText xml:space="preserve"> HYPERLINK \l _Toc16915 </w:instrText>
+        <w:instrText xml:space="preserve"> HYPERLINK \l _Toc8519 </w:instrText>
       </w:r>
       <w:r>
         <w:rPr>
@@ -936,13 +936,13 @@
         <w:fldChar w:fldCharType="begin"/>
       </w:r>
       <w:r>
-        <w:instrText xml:space="preserve"> PAGEREF _Toc16915 \h </w:instrText>
+        <w:instrText xml:space="preserve"> PAGEREF _Toc8519 \h </w:instrText>
       </w:r>
       <w:r>
         <w:fldChar w:fldCharType="separate"/>
       </w:r>
       <w:r>
-        <w:t>11</w:t>
+        <w:t>10</w:t>
       </w:r>
       <w:r>
         <w:fldChar w:fldCharType="end"/>
@@ -973,7 +973,7 @@
         <w:rPr>
           <w:rFonts w:ascii="宋体" w:hAnsi="宋体" w:eastAsia="宋体" w:cs="宋体"/>
         </w:rPr>
-        <w:instrText xml:space="preserve"> HYPERLINK \l _Toc26436 </w:instrText>
+        <w:instrText xml:space="preserve"> HYPERLINK \l _Toc15068 </w:instrText>
       </w:r>
       <w:r>
         <w:rPr>
@@ -994,13 +994,13 @@
         <w:fldChar w:fldCharType="begin"/>
       </w:r>
       <w:r>
-        <w:instrText xml:space="preserve"> PAGEREF _Toc26436 \h </w:instrText>
+        <w:instrText xml:space="preserve"> PAGEREF _Toc15068 \h </w:instrText>
       </w:r>
       <w:r>
         <w:fldChar w:fldCharType="separate"/>
       </w:r>
       <w:r>
-        <w:t>11</w:t>
+        <w:t>10</w:t>
       </w:r>
       <w:r>
         <w:fldChar w:fldCharType="end"/>
@@ -1031,7 +1031,7 @@
         <w:rPr>
           <w:rFonts w:ascii="宋体" w:hAnsi="宋体" w:eastAsia="宋体" w:cs="宋体"/>
         </w:rPr>
-        <w:instrText xml:space="preserve"> HYPERLINK \l _Toc9908 </w:instrText>
+        <w:instrText xml:space="preserve"> HYPERLINK \l _Toc27024 </w:instrText>
       </w:r>
       <w:r>
         <w:rPr>
@@ -1052,13 +1052,13 @@
         <w:fldChar w:fldCharType="begin"/>
       </w:r>
       <w:r>
-        <w:instrText xml:space="preserve"> PAGEREF _Toc9908 \h </w:instrText>
+        <w:instrText xml:space="preserve"> PAGEREF _Toc27024 \h </w:instrText>
       </w:r>
       <w:r>
         <w:fldChar w:fldCharType="separate"/>
       </w:r>
       <w:r>
-        <w:t>12</w:t>
+        <w:t>11</w:t>
       </w:r>
       <w:r>
         <w:fldChar w:fldCharType="end"/>
@@ -1089,7 +1089,7 @@
         <w:rPr>
           <w:rFonts w:ascii="宋体" w:hAnsi="宋体" w:eastAsia="宋体" w:cs="宋体"/>
         </w:rPr>
-        <w:instrText xml:space="preserve"> HYPERLINK \l _Toc28111 </w:instrText>
+        <w:instrText xml:space="preserve"> HYPERLINK \l _Toc14472 </w:instrText>
       </w:r>
       <w:r>
         <w:rPr>
@@ -1110,13 +1110,13 @@
         <w:fldChar w:fldCharType="begin"/>
       </w:r>
       <w:r>
-        <w:instrText xml:space="preserve"> PAGEREF _Toc28111 \h </w:instrText>
+        <w:instrText xml:space="preserve"> PAGEREF _Toc14472 \h </w:instrText>
       </w:r>
       <w:r>
         <w:fldChar w:fldCharType="separate"/>
       </w:r>
       <w:r>
-        <w:t>13</w:t>
+        <w:t>12</w:t>
       </w:r>
       <w:r>
         <w:fldChar w:fldCharType="end"/>
@@ -1147,7 +1147,7 @@
         <w:rPr>
           <w:rFonts w:ascii="宋体" w:hAnsi="宋体" w:eastAsia="宋体" w:cs="宋体"/>
         </w:rPr>
-        <w:instrText xml:space="preserve"> HYPERLINK \l _Toc4333 </w:instrText>
+        <w:instrText xml:space="preserve"> HYPERLINK \l _Toc4633 </w:instrText>
       </w:r>
       <w:r>
         <w:rPr>
@@ -1168,13 +1168,13 @@
         <w:fldChar w:fldCharType="begin"/>
       </w:r>
       <w:r>
-        <w:instrText xml:space="preserve"> PAGEREF _Toc4333 \h </w:instrText>
+        <w:instrText xml:space="preserve"> PAGEREF _Toc4633 \h </w:instrText>
       </w:r>
       <w:r>
         <w:fldChar w:fldCharType="separate"/>
       </w:r>
       <w:r>
-        <w:t>14</w:t>
+        <w:t>13</w:t>
       </w:r>
       <w:r>
         <w:fldChar w:fldCharType="end"/>
@@ -1205,7 +1205,7 @@
         <w:rPr>
           <w:rFonts w:ascii="宋体" w:hAnsi="宋体" w:eastAsia="宋体" w:cs="宋体"/>
         </w:rPr>
-        <w:instrText xml:space="preserve"> HYPERLINK \l _Toc25649 </w:instrText>
+        <w:instrText xml:space="preserve"> HYPERLINK \l _Toc27368 </w:instrText>
       </w:r>
       <w:r>
         <w:rPr>
@@ -1226,13 +1226,13 @@
         <w:fldChar w:fldCharType="begin"/>
       </w:r>
       <w:r>
-        <w:instrText xml:space="preserve"> PAGEREF _Toc25649 \h </w:instrText>
+        <w:instrText xml:space="preserve"> PAGEREF _Toc27368 \h </w:instrText>
       </w:r>
       <w:r>
         <w:fldChar w:fldCharType="separate"/>
       </w:r>
       <w:r>
-        <w:t>15</w:t>
+        <w:t>14</w:t>
       </w:r>
       <w:r>
         <w:fldChar w:fldCharType="end"/>
@@ -1263,7 +1263,7 @@
         <w:rPr>
           <w:rFonts w:ascii="宋体" w:hAnsi="宋体" w:eastAsia="宋体" w:cs="宋体"/>
         </w:rPr>
-        <w:instrText xml:space="preserve"> HYPERLINK \l _Toc701 </w:instrText>
+        <w:instrText xml:space="preserve"> HYPERLINK \l _Toc17697 </w:instrText>
       </w:r>
       <w:r>
         <w:rPr>
@@ -1284,13 +1284,13 @@
         <w:fldChar w:fldCharType="begin"/>
       </w:r>
       <w:r>
-        <w:instrText xml:space="preserve"> PAGEREF _Toc701 \h </w:instrText>
+        <w:instrText xml:space="preserve"> PAGEREF _Toc17697 \h </w:instrText>
       </w:r>
       <w:r>
         <w:fldChar w:fldCharType="separate"/>
       </w:r>
       <w:r>
-        <w:t>15</w:t>
+        <w:t>14</w:t>
       </w:r>
       <w:r>
         <w:fldChar w:fldCharType="end"/>
@@ -1321,7 +1321,7 @@
         <w:rPr>
           <w:rFonts w:ascii="宋体" w:hAnsi="宋体" w:eastAsia="宋体" w:cs="宋体"/>
         </w:rPr>
-        <w:instrText xml:space="preserve"> HYPERLINK \l _Toc13189 </w:instrText>
+        <w:instrText xml:space="preserve"> HYPERLINK \l _Toc2294 </w:instrText>
       </w:r>
       <w:r>
         <w:rPr>
@@ -1342,13 +1342,13 @@
         <w:fldChar w:fldCharType="begin"/>
       </w:r>
       <w:r>
-        <w:instrText xml:space="preserve"> PAGEREF _Toc13189 \h </w:instrText>
+        <w:instrText xml:space="preserve"> PAGEREF _Toc2294 \h </w:instrText>
       </w:r>
       <w:r>
         <w:fldChar w:fldCharType="separate"/>
       </w:r>
       <w:r>
-        <w:t>16</w:t>
+        <w:t>15</w:t>
       </w:r>
       <w:r>
         <w:fldChar w:fldCharType="end"/>
@@ -1379,7 +1379,7 @@
         <w:rPr>
           <w:rFonts w:ascii="宋体" w:hAnsi="宋体" w:eastAsia="宋体" w:cs="宋体"/>
         </w:rPr>
-        <w:instrText xml:space="preserve"> HYPERLINK \l _Toc15256 </w:instrText>
+        <w:instrText xml:space="preserve"> HYPERLINK \l _Toc1191 </w:instrText>
       </w:r>
       <w:r>
         <w:rPr>
@@ -1400,13 +1400,13 @@
         <w:fldChar w:fldCharType="begin"/>
       </w:r>
       <w:r>
-        <w:instrText xml:space="preserve"> PAGEREF _Toc15256 \h </w:instrText>
+        <w:instrText xml:space="preserve"> PAGEREF _Toc1191 \h </w:instrText>
       </w:r>
       <w:r>
         <w:fldChar w:fldCharType="separate"/>
       </w:r>
       <w:r>
-        <w:t>16</w:t>
+        <w:t>15</w:t>
       </w:r>
       <w:r>
         <w:fldChar w:fldCharType="end"/>
@@ -1437,7 +1437,7 @@
         <w:rPr>
           <w:rFonts w:ascii="宋体" w:hAnsi="宋体" w:eastAsia="宋体" w:cs="宋体"/>
         </w:rPr>
-        <w:instrText xml:space="preserve"> HYPERLINK \l _Toc21773 </w:instrText>
+        <w:instrText xml:space="preserve"> HYPERLINK \l _Toc16372 </w:instrText>
       </w:r>
       <w:r>
         <w:rPr>
@@ -1458,13 +1458,13 @@
         <w:fldChar w:fldCharType="begin"/>
       </w:r>
       <w:r>
-        <w:instrText xml:space="preserve"> PAGEREF _Toc21773 \h </w:instrText>
+        <w:instrText xml:space="preserve"> PAGEREF _Toc16372 \h </w:instrText>
       </w:r>
       <w:r>
         <w:fldChar w:fldCharType="separate"/>
       </w:r>
       <w:r>
-        <w:t>16</w:t>
+        <w:t>15</w:t>
       </w:r>
       <w:r>
         <w:fldChar w:fldCharType="end"/>
@@ -1487,11 +1487,6 @@
           <w:color w:val="595959"/>
         </w:rPr>
         <w:fldChar w:fldCharType="end"/>
-      </w:r>
-    </w:p>
-    <w:p>
-      <w:r>
-        <w:br w:type="page"/>
       </w:r>
     </w:p>
     <w:p>
@@ -1499,7 +1494,7 @@
         <w:pStyle w:val="3"/>
         <w:ind w:firstLine="0"/>
       </w:pPr>
-      <w:bookmarkStart w:id="0" w:name="_Toc4031"/>
+      <w:bookmarkStart w:id="0" w:name="_Toc29146"/>
       <w:r>
         <w:rPr>
           <w:rFonts w:ascii="微软雅黑" w:hAnsi="微软雅黑" w:eastAsia="微软雅黑" w:cs="微软雅黑"/>
@@ -1572,7 +1567,7 @@
         <w:pStyle w:val="3"/>
         <w:ind w:firstLine="0"/>
       </w:pPr>
-      <w:bookmarkStart w:id="1" w:name="_Toc16481"/>
+      <w:bookmarkStart w:id="1" w:name="_Toc26727"/>
       <w:r>
         <w:rPr>
           <w:rFonts w:ascii="微软雅黑" w:hAnsi="微软雅黑" w:eastAsia="微软雅黑" w:cs="微软雅黑"/>
@@ -1607,7 +1602,7 @@
         <w:pStyle w:val="3"/>
         <w:ind w:firstLine="0"/>
       </w:pPr>
-      <w:bookmarkStart w:id="2" w:name="_Toc10407"/>
+      <w:bookmarkStart w:id="2" w:name="_Toc5584"/>
       <w:r>
         <w:rPr>
           <w:rFonts w:ascii="微软雅黑" w:hAnsi="微软雅黑" w:eastAsia="微软雅黑" w:cs="微软雅黑"/>
@@ -3414,7 +3409,7 @@
         <w:pStyle w:val="3"/>
         <w:ind w:firstLine="0"/>
       </w:pPr>
-      <w:bookmarkStart w:id="3" w:name="_Toc1278"/>
+      <w:bookmarkStart w:id="3" w:name="_Toc7443"/>
       <w:r>
         <w:rPr>
           <w:rFonts w:ascii="微软雅黑" w:hAnsi="微软雅黑" w:eastAsia="微软雅黑" w:cs="微软雅黑"/>
@@ -4236,7 +4231,7 @@
         <w:pStyle w:val="3"/>
         <w:ind w:firstLine="0"/>
       </w:pPr>
-      <w:bookmarkStart w:id="4" w:name="_Toc25968"/>
+      <w:bookmarkStart w:id="4" w:name="_Toc20676"/>
       <w:r>
         <w:rPr>
           <w:rFonts w:ascii="微软雅黑" w:hAnsi="微软雅黑" w:eastAsia="微软雅黑" w:cs="微软雅黑"/>
@@ -4674,7 +4669,7 @@
         <w:pStyle w:val="3"/>
         <w:ind w:firstLine="0"/>
       </w:pPr>
-      <w:bookmarkStart w:id="5" w:name="_Toc1255"/>
+      <w:bookmarkStart w:id="5" w:name="_Toc12665"/>
       <w:r>
         <w:rPr>
           <w:rFonts w:ascii="微软雅黑" w:hAnsi="微软雅黑" w:eastAsia="微软雅黑" w:cs="微软雅黑"/>
@@ -5201,7 +5196,7 @@
         <w:pStyle w:val="3"/>
         <w:ind w:firstLine="0"/>
       </w:pPr>
-      <w:bookmarkStart w:id="6" w:name="_Toc16524"/>
+      <w:bookmarkStart w:id="6" w:name="_Toc21364"/>
       <w:r>
         <w:rPr>
           <w:rFonts w:ascii="微软雅黑" w:hAnsi="微软雅黑" w:eastAsia="微软雅黑" w:cs="微软雅黑"/>
@@ -5639,7 +5634,7 @@
         <w:pStyle w:val="3"/>
         <w:ind w:firstLine="0"/>
       </w:pPr>
-      <w:bookmarkStart w:id="7" w:name="_Toc27180"/>
+      <w:bookmarkStart w:id="7" w:name="_Toc15074"/>
       <w:r>
         <w:rPr>
           <w:rFonts w:ascii="微软雅黑" w:hAnsi="微软雅黑" w:eastAsia="微软雅黑" w:cs="微软雅黑"/>
@@ -6017,7 +6012,7 @@
         <w:pStyle w:val="3"/>
         <w:ind w:firstLine="0"/>
       </w:pPr>
-      <w:bookmarkStart w:id="8" w:name="_Toc6030"/>
+      <w:bookmarkStart w:id="8" w:name="_Toc3945"/>
       <w:r>
         <w:rPr>
           <w:rFonts w:ascii="微软雅黑" w:hAnsi="微软雅黑" w:eastAsia="微软雅黑" w:cs="微软雅黑"/>
@@ -6365,7 +6360,7 @@
         <w:pStyle w:val="3"/>
         <w:ind w:firstLine="0"/>
       </w:pPr>
-      <w:bookmarkStart w:id="9" w:name="_Toc4306"/>
+      <w:bookmarkStart w:id="9" w:name="_Toc22674"/>
       <w:r>
         <w:rPr>
           <w:rFonts w:ascii="微软雅黑" w:hAnsi="微软雅黑" w:eastAsia="微软雅黑" w:cs="微软雅黑"/>
@@ -6728,7 +6723,7 @@
         <w:pStyle w:val="3"/>
         <w:ind w:firstLine="0"/>
       </w:pPr>
-      <w:bookmarkStart w:id="10" w:name="_Toc24635"/>
+      <w:bookmarkStart w:id="10" w:name="_Toc13127"/>
       <w:r>
         <w:rPr>
           <w:rFonts w:ascii="微软雅黑" w:hAnsi="微软雅黑" w:eastAsia="微软雅黑" w:cs="微软雅黑"/>
@@ -6986,7 +6981,7 @@
         <w:pStyle w:val="3"/>
         <w:ind w:firstLine="0"/>
       </w:pPr>
-      <w:bookmarkStart w:id="11" w:name="_Toc16915"/>
+      <w:bookmarkStart w:id="11" w:name="_Toc8519"/>
       <w:r>
         <w:rPr>
           <w:rFonts w:ascii="微软雅黑" w:hAnsi="微软雅黑" w:eastAsia="微软雅黑" w:cs="微软雅黑"/>
@@ -7229,7 +7224,7 @@
         <w:pStyle w:val="3"/>
         <w:ind w:firstLine="0"/>
       </w:pPr>
-      <w:bookmarkStart w:id="12" w:name="_Toc26436"/>
+      <w:bookmarkStart w:id="12" w:name="_Toc15068"/>
       <w:r>
         <w:rPr>
           <w:rFonts w:ascii="微软雅黑" w:hAnsi="微软雅黑" w:eastAsia="微软雅黑" w:cs="微软雅黑"/>
@@ -7457,7 +7452,7 @@
         <w:pStyle w:val="3"/>
         <w:ind w:firstLine="0"/>
       </w:pPr>
-      <w:bookmarkStart w:id="13" w:name="_Toc9908"/>
+      <w:bookmarkStart w:id="13" w:name="_Toc27024"/>
       <w:r>
         <w:rPr>
           <w:rFonts w:ascii="微软雅黑" w:hAnsi="微软雅黑" w:eastAsia="微软雅黑" w:cs="微软雅黑"/>
@@ -7745,7 +7740,7 @@
         <w:pStyle w:val="3"/>
         <w:ind w:firstLine="0"/>
       </w:pPr>
-      <w:bookmarkStart w:id="14" w:name="_Toc28111"/>
+      <w:bookmarkStart w:id="14" w:name="_Toc14472"/>
       <w:r>
         <w:rPr>
           <w:rFonts w:ascii="微软雅黑" w:hAnsi="微软雅黑" w:eastAsia="微软雅黑" w:cs="微软雅黑"/>
@@ -8108,7 +8103,7 @@
         <w:pStyle w:val="3"/>
         <w:ind w:firstLine="0"/>
       </w:pPr>
-      <w:bookmarkStart w:id="15" w:name="_Toc4333"/>
+      <w:bookmarkStart w:id="15" w:name="_Toc4633"/>
       <w:r>
         <w:rPr>
           <w:rFonts w:ascii="微软雅黑" w:hAnsi="微软雅黑" w:eastAsia="微软雅黑" w:cs="微软雅黑"/>
@@ -10898,7 +10893,7 @@
         <w:pStyle w:val="3"/>
         <w:ind w:firstLine="0"/>
       </w:pPr>
-      <w:bookmarkStart w:id="16" w:name="_Toc25649"/>
+      <w:bookmarkStart w:id="16" w:name="_Toc27368"/>
       <w:r>
         <w:rPr>
           <w:rFonts w:ascii="微软雅黑" w:hAnsi="微软雅黑" w:eastAsia="微软雅黑" w:cs="微软雅黑"/>
@@ -11122,7 +11117,7 @@
         <w:pStyle w:val="3"/>
         <w:ind w:firstLine="0"/>
       </w:pPr>
-      <w:bookmarkStart w:id="17" w:name="_Toc701"/>
+      <w:bookmarkStart w:id="17" w:name="_Toc17697"/>
       <w:r>
         <w:rPr>
           <w:rFonts w:ascii="微软雅黑" w:hAnsi="微软雅黑" w:eastAsia="微软雅黑" w:cs="微软雅黑"/>
@@ -11157,7 +11152,7 @@
         <w:pStyle w:val="3"/>
         <w:ind w:firstLine="0"/>
       </w:pPr>
-      <w:bookmarkStart w:id="18" w:name="_Toc13189"/>
+      <w:bookmarkStart w:id="18" w:name="_Toc2294"/>
       <w:r>
         <w:rPr>
           <w:rFonts w:ascii="微软雅黑" w:hAnsi="微软雅黑" w:eastAsia="微软雅黑" w:cs="微软雅黑"/>
@@ -11204,7 +11199,7 @@
         <w:pStyle w:val="3"/>
         <w:ind w:firstLine="0"/>
       </w:pPr>
-      <w:bookmarkStart w:id="19" w:name="_Toc15256"/>
+      <w:bookmarkStart w:id="19" w:name="_Toc1191"/>
       <w:r>
         <w:rPr>
           <w:rFonts w:ascii="微软雅黑" w:hAnsi="微软雅黑" w:eastAsia="微软雅黑" w:cs="微软雅黑"/>
@@ -12109,7 +12104,7 @@
         <w:pStyle w:val="3"/>
         <w:ind w:firstLine="0"/>
       </w:pPr>
-      <w:bookmarkStart w:id="20" w:name="_Toc21773"/>
+      <w:bookmarkStart w:id="20" w:name="_Toc16372"/>
       <w:r>
         <w:rPr>
           <w:rFonts w:ascii="微软雅黑" w:hAnsi="微软雅黑" w:eastAsia="微软雅黑" w:cs="微软雅黑"/>
@@ -12659,8 +12654,8 @@
     <w:lsdException w:uiPriority="99" w:name="index 7"/>
     <w:lsdException w:uiPriority="99" w:name="index 8"/>
     <w:lsdException w:uiPriority="99" w:name="index 9"/>
-    <w:lsdException w:uiPriority="39" w:name="toc 1"/>
-    <w:lsdException w:uiPriority="39" w:name="toc 2"/>
+    <w:lsdException w:qFormat="1" w:uiPriority="39" w:name="toc 1"/>
+    <w:lsdException w:qFormat="1" w:uiPriority="39" w:name="toc 2"/>
     <w:lsdException w:uiPriority="39" w:name="toc 3"/>
     <w:lsdException w:uiPriority="39" w:name="toc 4"/>
     <w:lsdException w:uiPriority="39" w:name="toc 5"/>
@@ -12685,32 +12680,32 @@
     <w:lsdException w:uiPriority="99" w:name="endnote reference"/>
     <w:lsdException w:uiPriority="99" w:name="endnote text"/>
     <w:lsdException w:uiPriority="99" w:name="table of authorities"/>
-    <w:lsdException w:uiPriority="99" w:semiHidden="0" w:name="macro"/>
+    <w:lsdException w:qFormat="1" w:uiPriority="99" w:semiHidden="0" w:name="macro"/>
     <w:lsdException w:uiPriority="99" w:name="toa heading"/>
-    <w:lsdException w:uiPriority="99" w:semiHidden="0" w:name="List"/>
+    <w:lsdException w:qFormat="1" w:uiPriority="99" w:semiHidden="0" w:name="List"/>
     <w:lsdException w:qFormat="1" w:uiPriority="99" w:semiHidden="0" w:name="List Bullet"/>
-    <w:lsdException w:uiPriority="99" w:semiHidden="0" w:name="List Number"/>
-    <w:lsdException w:uiPriority="99" w:semiHidden="0" w:name="List 2"/>
-    <w:lsdException w:uiPriority="99" w:semiHidden="0" w:name="List 3"/>
+    <w:lsdException w:qFormat="1" w:uiPriority="99" w:semiHidden="0" w:name="List Number"/>
+    <w:lsdException w:qFormat="1" w:uiPriority="99" w:semiHidden="0" w:name="List 2"/>
+    <w:lsdException w:qFormat="1" w:uiPriority="99" w:semiHidden="0" w:name="List 3"/>
     <w:lsdException w:uiPriority="99" w:name="List 4"/>
     <w:lsdException w:uiPriority="99" w:name="List 5"/>
-    <w:lsdException w:uiPriority="99" w:semiHidden="0" w:name="List Bullet 2"/>
+    <w:lsdException w:qFormat="1" w:uiPriority="99" w:semiHidden="0" w:name="List Bullet 2"/>
     <w:lsdException w:qFormat="1" w:uiPriority="99" w:semiHidden="0" w:name="List Bullet 3"/>
     <w:lsdException w:uiPriority="99" w:name="List Bullet 4"/>
     <w:lsdException w:uiPriority="99" w:name="List Bullet 5"/>
-    <w:lsdException w:uiPriority="99" w:semiHidden="0" w:name="List Number 2"/>
-    <w:lsdException w:uiPriority="99" w:semiHidden="0" w:name="List Number 3"/>
+    <w:lsdException w:qFormat="1" w:uiPriority="99" w:semiHidden="0" w:name="List Number 2"/>
+    <w:lsdException w:qFormat="1" w:uiPriority="99" w:semiHidden="0" w:name="List Number 3"/>
     <w:lsdException w:uiPriority="99" w:name="List Number 4"/>
     <w:lsdException w:uiPriority="99" w:name="List Number 5"/>
     <w:lsdException w:qFormat="1" w:unhideWhenUsed="0" w:uiPriority="10" w:semiHidden="0" w:name="Title"/>
     <w:lsdException w:uiPriority="99" w:name="Closing"/>
     <w:lsdException w:uiPriority="99" w:name="Signature"/>
     <w:lsdException w:uiPriority="1" w:name="Default Paragraph Font"/>
-    <w:lsdException w:uiPriority="99" w:semiHidden="0" w:name="Body Text"/>
+    <w:lsdException w:qFormat="1" w:uiPriority="99" w:semiHidden="0" w:name="Body Text"/>
     <w:lsdException w:uiPriority="99" w:name="Body Text Indent"/>
-    <w:lsdException w:uiPriority="99" w:semiHidden="0" w:name="List Continue"/>
+    <w:lsdException w:qFormat="1" w:uiPriority="99" w:semiHidden="0" w:name="List Continue"/>
     <w:lsdException w:qFormat="1" w:uiPriority="99" w:semiHidden="0" w:name="List Continue 2"/>
-    <w:lsdException w:uiPriority="99" w:semiHidden="0" w:name="List Continue 3"/>
+    <w:lsdException w:qFormat="1" w:uiPriority="99" w:semiHidden="0" w:name="List Continue 3"/>
     <w:lsdException w:uiPriority="99" w:name="List Continue 4"/>
     <w:lsdException w:uiPriority="99" w:name="List Continue 5"/>
     <w:lsdException w:uiPriority="99" w:name="Message Header"/>
@@ -12720,8 +12715,8 @@
     <w:lsdException w:uiPriority="99" w:name="Body Text First Indent"/>
     <w:lsdException w:uiPriority="99" w:name="Body Text First Indent 2"/>
     <w:lsdException w:uiPriority="99" w:name="Note Heading"/>
-    <w:lsdException w:uiPriority="99" w:semiHidden="0" w:name="Body Text 2"/>
-    <w:lsdException w:uiPriority="99" w:semiHidden="0" w:name="Body Text 3"/>
+    <w:lsdException w:qFormat="1" w:uiPriority="99" w:semiHidden="0" w:name="Body Text 2"/>
+    <w:lsdException w:qFormat="1" w:uiPriority="99" w:semiHidden="0" w:name="Body Text 3"/>
     <w:lsdException w:uiPriority="99" w:name="Body Text Indent 2"/>
     <w:lsdException w:uiPriority="99" w:name="Body Text Indent 3"/>
     <w:lsdException w:uiPriority="99" w:name="Block Text"/>
@@ -12743,7 +12738,7 @@
     <w:lsdException w:uiPriority="99" w:name="HTML Sample"/>
     <w:lsdException w:uiPriority="99" w:name="HTML Typewriter"/>
     <w:lsdException w:uiPriority="99" w:name="HTML Variable"/>
-    <w:lsdException w:uiPriority="99" w:name="Normal Table"/>
+    <w:lsdException w:qFormat="1" w:uiPriority="99" w:name="Normal Table"/>
     <w:lsdException w:uiPriority="99" w:name="annotation subject"/>
     <w:lsdException w:uiPriority="99" w:name="Table Simple 1"/>
     <w:lsdException w:uiPriority="99" w:name="Table Simple 2"/>
@@ -12791,7 +12786,7 @@
     <w:lsdException w:qFormat="1" w:unhideWhenUsed="0" w:uiPriority="59" w:semiHidden="0" w:name="Table Grid"/>
     <w:lsdException w:uiPriority="99" w:name="Table Theme"/>
     <w:lsdException w:qFormat="1" w:unhideWhenUsed="0" w:uiPriority="1" w:semiHidden="0" w:name="No Spacing"/>
-    <w:lsdException w:unhideWhenUsed="0" w:uiPriority="60" w:semiHidden="0" w:name="Light Shading"/>
+    <w:lsdException w:qFormat="1" w:unhideWhenUsed="0" w:uiPriority="60" w:semiHidden="0" w:name="Light Shading"/>
     <w:lsdException w:unhideWhenUsed="0" w:uiPriority="61" w:semiHidden="0" w:name="Light List"/>
     <w:lsdException w:unhideWhenUsed="0" w:uiPriority="62" w:semiHidden="0" w:name="Light Grid"/>
     <w:lsdException w:qFormat="1" w:unhideWhenUsed="0" w:uiPriority="63" w:semiHidden="0" w:name="Medium Shading 1"/>
@@ -12805,8 +12800,8 @@
     <w:lsdException w:unhideWhenUsed="0" w:uiPriority="71" w:semiHidden="0" w:name="Colorful Shading"/>
     <w:lsdException w:unhideWhenUsed="0" w:uiPriority="72" w:semiHidden="0" w:name="Colorful List"/>
     <w:lsdException w:qFormat="1" w:unhideWhenUsed="0" w:uiPriority="73" w:semiHidden="0" w:name="Colorful Grid"/>
-    <w:lsdException w:unhideWhenUsed="0" w:uiPriority="60" w:semiHidden="0" w:name="Light Shading Accent 1"/>
-    <w:lsdException w:unhideWhenUsed="0" w:uiPriority="61" w:semiHidden="0" w:name="Light List Accent 1"/>
+    <w:lsdException w:qFormat="1" w:unhideWhenUsed="0" w:uiPriority="60" w:semiHidden="0" w:name="Light Shading Accent 1"/>
+    <w:lsdException w:qFormat="1" w:unhideWhenUsed="0" w:uiPriority="61" w:semiHidden="0" w:name="Light List Accent 1"/>
     <w:lsdException w:qFormat="1" w:unhideWhenUsed="0" w:uiPriority="62" w:semiHidden="0" w:name="Light Grid Accent 1"/>
     <w:lsdException w:unhideWhenUsed="0" w:uiPriority="63" w:semiHidden="0" w:name="Medium Shading 1 Accent 1"/>
     <w:lsdException w:unhideWhenUsed="0" w:uiPriority="64" w:semiHidden="0" w:name="Medium Shading 2 Accent 1"/>
@@ -12836,7 +12831,7 @@
     <w:lsdException w:unhideWhenUsed="0" w:uiPriority="71" w:semiHidden="0" w:name="Colorful Shading Accent 2"/>
     <w:lsdException w:unhideWhenUsed="0" w:uiPriority="72" w:semiHidden="0" w:name="Colorful List Accent 2"/>
     <w:lsdException w:unhideWhenUsed="0" w:uiPriority="73" w:semiHidden="0" w:name="Colorful Grid Accent 2"/>
-    <w:lsdException w:unhideWhenUsed="0" w:uiPriority="60" w:semiHidden="0" w:name="Light Shading Accent 3"/>
+    <w:lsdException w:qFormat="1" w:unhideWhenUsed="0" w:uiPriority="60" w:semiHidden="0" w:name="Light Shading Accent 3"/>
     <w:lsdException w:qFormat="1" w:unhideWhenUsed="0" w:uiPriority="61" w:semiHidden="0" w:name="Light List Accent 3"/>
     <w:lsdException w:unhideWhenUsed="0" w:uiPriority="62" w:semiHidden="0" w:name="Light Grid Accent 3"/>
     <w:lsdException w:qFormat="1" w:unhideWhenUsed="0" w:uiPriority="63" w:semiHidden="0" w:name="Medium Shading 1 Accent 3"/>
@@ -12850,7 +12845,7 @@
     <w:lsdException w:qFormat="1" w:unhideWhenUsed="0" w:uiPriority="71" w:semiHidden="0" w:name="Colorful Shading Accent 3"/>
     <w:lsdException w:unhideWhenUsed="0" w:uiPriority="72" w:semiHidden="0" w:name="Colorful List Accent 3"/>
     <w:lsdException w:unhideWhenUsed="0" w:uiPriority="73" w:semiHidden="0" w:name="Colorful Grid Accent 3"/>
-    <w:lsdException w:unhideWhenUsed="0" w:uiPriority="60" w:semiHidden="0" w:name="Light Shading Accent 4"/>
+    <w:lsdException w:qFormat="1" w:unhideWhenUsed="0" w:uiPriority="60" w:semiHidden="0" w:name="Light Shading Accent 4"/>
     <w:lsdException w:qFormat="1" w:unhideWhenUsed="0" w:uiPriority="61" w:semiHidden="0" w:name="Light List Accent 4"/>
     <w:lsdException w:unhideWhenUsed="0" w:uiPriority="62" w:semiHidden="0" w:name="Light Grid Accent 4"/>
     <w:lsdException w:unhideWhenUsed="0" w:uiPriority="63" w:semiHidden="0" w:name="Medium Shading 1 Accent 4"/>
@@ -12864,8 +12859,8 @@
     <w:lsdException w:unhideWhenUsed="0" w:uiPriority="71" w:semiHidden="0" w:name="Colorful Shading Accent 4"/>
     <w:lsdException w:unhideWhenUsed="0" w:uiPriority="72" w:semiHidden="0" w:name="Colorful List Accent 4"/>
     <w:lsdException w:unhideWhenUsed="0" w:uiPriority="73" w:semiHidden="0" w:name="Colorful Grid Accent 4"/>
-    <w:lsdException w:unhideWhenUsed="0" w:uiPriority="60" w:semiHidden="0" w:name="Light Shading Accent 5"/>
-    <w:lsdException w:unhideWhenUsed="0" w:uiPriority="61" w:semiHidden="0" w:name="Light List Accent 5"/>
+    <w:lsdException w:qFormat="1" w:unhideWhenUsed="0" w:uiPriority="60" w:semiHidden="0" w:name="Light Shading Accent 5"/>
+    <w:lsdException w:qFormat="1" w:unhideWhenUsed="0" w:uiPriority="61" w:semiHidden="0" w:name="Light List Accent 5"/>
     <w:lsdException w:unhideWhenUsed="0" w:uiPriority="62" w:semiHidden="0" w:name="Light Grid Accent 5"/>
     <w:lsdException w:unhideWhenUsed="0" w:uiPriority="63" w:semiHidden="0" w:name="Medium Shading 1 Accent 5"/>
     <w:lsdException w:unhideWhenUsed="0" w:uiPriority="64" w:semiHidden="0" w:name="Medium Shading 2 Accent 5"/>
@@ -12878,7 +12873,7 @@
     <w:lsdException w:unhideWhenUsed="0" w:uiPriority="71" w:semiHidden="0" w:name="Colorful Shading Accent 5"/>
     <w:lsdException w:qFormat="1" w:unhideWhenUsed="0" w:uiPriority="72" w:semiHidden="0" w:name="Colorful List Accent 5"/>
     <w:lsdException w:unhideWhenUsed="0" w:uiPriority="73" w:semiHidden="0" w:name="Colorful Grid Accent 5"/>
-    <w:lsdException w:unhideWhenUsed="0" w:uiPriority="60" w:semiHidden="0" w:name="Light Shading Accent 6"/>
+    <w:lsdException w:qFormat="1" w:unhideWhenUsed="0" w:uiPriority="60" w:semiHidden="0" w:name="Light Shading Accent 6"/>
     <w:lsdException w:qFormat="1" w:unhideWhenUsed="0" w:uiPriority="61" w:semiHidden="0" w:name="Light List Accent 6"/>
     <w:lsdException w:qFormat="1" w:unhideWhenUsed="0" w:uiPriority="62" w:semiHidden="0" w:name="Light Grid Accent 6"/>
     <w:lsdException w:unhideWhenUsed="0" w:uiPriority="63" w:semiHidden="0" w:name="Medium Shading 1 Accent 6"/>
@@ -13149,6 +13144,7 @@
     <w:name w:val="Normal Table"/>
     <w:semiHidden/>
     <w:unhideWhenUsed/>
+    <w:qFormat/>
     <w:uiPriority w:val="99"/>
     <w:tblPr>
       <w:tblCellMar>
@@ -13163,6 +13159,7 @@
     <w:name w:val="macro"/>
     <w:link w:val="149"/>
     <w:unhideWhenUsed/>
+    <w:qFormat/>
     <w:uiPriority w:val="99"/>
     <w:pPr>
       <w:tabs>
@@ -13187,6 +13184,7 @@
     <w:name w:val="List 3"/>
     <w:basedOn w:val="1"/>
     <w:unhideWhenUsed/>
+    <w:qFormat/>
     <w:uiPriority w:val="99"/>
     <w:pPr>
       <w:ind w:left="1080" w:hanging="360"/>
@@ -13197,6 +13195,7 @@
     <w:name w:val="List Number 2"/>
     <w:basedOn w:val="1"/>
     <w:unhideWhenUsed/>
+    <w:qFormat/>
     <w:uiPriority w:val="99"/>
     <w:pPr>
       <w:numPr>
@@ -13210,6 +13209,7 @@
     <w:name w:val="List Number"/>
     <w:basedOn w:val="1"/>
     <w:unhideWhenUsed/>
+    <w:qFormat/>
     <w:uiPriority w:val="99"/>
     <w:pPr>
       <w:numPr>
@@ -13274,6 +13274,7 @@
     <w:basedOn w:val="1"/>
     <w:link w:val="148"/>
     <w:unhideWhenUsed/>
+    <w:qFormat/>
     <w:uiPriority w:val="99"/>
     <w:pPr>
       <w:spacing w:after="120"/>
@@ -13302,6 +13303,7 @@
     <w:basedOn w:val="1"/>
     <w:link w:val="146"/>
     <w:unhideWhenUsed/>
+    <w:qFormat/>
     <w:uiPriority w:val="99"/>
     <w:pPr>
       <w:spacing w:after="120"/>
@@ -13311,6 +13313,7 @@
     <w:name w:val="List Number 3"/>
     <w:basedOn w:val="1"/>
     <w:unhideWhenUsed/>
+    <w:qFormat/>
     <w:uiPriority w:val="99"/>
     <w:pPr>
       <w:numPr>
@@ -13324,6 +13327,7 @@
     <w:name w:val="List 2"/>
     <w:basedOn w:val="1"/>
     <w:unhideWhenUsed/>
+    <w:qFormat/>
     <w:uiPriority w:val="99"/>
     <w:pPr>
       <w:ind w:left="720" w:hanging="360"/>
@@ -13334,6 +13338,7 @@
     <w:name w:val="List Continue"/>
     <w:basedOn w:val="1"/>
     <w:unhideWhenUsed/>
+    <w:qFormat/>
     <w:uiPriority w:val="99"/>
     <w:pPr>
       <w:spacing w:after="120"/>
@@ -13345,6 +13350,7 @@
     <w:name w:val="List Bullet 2"/>
     <w:basedOn w:val="1"/>
     <w:unhideWhenUsed/>
+    <w:qFormat/>
     <w:uiPriority w:val="99"/>
     <w:pPr>
       <w:numPr>
@@ -13389,6 +13395,7 @@
     <w:next w:val="1"/>
     <w:semiHidden/>
     <w:unhideWhenUsed/>
+    <w:qFormat/>
     <w:uiPriority w:val="39"/>
   </w:style>
   <w:style w:type="paragraph" w:styleId="27">
@@ -13417,6 +13424,7 @@
     <w:name w:val="List"/>
     <w:basedOn w:val="1"/>
     <w:unhideWhenUsed/>
+    <w:qFormat/>
     <w:uiPriority w:val="99"/>
     <w:pPr>
       <w:ind w:left="360" w:hanging="360"/>
@@ -13429,6 +13437,7 @@
     <w:next w:val="1"/>
     <w:semiHidden/>
     <w:unhideWhenUsed/>
+    <w:qFormat/>
     <w:uiPriority w:val="39"/>
     <w:pPr>
       <w:ind w:left="420" w:leftChars="200"/>
@@ -13439,6 +13448,7 @@
     <w:basedOn w:val="1"/>
     <w:link w:val="147"/>
     <w:unhideWhenUsed/>
+    <w:qFormat/>
     <w:uiPriority w:val="99"/>
     <w:pPr>
       <w:spacing w:after="120" w:line="480" w:lineRule="auto"/>
@@ -13460,6 +13470,7 @@
     <w:name w:val="List Continue 3"/>
     <w:basedOn w:val="1"/>
     <w:unhideWhenUsed/>
+    <w:qFormat/>
     <w:uiPriority w:val="99"/>
     <w:pPr>
       <w:spacing w:after="120"/>
@@ -13518,6 +13529,7 @@
   <w:style w:type="table" w:styleId="36">
     <w:name w:val="Light Shading"/>
     <w:basedOn w:val="34"/>
+    <w:qFormat/>
     <w:uiPriority w:val="60"/>
     <w:pPr>
       <w:spacing w:after="0" w:line="240" w:lineRule="auto"/>
@@ -13617,6 +13629,7 @@
   <w:style w:type="table" w:styleId="37">
     <w:name w:val="Light Shading Accent 1"/>
     <w:basedOn w:val="34"/>
+    <w:qFormat/>
     <w:uiPriority w:val="60"/>
     <w:pPr>
       <w:spacing w:after="0" w:line="240" w:lineRule="auto"/>
@@ -13815,6 +13828,7 @@
   <w:style w:type="table" w:styleId="39">
     <w:name w:val="Light Shading Accent 3"/>
     <w:basedOn w:val="34"/>
+    <w:qFormat/>
     <w:uiPriority w:val="60"/>
     <w:pPr>
       <w:spacing w:after="0" w:line="240" w:lineRule="auto"/>
@@ -13914,6 +13928,7 @@
   <w:style w:type="table" w:styleId="40">
     <w:name w:val="Light Shading Accent 4"/>
     <w:basedOn w:val="34"/>
+    <w:qFormat/>
     <w:uiPriority w:val="60"/>
     <w:pPr>
       <w:spacing w:after="0" w:line="240" w:lineRule="auto"/>
@@ -14013,6 +14028,7 @@
   <w:style w:type="table" w:styleId="41">
     <w:name w:val="Light Shading Accent 5"/>
     <w:basedOn w:val="34"/>
+    <w:qFormat/>
     <w:uiPriority w:val="60"/>
     <w:pPr>
       <w:spacing w:after="0" w:line="240" w:lineRule="auto"/>
@@ -14112,6 +14128,7 @@
   <w:style w:type="table" w:styleId="42">
     <w:name w:val="Light Shading Accent 6"/>
     <w:basedOn w:val="34"/>
+    <w:qFormat/>
     <w:uiPriority w:val="60"/>
     <w:pPr>
       <w:spacing w:after="0" w:line="240" w:lineRule="auto"/>
@@ -14304,6 +14321,7 @@
   <w:style w:type="table" w:styleId="44">
     <w:name w:val="Light List Accent 1"/>
     <w:basedOn w:val="34"/>
+    <w:qFormat/>
     <w:uiPriority w:val="61"/>
     <w:pPr>
       <w:spacing w:after="0" w:line="240" w:lineRule="auto"/>
@@ -14678,6 +14696,7 @@
   <w:style w:type="table" w:styleId="48">
     <w:name w:val="Light List Accent 5"/>
     <w:basedOn w:val="34"/>
+    <w:qFormat/>
     <w:uiPriority w:val="61"/>
     <w:pPr>
       <w:spacing w:after="0" w:line="240" w:lineRule="auto"/>
@@ -24962,12 +24981,14 @@
     <w:name w:val="Header Char"/>
     <w:basedOn w:val="134"/>
     <w:link w:val="25"/>
+    <w:qFormat/>
     <w:uiPriority w:val="99"/>
   </w:style>
   <w:style w:type="character" w:customStyle="1" w:styleId="138">
     <w:name w:val="Footer Char"/>
     <w:basedOn w:val="134"/>
     <w:link w:val="24"/>
+    <w:qFormat/>
     <w:uiPriority w:val="99"/>
   </w:style>
   <w:style w:type="paragraph" w:styleId="139">

</xml_diff>